<commit_message>
Normalize AUTO claims decision FAQs
</commit_message>
<xml_diff>
--- a/18_DOCX/AUTO_FAQ_0038_0057.docx
+++ b/18_DOCX/AUTO_FAQ_0038_0057.docx
@@ -846,7 +846,7 @@
         <w:pStyle w:val="ListBullet"/>
       </w:pPr>
       <w:r>
-        <w:t>Versão: 0.1</w:t>
+        <w:t>Versão: 0.2</w:t>
       </w:r>
     </w:p>
     <w:p>
@@ -870,7 +870,7 @@
         <w:pStyle w:val="ListBullet"/>
       </w:pPr>
       <w:r>
-        <w:t>Histórico: Criação inicial.</w:t>
+        <w:t>Histórico: Criação inicial; reforço NotebookLM e compliance.</w:t>
       </w:r>
     </w:p>
     <w:p>
@@ -933,12 +933,23 @@
           <w:color w:val="4F81BD"/>
           <w:sz w:val="28"/>
         </w:rPr>
-        <w:t>Situação de atendimento</w:t>
-      </w:r>
-    </w:p>
-    <w:p>
-      <w:r>
-        <w:t>Cliente precisa entender percentual de culpa no contexto de atendimento de seguro de automóvel.</w:t>
+        <w:t>Consulta natural em japonês</w:t>
+      </w:r>
+    </w:p>
+    <w:p>
+      <w:pPr>
+        <w:pStyle w:val="ListBullet"/>
+      </w:pPr>
+      <w:r>
+        <w:t>事故の過失割合はどのように決まりますか。</w:t>
+      </w:r>
+    </w:p>
+    <w:p>
+      <w:pPr>
+        <w:pStyle w:val="ListBullet"/>
+      </w:pPr>
+      <w:r>
+        <w:t>過失割合をブラジル人のお客様に説明するときの注意点は何ですか。</w:t>
       </w:r>
     </w:p>
     <w:p>
@@ -950,12 +961,12 @@
           <w:color w:val="4F81BD"/>
           <w:sz w:val="28"/>
         </w:rPr>
-        <w:t>Resposta técnica</w:t>
-      </w:r>
-    </w:p>
-    <w:p>
-      <w:r>
-        <w:t>Proporção de responsabilidade atribuída às partes envolvidas em um acidente, usada para calcular indenizações e cobranças.</w:t>
+        <w:t>Situação de atendimento</w:t>
+      </w:r>
+    </w:p>
+    <w:p>
+      <w:r>
+        <w:t>Cliente precisa entender percentual de culpa no contexto de atendimento de seguro de automóvel.</w:t>
       </w:r>
     </w:p>
     <w:p>
@@ -967,12 +978,12 @@
           <w:color w:val="4F81BD"/>
           <w:sz w:val="28"/>
         </w:rPr>
-        <w:t>Como responder ao cliente brasileiro</w:t>
-      </w:r>
-    </w:p>
-    <w:p>
-      <w:r>
-        <w:t>Nem sempre uma pessoa é considerada 100% culpada. A seguradora analisa a situação e pode definir uma divisão de responsabilidade.</w:t>
+        <w:t>Resposta técnica</w:t>
+      </w:r>
+    </w:p>
+    <w:p>
+      <w:r>
+        <w:t>Proporção de responsabilidade atribuída às partes envolvidas em um acidente, usada para calcular indenizações e cobranças.</w:t>
       </w:r>
     </w:p>
     <w:p>
@@ -984,15 +995,12 @@
           <w:color w:val="4F81BD"/>
           <w:sz w:val="28"/>
         </w:rPr>
-        <w:t>Termos relacionados</w:t>
-      </w:r>
-    </w:p>
-    <w:p>
-      <w:pPr>
-        <w:pStyle w:val="ListBullet"/>
-      </w:pPr>
-      <w:r>
-        <w:t>AUTO-0043 - 過失割合 - Percentual de culpa</w:t>
+        <w:t>Como responder ao cliente brasileiro</w:t>
+      </w:r>
+    </w:p>
+    <w:p>
+      <w:r>
+        <w:t>Nem sempre uma pessoa é considerada 100% culpada. A seguradora analisa a situação e pode definir uma divisão de responsabilidade.</w:t>
       </w:r>
     </w:p>
     <w:p>
@@ -1004,23 +1012,12 @@
           <w:color w:val="4F81BD"/>
           <w:sz w:val="28"/>
         </w:rPr>
-        <w:t>Referências cruzadas</w:t>
-      </w:r>
-    </w:p>
-    <w:p>
-      <w:pPr>
-        <w:pStyle w:val="ListBullet"/>
-      </w:pPr>
-      <w:r>
-        <w:t>DIALOGUE-AUTO-0015</w:t>
-      </w:r>
-    </w:p>
-    <w:p>
-      <w:pPr>
-        <w:pStyle w:val="ListBullet"/>
-      </w:pPr>
-      <w:r>
-        <w:t>CASE-AUTO-0021</w:t>
+        <w:t>Próximo passo seguro</w:t>
+      </w:r>
+    </w:p>
+    <w:p>
+      <w:r>
+        <w:t>Coletar relato, fotos, registro do acidente e dados da outra parte, sem afirmar percentual de culpa antes da análise da seguradora.</w:t>
       </w:r>
     </w:p>
     <w:p>
@@ -1032,15 +1029,12 @@
           <w:color w:val="4F81BD"/>
           <w:sz w:val="28"/>
         </w:rPr>
-        <w:t>Referências</w:t>
-      </w:r>
-    </w:p>
-    <w:p>
-      <w:pPr>
-        <w:pStyle w:val="ListBullet"/>
-      </w:pPr>
-      <w:r>
-        <w:t>Documento interno: 02_MasterDictionary/AUTO/AUTO-0043.md</w:t>
+        <w:t>Limite comercial/compliance</w:t>
+      </w:r>
+    </w:p>
+    <w:p>
+      <w:r>
+        <w:t>O corretor não deve definir culpa nem percentual de responsabilidade. A avaliação depende dos fatos, documentos, regras aplicáveis e análise da seguradora.</w:t>
       </w:r>
     </w:p>
     <w:p>
@@ -1052,7 +1046,7 @@
           <w:color w:val="4F81BD"/>
           <w:sz w:val="28"/>
         </w:rPr>
-        <w:t>Tags</w:t>
+        <w:t>Termos relacionados</w:t>
       </w:r>
     </w:p>
     <w:p>
@@ -1060,31 +1054,7 @@
         <w:pStyle w:val="ListBullet"/>
       </w:pPr>
       <w:r>
-        <w:t>faq</w:t>
-      </w:r>
-    </w:p>
-    <w:p>
-      <w:pPr>
-        <w:pStyle w:val="ListBullet"/>
-      </w:pPr>
-      <w:r>
-        <w:t>auto</w:t>
-      </w:r>
-    </w:p>
-    <w:p>
-      <w:pPr>
-        <w:pStyle w:val="ListBullet"/>
-      </w:pPr>
-      <w:r>
-        <w:t>sinistro</w:t>
-      </w:r>
-    </w:p>
-    <w:p>
-      <w:pPr>
-        <w:pStyle w:val="ListBullet"/>
-      </w:pPr>
-      <w:r>
-        <w:t>atendimento</w:t>
+        <w:t>AUTO-0043 - 過失割合 - Percentual de culpa</w:t>
       </w:r>
     </w:p>
     <w:p>
@@ -1096,7 +1066,7 @@
           <w:color w:val="4F81BD"/>
           <w:sz w:val="28"/>
         </w:rPr>
-        <w:t>Veja também</w:t>
+        <w:t>Referências cruzadas</w:t>
       </w:r>
     </w:p>
     <w:p>
@@ -1104,7 +1074,15 @@
         <w:pStyle w:val="ListBullet"/>
       </w:pPr>
       <w:r>
-        <w:t>02_MasterDictionary/AUTO/AUTO-0043.md</w:t>
+        <w:t>DIALOGUE-AUTO-0015</w:t>
+      </w:r>
+    </w:p>
+    <w:p>
+      <w:pPr>
+        <w:pStyle w:val="ListBullet"/>
+      </w:pPr>
+      <w:r>
+        <w:t>CASE-AUTO-0021</w:t>
       </w:r>
     </w:p>
     <w:p>
@@ -1116,6 +1094,90 @@
           <w:color w:val="4F81BD"/>
           <w:sz w:val="28"/>
         </w:rPr>
+        <w:t>Referências</w:t>
+      </w:r>
+    </w:p>
+    <w:p>
+      <w:pPr>
+        <w:pStyle w:val="ListBullet"/>
+      </w:pPr>
+      <w:r>
+        <w:t>Documento interno: 02_MasterDictionary/AUTO/AUTO-0043.md</w:t>
+      </w:r>
+    </w:p>
+    <w:p>
+      <w:pPr>
+        <w:pStyle w:val="Heading2"/>
+      </w:pPr>
+      <w:r>
+        <w:rPr>
+          <w:color w:val="4F81BD"/>
+          <w:sz w:val="28"/>
+        </w:rPr>
+        <w:t>Tags</w:t>
+      </w:r>
+    </w:p>
+    <w:p>
+      <w:pPr>
+        <w:pStyle w:val="ListBullet"/>
+      </w:pPr>
+      <w:r>
+        <w:t>faq</w:t>
+      </w:r>
+    </w:p>
+    <w:p>
+      <w:pPr>
+        <w:pStyle w:val="ListBullet"/>
+      </w:pPr>
+      <w:r>
+        <w:t>auto</w:t>
+      </w:r>
+    </w:p>
+    <w:p>
+      <w:pPr>
+        <w:pStyle w:val="ListBullet"/>
+      </w:pPr>
+      <w:r>
+        <w:t>sinistro</w:t>
+      </w:r>
+    </w:p>
+    <w:p>
+      <w:pPr>
+        <w:pStyle w:val="ListBullet"/>
+      </w:pPr>
+      <w:r>
+        <w:t>atendimento</w:t>
+      </w:r>
+    </w:p>
+    <w:p>
+      <w:pPr>
+        <w:pStyle w:val="Heading2"/>
+      </w:pPr>
+      <w:r>
+        <w:rPr>
+          <w:color w:val="4F81BD"/>
+          <w:sz w:val="28"/>
+        </w:rPr>
+        <w:t>Veja também</w:t>
+      </w:r>
+    </w:p>
+    <w:p>
+      <w:pPr>
+        <w:pStyle w:val="ListBullet"/>
+      </w:pPr>
+      <w:r>
+        <w:t>02_MasterDictionary/AUTO/AUTO-0043.md</w:t>
+      </w:r>
+    </w:p>
+    <w:p>
+      <w:pPr>
+        <w:pStyle w:val="Heading2"/>
+      </w:pPr>
+      <w:r>
+        <w:rPr>
+          <w:color w:val="4F81BD"/>
+          <w:sz w:val="28"/>
+        </w:rPr>
         <w:t>Histórico de revisão</w:t>
       </w:r>
     </w:p>
@@ -1143,6 +1205,15 @@
           <w:rFonts w:ascii="Courier New" w:hAnsi="Courier New"/>
           <w:sz w:val="16"/>
         </w:rPr>
+        <w:t>| 2026-06-26 | 0.2 | JP-BR Insurance Knowledge Base | Inclusão de consulta japonesa, próximo passo seguro e limite comercial/compliance. |</w:t>
+      </w:r>
+    </w:p>
+    <w:p>
+      <w:r>
+        <w:rPr>
+          <w:rFonts w:ascii="Courier New" w:hAnsi="Courier New"/>
+          <w:sz w:val="16"/>
+        </w:rPr>
         <w:t>| 2026-06-25 | 0.1 | JP-BR Insurance Knowledge Base | Criação inicial. |</w:t>
       </w:r>
     </w:p>
@@ -1176,7 +1247,7 @@
         <w:pStyle w:val="ListBullet"/>
       </w:pPr>
       <w:r>
-        <w:t>Versão: 0.1</w:t>
+        <w:t>Versão: 0.2</w:t>
       </w:r>
     </w:p>
     <w:p>
@@ -1200,7 +1271,7 @@
         <w:pStyle w:val="ListBullet"/>
       </w:pPr>
       <w:r>
-        <w:t>Histórico: Criação inicial.</w:t>
+        <w:t>Histórico: Criação inicial; reforço NotebookLM e compliance.</w:t>
       </w:r>
     </w:p>
     <w:p>
@@ -1263,12 +1334,23 @@
           <w:color w:val="4F81BD"/>
           <w:sz w:val="28"/>
         </w:rPr>
-        <w:t>Situação de atendimento</w:t>
-      </w:r>
-    </w:p>
-    <w:p>
-      <w:r>
-        <w:t>Cliente precisa entender acordo extrajudicial no contexto de atendimento de seguro de automóvel.</w:t>
+        <w:t>Consulta natural em japonês</w:t>
+      </w:r>
+    </w:p>
+    <w:p>
+      <w:pPr>
+        <w:pStyle w:val="ListBullet"/>
+      </w:pPr>
+      <w:r>
+        <w:t>事故相手と直接示談してもよいですか。</w:t>
+      </w:r>
+    </w:p>
+    <w:p>
+      <w:pPr>
+        <w:pStyle w:val="ListBullet"/>
+      </w:pPr>
+      <w:r>
+        <w:t>示談についてブラジル人のお客様にどう注意喚起しますか。</w:t>
       </w:r>
     </w:p>
     <w:p>
@@ -1280,12 +1362,12 @@
           <w:color w:val="4F81BD"/>
           <w:sz w:val="28"/>
         </w:rPr>
-        <w:t>Resposta técnica</w:t>
-      </w:r>
-    </w:p>
-    <w:p>
-      <w:r>
-        <w:t>Acordo entre as partes envolvidas para resolver responsabilidade, indenização ou reparação sem decisão judicial.</w:t>
+        <w:t>Situação de atendimento</w:t>
+      </w:r>
+    </w:p>
+    <w:p>
+      <w:r>
+        <w:t>Cliente precisa entender acordo extrajudicial no contexto de atendimento de seguro de automóvel.</w:t>
       </w:r>
     </w:p>
     <w:p>
@@ -1297,12 +1379,12 @@
           <w:color w:val="4F81BD"/>
           <w:sz w:val="28"/>
         </w:rPr>
-        <w:t>Como responder ao cliente brasileiro</w:t>
-      </w:r>
-    </w:p>
-    <w:p>
-      <w:r>
-        <w:t>Não feche acordo direto sem consultar a seguradora, pois isso pode afetar o atendimento do seguro.</w:t>
+        <w:t>Resposta técnica</w:t>
+      </w:r>
+    </w:p>
+    <w:p>
+      <w:r>
+        <w:t>Acordo entre as partes envolvidas para resolver responsabilidade, indenização ou reparação sem decisão judicial.</w:t>
       </w:r>
     </w:p>
     <w:p>
@@ -1314,15 +1396,12 @@
           <w:color w:val="4F81BD"/>
           <w:sz w:val="28"/>
         </w:rPr>
-        <w:t>Termos relacionados</w:t>
-      </w:r>
-    </w:p>
-    <w:p>
-      <w:pPr>
-        <w:pStyle w:val="ListBullet"/>
-      </w:pPr>
-      <w:r>
-        <w:t>AUTO-0044 - 示談 - Acordo extrajudicial</w:t>
+        <w:t>Como responder ao cliente brasileiro</w:t>
+      </w:r>
+    </w:p>
+    <w:p>
+      <w:r>
+        <w:t>Não feche acordo direto sem consultar a seguradora, pois isso pode afetar o atendimento do seguro.</w:t>
       </w:r>
     </w:p>
     <w:p>
@@ -1334,23 +1413,12 @@
           <w:color w:val="4F81BD"/>
           <w:sz w:val="28"/>
         </w:rPr>
-        <w:t>Referências cruzadas</w:t>
-      </w:r>
-    </w:p>
-    <w:p>
-      <w:pPr>
-        <w:pStyle w:val="ListBullet"/>
-      </w:pPr>
-      <w:r>
-        <w:t>DIALOGUE-AUTO-0015</w:t>
-      </w:r>
-    </w:p>
-    <w:p>
-      <w:pPr>
-        <w:pStyle w:val="ListBullet"/>
-      </w:pPr>
-      <w:r>
-        <w:t>CASE-AUTO-0022</w:t>
+        <w:t>Próximo passo seguro</w:t>
+      </w:r>
+    </w:p>
+    <w:p>
+      <w:r>
+        <w:t>Orientar o cliente a avisar a seguradora antes de qualquer acordo, pagamento, assinatura ou promessa feita diretamente à outra parte.</w:t>
       </w:r>
     </w:p>
     <w:p>
@@ -1362,15 +1430,12 @@
           <w:color w:val="4F81BD"/>
           <w:sz w:val="28"/>
         </w:rPr>
-        <w:t>Referências</w:t>
-      </w:r>
-    </w:p>
-    <w:p>
-      <w:pPr>
-        <w:pStyle w:val="ListBullet"/>
-      </w:pPr>
-      <w:r>
-        <w:t>Documento interno: 02_MasterDictionary/AUTO/AUTO-0044.md</w:t>
+        <w:t>Limite comercial/compliance</w:t>
+      </w:r>
+    </w:p>
+    <w:p>
+      <w:r>
+        <w:t>O corretor não deve incentivar acordo direto sem confirmação da seguradora. Acordos feitos sem orientação podem afetar cobertura, defesa e pagamento.</w:t>
       </w:r>
     </w:p>
     <w:p>
@@ -1382,7 +1447,7 @@
           <w:color w:val="4F81BD"/>
           <w:sz w:val="28"/>
         </w:rPr>
-        <w:t>Tags</w:t>
+        <w:t>Termos relacionados</w:t>
       </w:r>
     </w:p>
     <w:p>
@@ -1390,31 +1455,7 @@
         <w:pStyle w:val="ListBullet"/>
       </w:pPr>
       <w:r>
-        <w:t>faq</w:t>
-      </w:r>
-    </w:p>
-    <w:p>
-      <w:pPr>
-        <w:pStyle w:val="ListBullet"/>
-      </w:pPr>
-      <w:r>
-        <w:t>auto</w:t>
-      </w:r>
-    </w:p>
-    <w:p>
-      <w:pPr>
-        <w:pStyle w:val="ListBullet"/>
-      </w:pPr>
-      <w:r>
-        <w:t>sinistro</w:t>
-      </w:r>
-    </w:p>
-    <w:p>
-      <w:pPr>
-        <w:pStyle w:val="ListBullet"/>
-      </w:pPr>
-      <w:r>
-        <w:t>atendimento</w:t>
+        <w:t>AUTO-0044 - 示談 - Acordo extrajudicial</w:t>
       </w:r>
     </w:p>
     <w:p>
@@ -1426,7 +1467,7 @@
           <w:color w:val="4F81BD"/>
           <w:sz w:val="28"/>
         </w:rPr>
-        <w:t>Veja também</w:t>
+        <w:t>Referências cruzadas</w:t>
       </w:r>
     </w:p>
     <w:p>
@@ -1434,7 +1475,15 @@
         <w:pStyle w:val="ListBullet"/>
       </w:pPr>
       <w:r>
-        <w:t>02_MasterDictionary/AUTO/AUTO-0044.md</w:t>
+        <w:t>DIALOGUE-AUTO-0015</w:t>
+      </w:r>
+    </w:p>
+    <w:p>
+      <w:pPr>
+        <w:pStyle w:val="ListBullet"/>
+      </w:pPr>
+      <w:r>
+        <w:t>CASE-AUTO-0022</w:t>
       </w:r>
     </w:p>
     <w:p>
@@ -1446,6 +1495,90 @@
           <w:color w:val="4F81BD"/>
           <w:sz w:val="28"/>
         </w:rPr>
+        <w:t>Referências</w:t>
+      </w:r>
+    </w:p>
+    <w:p>
+      <w:pPr>
+        <w:pStyle w:val="ListBullet"/>
+      </w:pPr>
+      <w:r>
+        <w:t>Documento interno: 02_MasterDictionary/AUTO/AUTO-0044.md</w:t>
+      </w:r>
+    </w:p>
+    <w:p>
+      <w:pPr>
+        <w:pStyle w:val="Heading2"/>
+      </w:pPr>
+      <w:r>
+        <w:rPr>
+          <w:color w:val="4F81BD"/>
+          <w:sz w:val="28"/>
+        </w:rPr>
+        <w:t>Tags</w:t>
+      </w:r>
+    </w:p>
+    <w:p>
+      <w:pPr>
+        <w:pStyle w:val="ListBullet"/>
+      </w:pPr>
+      <w:r>
+        <w:t>faq</w:t>
+      </w:r>
+    </w:p>
+    <w:p>
+      <w:pPr>
+        <w:pStyle w:val="ListBullet"/>
+      </w:pPr>
+      <w:r>
+        <w:t>auto</w:t>
+      </w:r>
+    </w:p>
+    <w:p>
+      <w:pPr>
+        <w:pStyle w:val="ListBullet"/>
+      </w:pPr>
+      <w:r>
+        <w:t>sinistro</w:t>
+      </w:r>
+    </w:p>
+    <w:p>
+      <w:pPr>
+        <w:pStyle w:val="ListBullet"/>
+      </w:pPr>
+      <w:r>
+        <w:t>atendimento</w:t>
+      </w:r>
+    </w:p>
+    <w:p>
+      <w:pPr>
+        <w:pStyle w:val="Heading2"/>
+      </w:pPr>
+      <w:r>
+        <w:rPr>
+          <w:color w:val="4F81BD"/>
+          <w:sz w:val="28"/>
+        </w:rPr>
+        <w:t>Veja também</w:t>
+      </w:r>
+    </w:p>
+    <w:p>
+      <w:pPr>
+        <w:pStyle w:val="ListBullet"/>
+      </w:pPr>
+      <w:r>
+        <w:t>02_MasterDictionary/AUTO/AUTO-0044.md</w:t>
+      </w:r>
+    </w:p>
+    <w:p>
+      <w:pPr>
+        <w:pStyle w:val="Heading2"/>
+      </w:pPr>
+      <w:r>
+        <w:rPr>
+          <w:color w:val="4F81BD"/>
+          <w:sz w:val="28"/>
+        </w:rPr>
         <w:t>Histórico de revisão</w:t>
       </w:r>
     </w:p>
@@ -1473,6 +1606,15 @@
           <w:rFonts w:ascii="Courier New" w:hAnsi="Courier New"/>
           <w:sz w:val="16"/>
         </w:rPr>
+        <w:t>| 2026-06-26 | 0.2 | JP-BR Insurance Knowledge Base | Inclusão de consulta japonesa, próximo passo seguro e limite comercial/compliance. |</w:t>
+      </w:r>
+    </w:p>
+    <w:p>
+      <w:r>
+        <w:rPr>
+          <w:rFonts w:ascii="Courier New" w:hAnsi="Courier New"/>
+          <w:sz w:val="16"/>
+        </w:rPr>
         <w:t>| 2026-06-25 | 0.1 | JP-BR Insurance Knowledge Base | Criação inicial. |</w:t>
       </w:r>
     </w:p>
@@ -1506,7 +1648,7 @@
         <w:pStyle w:val="ListBullet"/>
       </w:pPr>
       <w:r>
-        <w:t>Versão: 0.1</w:t>
+        <w:t>Versão: 0.2</w:t>
       </w:r>
     </w:p>
     <w:p>
@@ -1530,7 +1672,7 @@
         <w:pStyle w:val="ListBullet"/>
       </w:pPr>
       <w:r>
-        <w:t>Histórico: Criação inicial.</w:t>
+        <w:t>Histórico: Criação inicial; reforço NotebookLM e compliance.</w:t>
       </w:r>
     </w:p>
     <w:p>
@@ -1593,12 +1735,23 @@
           <w:color w:val="4F81BD"/>
           <w:sz w:val="28"/>
         </w:rPr>
-        <w:t>Situação de atendimento</w:t>
-      </w:r>
-    </w:p>
-    <w:p>
-      <w:r>
-        <w:t>Cliente precisa entender indenização por danos no contexto de atendimento de seguro de automóvel.</w:t>
+        <w:t>Consulta natural em japonês</w:t>
+      </w:r>
+    </w:p>
+    <w:p>
+      <w:pPr>
+        <w:pStyle w:val="ListBullet"/>
+      </w:pPr>
+      <w:r>
+        <w:t>相手方への損害賠償は誰が支払いますか。</w:t>
+      </w:r>
+    </w:p>
+    <w:p>
+      <w:pPr>
+        <w:pStyle w:val="ListBullet"/>
+      </w:pPr>
+      <w:r>
+        <w:t>第三者への損害賠償をブラジル人のお客様にどう説明しますか。</w:t>
       </w:r>
     </w:p>
     <w:p>
@@ -1610,12 +1763,12 @@
           <w:color w:val="4F81BD"/>
           <w:sz w:val="28"/>
         </w:rPr>
-        <w:t>Resposta técnica</w:t>
-      </w:r>
-    </w:p>
-    <w:p>
-      <w:r>
-        <w:t>Compensação financeira devida por danos causados a outra pessoa, veículo, bem ou propriedade, conforme responsabilidade apurada.</w:t>
+        <w:t>Situação de atendimento</w:t>
+      </w:r>
+    </w:p>
+    <w:p>
+      <w:r>
+        <w:t>Cliente precisa entender indenização por danos no contexto de atendimento de seguro de automóvel.</w:t>
       </w:r>
     </w:p>
     <w:p>
@@ -1627,12 +1780,12 @@
           <w:color w:val="4F81BD"/>
           <w:sz w:val="28"/>
         </w:rPr>
-        <w:t>Como responder ao cliente brasileiro</w:t>
-      </w:r>
-    </w:p>
-    <w:p>
-      <w:r>
-        <w:t>Quando há dano a outra pessoa ou bem, a seguradora avalia a responsabilidade e os valores de indenização conforme a cobertura.</w:t>
+        <w:t>Resposta técnica</w:t>
+      </w:r>
+    </w:p>
+    <w:p>
+      <w:r>
+        <w:t>Compensação financeira devida por danos causados a outra pessoa, veículo, bem ou propriedade, conforme responsabilidade apurada.</w:t>
       </w:r>
     </w:p>
     <w:p>
@@ -1644,15 +1797,12 @@
           <w:color w:val="4F81BD"/>
           <w:sz w:val="28"/>
         </w:rPr>
-        <w:t>Termos relacionados</w:t>
-      </w:r>
-    </w:p>
-    <w:p>
-      <w:pPr>
-        <w:pStyle w:val="ListBullet"/>
-      </w:pPr>
-      <w:r>
-        <w:t>AUTO-0045 - 損害賠償 - Indenização por danos</w:t>
+        <w:t>Como responder ao cliente brasileiro</w:t>
+      </w:r>
+    </w:p>
+    <w:p>
+      <w:r>
+        <w:t>Quando há dano a outra pessoa ou bem, a seguradora avalia a responsabilidade e os valores de indenização conforme a cobertura.</w:t>
       </w:r>
     </w:p>
     <w:p>
@@ -1664,23 +1814,12 @@
           <w:color w:val="4F81BD"/>
           <w:sz w:val="28"/>
         </w:rPr>
-        <w:t>Referências cruzadas</w:t>
-      </w:r>
-    </w:p>
-    <w:p>
-      <w:pPr>
-        <w:pStyle w:val="ListBullet"/>
-      </w:pPr>
-      <w:r>
-        <w:t>DIALOGUE-AUTO-0016</w:t>
-      </w:r>
-    </w:p>
-    <w:p>
-      <w:pPr>
-        <w:pStyle w:val="ListBullet"/>
-      </w:pPr>
-      <w:r>
-        <w:t>CASE-AUTO-0022</w:t>
+        <w:t>Próximo passo seguro</w:t>
+      </w:r>
+    </w:p>
+    <w:p>
+      <w:r>
+        <w:t>Confirmar a cobertura aplicável, dados da outra parte, tipo de dano e documentos antes de falar sobre pagamento ou reembolso.</w:t>
       </w:r>
     </w:p>
     <w:p>
@@ -1692,15 +1831,12 @@
           <w:color w:val="4F81BD"/>
           <w:sz w:val="28"/>
         </w:rPr>
-        <w:t>Referências</w:t>
-      </w:r>
-    </w:p>
-    <w:p>
-      <w:pPr>
-        <w:pStyle w:val="ListBullet"/>
-      </w:pPr>
-      <w:r>
-        <w:t>Documento interno: 02_MasterDictionary/AUTO/AUTO-0045.md</w:t>
+        <w:t>Limite comercial/compliance</w:t>
+      </w:r>
+    </w:p>
+    <w:p>
+      <w:r>
+        <w:t>O corretor não deve prometer indenização, valor ou prazo. A seguradora analisará responsabilidade, cobertura, documentos e limites do contrato.</w:t>
       </w:r>
     </w:p>
     <w:p>
@@ -1712,7 +1848,7 @@
           <w:color w:val="4F81BD"/>
           <w:sz w:val="28"/>
         </w:rPr>
-        <w:t>Tags</w:t>
+        <w:t>Termos relacionados</w:t>
       </w:r>
     </w:p>
     <w:p>
@@ -1720,31 +1856,7 @@
         <w:pStyle w:val="ListBullet"/>
       </w:pPr>
       <w:r>
-        <w:t>faq</w:t>
-      </w:r>
-    </w:p>
-    <w:p>
-      <w:pPr>
-        <w:pStyle w:val="ListBullet"/>
-      </w:pPr>
-      <w:r>
-        <w:t>auto</w:t>
-      </w:r>
-    </w:p>
-    <w:p>
-      <w:pPr>
-        <w:pStyle w:val="ListBullet"/>
-      </w:pPr>
-      <w:r>
-        <w:t>sinistro</w:t>
-      </w:r>
-    </w:p>
-    <w:p>
-      <w:pPr>
-        <w:pStyle w:val="ListBullet"/>
-      </w:pPr>
-      <w:r>
-        <w:t>atendimento</w:t>
+        <w:t>AUTO-0045 - 損害賠償 - Indenização por danos</w:t>
       </w:r>
     </w:p>
     <w:p>
@@ -1756,7 +1868,7 @@
           <w:color w:val="4F81BD"/>
           <w:sz w:val="28"/>
         </w:rPr>
-        <w:t>Veja também</w:t>
+        <w:t>Referências cruzadas</w:t>
       </w:r>
     </w:p>
     <w:p>
@@ -1764,7 +1876,15 @@
         <w:pStyle w:val="ListBullet"/>
       </w:pPr>
       <w:r>
-        <w:t>02_MasterDictionary/AUTO/AUTO-0045.md</w:t>
+        <w:t>DIALOGUE-AUTO-0016</w:t>
+      </w:r>
+    </w:p>
+    <w:p>
+      <w:pPr>
+        <w:pStyle w:val="ListBullet"/>
+      </w:pPr>
+      <w:r>
+        <w:t>CASE-AUTO-0022</w:t>
       </w:r>
     </w:p>
     <w:p>
@@ -1776,6 +1896,90 @@
           <w:color w:val="4F81BD"/>
           <w:sz w:val="28"/>
         </w:rPr>
+        <w:t>Referências</w:t>
+      </w:r>
+    </w:p>
+    <w:p>
+      <w:pPr>
+        <w:pStyle w:val="ListBullet"/>
+      </w:pPr>
+      <w:r>
+        <w:t>Documento interno: 02_MasterDictionary/AUTO/AUTO-0045.md</w:t>
+      </w:r>
+    </w:p>
+    <w:p>
+      <w:pPr>
+        <w:pStyle w:val="Heading2"/>
+      </w:pPr>
+      <w:r>
+        <w:rPr>
+          <w:color w:val="4F81BD"/>
+          <w:sz w:val="28"/>
+        </w:rPr>
+        <w:t>Tags</w:t>
+      </w:r>
+    </w:p>
+    <w:p>
+      <w:pPr>
+        <w:pStyle w:val="ListBullet"/>
+      </w:pPr>
+      <w:r>
+        <w:t>faq</w:t>
+      </w:r>
+    </w:p>
+    <w:p>
+      <w:pPr>
+        <w:pStyle w:val="ListBullet"/>
+      </w:pPr>
+      <w:r>
+        <w:t>auto</w:t>
+      </w:r>
+    </w:p>
+    <w:p>
+      <w:pPr>
+        <w:pStyle w:val="ListBullet"/>
+      </w:pPr>
+      <w:r>
+        <w:t>sinistro</w:t>
+      </w:r>
+    </w:p>
+    <w:p>
+      <w:pPr>
+        <w:pStyle w:val="ListBullet"/>
+      </w:pPr>
+      <w:r>
+        <w:t>atendimento</w:t>
+      </w:r>
+    </w:p>
+    <w:p>
+      <w:pPr>
+        <w:pStyle w:val="Heading2"/>
+      </w:pPr>
+      <w:r>
+        <w:rPr>
+          <w:color w:val="4F81BD"/>
+          <w:sz w:val="28"/>
+        </w:rPr>
+        <w:t>Veja também</w:t>
+      </w:r>
+    </w:p>
+    <w:p>
+      <w:pPr>
+        <w:pStyle w:val="ListBullet"/>
+      </w:pPr>
+      <w:r>
+        <w:t>02_MasterDictionary/AUTO/AUTO-0045.md</w:t>
+      </w:r>
+    </w:p>
+    <w:p>
+      <w:pPr>
+        <w:pStyle w:val="Heading2"/>
+      </w:pPr>
+      <w:r>
+        <w:rPr>
+          <w:color w:val="4F81BD"/>
+          <w:sz w:val="28"/>
+        </w:rPr>
         <w:t>Histórico de revisão</w:t>
       </w:r>
     </w:p>
@@ -1803,6 +2007,15 @@
           <w:rFonts w:ascii="Courier New" w:hAnsi="Courier New"/>
           <w:sz w:val="16"/>
         </w:rPr>
+        <w:t>| 2026-06-26 | 0.2 | JP-BR Insurance Knowledge Base | Inclusão de consulta japonesa, próximo passo seguro e limite comercial/compliance. |</w:t>
+      </w:r>
+    </w:p>
+    <w:p>
+      <w:r>
+        <w:rPr>
+          <w:rFonts w:ascii="Courier New" w:hAnsi="Courier New"/>
+          <w:sz w:val="16"/>
+        </w:rPr>
         <w:t>| 2026-06-25 | 0.1 | JP-BR Insurance Knowledge Base | Criação inicial. |</w:t>
       </w:r>
     </w:p>
@@ -1836,7 +2049,7 @@
         <w:pStyle w:val="ListBullet"/>
       </w:pPr>
       <w:r>
-        <w:t>Versão: 0.1</w:t>
+        <w:t>Versão: 0.2</w:t>
       </w:r>
     </w:p>
     <w:p>
@@ -1860,7 +2073,7 @@
         <w:pStyle w:val="ListBullet"/>
       </w:pPr>
       <w:r>
-        <w:t>Histórico: Criação inicial.</w:t>
+        <w:t>Histórico: Criação inicial; reforço NotebookLM e compliance.</w:t>
       </w:r>
     </w:p>
     <w:p>
@@ -1923,12 +2136,23 @@
           <w:color w:val="4F81BD"/>
           <w:sz w:val="28"/>
         </w:rPr>
-        <w:t>Situação de atendimento</w:t>
-      </w:r>
-    </w:p>
-    <w:p>
-      <w:r>
-        <w:t>Cliente precisa entender orçamento de reparo no contexto de atendimento de seguro de automóvel.</w:t>
+        <w:t>Consulta natural em japonês</w:t>
+      </w:r>
+    </w:p>
+    <w:p>
+      <w:pPr>
+        <w:pStyle w:val="ListBullet"/>
+      </w:pPr>
+      <w:r>
+        <w:t>修理見積書はなぜ保険会社に必要ですか。</w:t>
+      </w:r>
+    </w:p>
+    <w:p>
+      <w:pPr>
+        <w:pStyle w:val="ListBullet"/>
+      </w:pPr>
+      <w:r>
+        <w:t>修理見積書をブラジル人のお客様にどう説明しますか。</w:t>
       </w:r>
     </w:p>
     <w:p>
@@ -1940,12 +2164,12 @@
           <w:color w:val="4F81BD"/>
           <w:sz w:val="28"/>
         </w:rPr>
-        <w:t>Resposta técnica</w:t>
-      </w:r>
-    </w:p>
-    <w:p>
-      <w:r>
-        <w:t>Documento emitido por oficina ou prestador com estimativa de custo para conserto do veículo ou bem danificado.</w:t>
+        <w:t>Situação de atendimento</w:t>
+      </w:r>
+    </w:p>
+    <w:p>
+      <w:r>
+        <w:t>Cliente precisa entender orçamento de reparo no contexto de atendimento de seguro de automóvel.</w:t>
       </w:r>
     </w:p>
     <w:p>
@@ -1957,12 +2181,12 @@
           <w:color w:val="4F81BD"/>
           <w:sz w:val="28"/>
         </w:rPr>
-        <w:t>Como responder ao cliente brasileiro</w:t>
-      </w:r>
-    </w:p>
-    <w:p>
-      <w:r>
-        <w:t>A seguradora pode pedir o orçamento para analisar o valor do reparo antes de autorizar ou pagar.</w:t>
+        <w:t>Resposta técnica</w:t>
+      </w:r>
+    </w:p>
+    <w:p>
+      <w:r>
+        <w:t>Documento emitido por oficina ou prestador com estimativa de custo para conserto do veículo ou bem danificado.</w:t>
       </w:r>
     </w:p>
     <w:p>
@@ -1974,15 +2198,12 @@
           <w:color w:val="4F81BD"/>
           <w:sz w:val="28"/>
         </w:rPr>
-        <w:t>Termos relacionados</w:t>
-      </w:r>
-    </w:p>
-    <w:p>
-      <w:pPr>
-        <w:pStyle w:val="ListBullet"/>
-      </w:pPr>
-      <w:r>
-        <w:t>AUTO-0046 - 修理見積書 - Orçamento de reparo</w:t>
+        <w:t>Como responder ao cliente brasileiro</w:t>
+      </w:r>
+    </w:p>
+    <w:p>
+      <w:r>
+        <w:t>A seguradora pode pedir o orçamento para analisar o valor do reparo antes de autorizar ou pagar.</w:t>
       </w:r>
     </w:p>
     <w:p>
@@ -1994,23 +2215,12 @@
           <w:color w:val="4F81BD"/>
           <w:sz w:val="28"/>
         </w:rPr>
-        <w:t>Referências cruzadas</w:t>
-      </w:r>
-    </w:p>
-    <w:p>
-      <w:pPr>
-        <w:pStyle w:val="ListBullet"/>
-      </w:pPr>
-      <w:r>
-        <w:t>DIALOGUE-AUTO-0016</w:t>
-      </w:r>
-    </w:p>
-    <w:p>
-      <w:pPr>
-        <w:pStyle w:val="ListBullet"/>
-      </w:pPr>
-      <w:r>
-        <w:t>CASE-AUTO-0022</w:t>
+        <w:t>Próximo passo seguro</w:t>
+      </w:r>
+    </w:p>
+    <w:p>
+      <w:r>
+        <w:t>Solicitar orçamento conforme orientação da seguradora, conferir se a oficina e o formato do documento são aceitos e anexar fotos quando necessário.</w:t>
       </w:r>
     </w:p>
     <w:p>
@@ -2022,15 +2232,12 @@
           <w:color w:val="4F81BD"/>
           <w:sz w:val="28"/>
         </w:rPr>
-        <w:t>Referências</w:t>
-      </w:r>
-    </w:p>
-    <w:p>
-      <w:pPr>
-        <w:pStyle w:val="ListBullet"/>
-      </w:pPr>
-      <w:r>
-        <w:t>Documento interno: 02_MasterDictionary/AUTO/AUTO-0046.md</w:t>
+        <w:t>Limite comercial/compliance</w:t>
+      </w:r>
+    </w:p>
+    <w:p>
+      <w:r>
+        <w:t>O orçamento não garante autorização de reparo nem pagamento. Ele é um documento de análise e pode ser revisado pela seguradora.</w:t>
       </w:r>
     </w:p>
     <w:p>
@@ -2042,7 +2249,7 @@
           <w:color w:val="4F81BD"/>
           <w:sz w:val="28"/>
         </w:rPr>
-        <w:t>Tags</w:t>
+        <w:t>Termos relacionados</w:t>
       </w:r>
     </w:p>
     <w:p>
@@ -2050,31 +2257,7 @@
         <w:pStyle w:val="ListBullet"/>
       </w:pPr>
       <w:r>
-        <w:t>faq</w:t>
-      </w:r>
-    </w:p>
-    <w:p>
-      <w:pPr>
-        <w:pStyle w:val="ListBullet"/>
-      </w:pPr>
-      <w:r>
-        <w:t>auto</w:t>
-      </w:r>
-    </w:p>
-    <w:p>
-      <w:pPr>
-        <w:pStyle w:val="ListBullet"/>
-      </w:pPr>
-      <w:r>
-        <w:t>sinistro</w:t>
-      </w:r>
-    </w:p>
-    <w:p>
-      <w:pPr>
-        <w:pStyle w:val="ListBullet"/>
-      </w:pPr>
-      <w:r>
-        <w:t>atendimento</w:t>
+        <w:t>AUTO-0046 - 修理見積書 - Orçamento de reparo</w:t>
       </w:r>
     </w:p>
     <w:p>
@@ -2086,7 +2269,7 @@
           <w:color w:val="4F81BD"/>
           <w:sz w:val="28"/>
         </w:rPr>
-        <w:t>Veja também</w:t>
+        <w:t>Referências cruzadas</w:t>
       </w:r>
     </w:p>
     <w:p>
@@ -2094,7 +2277,15 @@
         <w:pStyle w:val="ListBullet"/>
       </w:pPr>
       <w:r>
-        <w:t>02_MasterDictionary/AUTO/AUTO-0046.md</w:t>
+        <w:t>DIALOGUE-AUTO-0016</w:t>
+      </w:r>
+    </w:p>
+    <w:p>
+      <w:pPr>
+        <w:pStyle w:val="ListBullet"/>
+      </w:pPr>
+      <w:r>
+        <w:t>CASE-AUTO-0022</w:t>
       </w:r>
     </w:p>
     <w:p>
@@ -2106,6 +2297,90 @@
           <w:color w:val="4F81BD"/>
           <w:sz w:val="28"/>
         </w:rPr>
+        <w:t>Referências</w:t>
+      </w:r>
+    </w:p>
+    <w:p>
+      <w:pPr>
+        <w:pStyle w:val="ListBullet"/>
+      </w:pPr>
+      <w:r>
+        <w:t>Documento interno: 02_MasterDictionary/AUTO/AUTO-0046.md</w:t>
+      </w:r>
+    </w:p>
+    <w:p>
+      <w:pPr>
+        <w:pStyle w:val="Heading2"/>
+      </w:pPr>
+      <w:r>
+        <w:rPr>
+          <w:color w:val="4F81BD"/>
+          <w:sz w:val="28"/>
+        </w:rPr>
+        <w:t>Tags</w:t>
+      </w:r>
+    </w:p>
+    <w:p>
+      <w:pPr>
+        <w:pStyle w:val="ListBullet"/>
+      </w:pPr>
+      <w:r>
+        <w:t>faq</w:t>
+      </w:r>
+    </w:p>
+    <w:p>
+      <w:pPr>
+        <w:pStyle w:val="ListBullet"/>
+      </w:pPr>
+      <w:r>
+        <w:t>auto</w:t>
+      </w:r>
+    </w:p>
+    <w:p>
+      <w:pPr>
+        <w:pStyle w:val="ListBullet"/>
+      </w:pPr>
+      <w:r>
+        <w:t>sinistro</w:t>
+      </w:r>
+    </w:p>
+    <w:p>
+      <w:pPr>
+        <w:pStyle w:val="ListBullet"/>
+      </w:pPr>
+      <w:r>
+        <w:t>atendimento</w:t>
+      </w:r>
+    </w:p>
+    <w:p>
+      <w:pPr>
+        <w:pStyle w:val="Heading2"/>
+      </w:pPr>
+      <w:r>
+        <w:rPr>
+          <w:color w:val="4F81BD"/>
+          <w:sz w:val="28"/>
+        </w:rPr>
+        <w:t>Veja também</w:t>
+      </w:r>
+    </w:p>
+    <w:p>
+      <w:pPr>
+        <w:pStyle w:val="ListBullet"/>
+      </w:pPr>
+      <w:r>
+        <w:t>02_MasterDictionary/AUTO/AUTO-0046.md</w:t>
+      </w:r>
+    </w:p>
+    <w:p>
+      <w:pPr>
+        <w:pStyle w:val="Heading2"/>
+      </w:pPr>
+      <w:r>
+        <w:rPr>
+          <w:color w:val="4F81BD"/>
+          <w:sz w:val="28"/>
+        </w:rPr>
         <w:t>Histórico de revisão</w:t>
       </w:r>
     </w:p>
@@ -2133,6 +2408,15 @@
           <w:rFonts w:ascii="Courier New" w:hAnsi="Courier New"/>
           <w:sz w:val="16"/>
         </w:rPr>
+        <w:t>| 2026-06-26 | 0.2 | JP-BR Insurance Knowledge Base | Inclusão de consulta japonesa, próximo passo seguro e limite comercial/compliance. |</w:t>
+      </w:r>
+    </w:p>
+    <w:p>
+      <w:r>
+        <w:rPr>
+          <w:rFonts w:ascii="Courier New" w:hAnsi="Courier New"/>
+          <w:sz w:val="16"/>
+        </w:rPr>
         <w:t>| 2026-06-25 | 0.1 | JP-BR Insurance Knowledge Base | Criação inicial. |</w:t>
       </w:r>
     </w:p>
@@ -2166,7 +2450,7 @@
         <w:pStyle w:val="ListBullet"/>
       </w:pPr>
       <w:r>
-        <w:t>Versão: 0.1</w:t>
+        <w:t>Versão: 0.2</w:t>
       </w:r>
     </w:p>
     <w:p>
@@ -2190,7 +2474,7 @@
         <w:pStyle w:val="ListBullet"/>
       </w:pPr>
       <w:r>
-        <w:t>Histórico: Criação inicial.</w:t>
+        <w:t>Histórico: Criação inicial; reforço NotebookLM e compliance.</w:t>
       </w:r>
     </w:p>
     <w:p>
@@ -2253,12 +2537,23 @@
           <w:color w:val="4F81BD"/>
           <w:sz w:val="28"/>
         </w:rPr>
-        <w:t>Situação de atendimento</w:t>
-      </w:r>
-    </w:p>
-    <w:p>
-      <w:r>
-        <w:t>Cliente precisa entender avaliação de danos no contexto de atendimento de seguro de automóvel.</w:t>
+        <w:t>Consulta natural em japonês</w:t>
+      </w:r>
+    </w:p>
+    <w:p>
+      <w:pPr>
+        <w:pStyle w:val="ListBullet"/>
+      </w:pPr>
+      <w:r>
+        <w:t>損害調査はなぜ必要ですか。</w:t>
+      </w:r>
+    </w:p>
+    <w:p>
+      <w:pPr>
+        <w:pStyle w:val="ListBullet"/>
+      </w:pPr>
+      <w:r>
+        <w:t>保険会社の損害調査をブラジル人のお客様にどう説明しますか。</w:t>
       </w:r>
     </w:p>
     <w:p>
@@ -2270,12 +2565,12 @@
           <w:color w:val="4F81BD"/>
           <w:sz w:val="28"/>
         </w:rPr>
-        <w:t>Resposta técnica</w:t>
-      </w:r>
-    </w:p>
-    <w:p>
-      <w:r>
-        <w:t>Processo de verificação dos danos, causas, valores e condições de cobertura realizado pela seguradora ou avaliador.</w:t>
+        <w:t>Situação de atendimento</w:t>
+      </w:r>
+    </w:p>
+    <w:p>
+      <w:r>
+        <w:t>Cliente precisa entender avaliação de danos no contexto de atendimento de seguro de automóvel.</w:t>
       </w:r>
     </w:p>
     <w:p>
@@ -2287,12 +2582,12 @@
           <w:color w:val="4F81BD"/>
           <w:sz w:val="28"/>
         </w:rPr>
-        <w:t>Como responder ao cliente brasileiro</w:t>
-      </w:r>
-    </w:p>
-    <w:p>
-      <w:r>
-        <w:t>Antes de pagar ou autorizar o conserto, a seguradora pode verificar os danos e documentos.</w:t>
+        <w:t>Resposta técnica</w:t>
+      </w:r>
+    </w:p>
+    <w:p>
+      <w:r>
+        <w:t>Processo de verificação dos danos, causas, valores e condições de cobertura realizado pela seguradora ou avaliador.</w:t>
       </w:r>
     </w:p>
     <w:p>
@@ -2304,15 +2599,12 @@
           <w:color w:val="4F81BD"/>
           <w:sz w:val="28"/>
         </w:rPr>
-        <w:t>Termos relacionados</w:t>
-      </w:r>
-    </w:p>
-    <w:p>
-      <w:pPr>
-        <w:pStyle w:val="ListBullet"/>
-      </w:pPr>
-      <w:r>
-        <w:t>AUTO-0047 - 損害調査 - Avaliação de danos</w:t>
+        <w:t>Como responder ao cliente brasileiro</w:t>
+      </w:r>
+    </w:p>
+    <w:p>
+      <w:r>
+        <w:t>Antes de pagar ou autorizar o conserto, a seguradora pode verificar os danos e documentos.</w:t>
       </w:r>
     </w:p>
     <w:p>
@@ -2324,23 +2616,12 @@
           <w:color w:val="4F81BD"/>
           <w:sz w:val="28"/>
         </w:rPr>
-        <w:t>Referências cruzadas</w:t>
-      </w:r>
-    </w:p>
-    <w:p>
-      <w:pPr>
-        <w:pStyle w:val="ListBullet"/>
-      </w:pPr>
-      <w:r>
-        <w:t>DIALOGUE-AUTO-0016</w:t>
-      </w:r>
-    </w:p>
-    <w:p>
-      <w:pPr>
-        <w:pStyle w:val="ListBullet"/>
-      </w:pPr>
-      <w:r>
-        <w:t>CASE-AUTO-0023</w:t>
+        <w:t>Próximo passo seguro</w:t>
+      </w:r>
+    </w:p>
+    <w:p>
+      <w:r>
+        <w:t>Explicar que a seguradora pode verificar danos, causa, orçamento, fotos e documentos antes de autorizar reparo ou pagamento.</w:t>
       </w:r>
     </w:p>
     <w:p>
@@ -2352,15 +2633,12 @@
           <w:color w:val="4F81BD"/>
           <w:sz w:val="28"/>
         </w:rPr>
-        <w:t>Referências</w:t>
-      </w:r>
-    </w:p>
-    <w:p>
-      <w:pPr>
-        <w:pStyle w:val="ListBullet"/>
-      </w:pPr>
-      <w:r>
-        <w:t>Documento interno: 02_MasterDictionary/AUTO/AUTO-0047.md</w:t>
+        <w:t>Limite comercial/compliance</w:t>
+      </w:r>
+    </w:p>
+    <w:p>
+      <w:r>
+        <w:t>O corretor não deve pular a avaliação nem prometer resultado antes da inspeção. Cobertura, valor e autorização dependem da análise da seguradora.</w:t>
       </w:r>
     </w:p>
     <w:p>
@@ -2372,7 +2650,7 @@
           <w:color w:val="4F81BD"/>
           <w:sz w:val="28"/>
         </w:rPr>
-        <w:t>Tags</w:t>
+        <w:t>Termos relacionados</w:t>
       </w:r>
     </w:p>
     <w:p>
@@ -2380,31 +2658,7 @@
         <w:pStyle w:val="ListBullet"/>
       </w:pPr>
       <w:r>
-        <w:t>faq</w:t>
-      </w:r>
-    </w:p>
-    <w:p>
-      <w:pPr>
-        <w:pStyle w:val="ListBullet"/>
-      </w:pPr>
-      <w:r>
-        <w:t>auto</w:t>
-      </w:r>
-    </w:p>
-    <w:p>
-      <w:pPr>
-        <w:pStyle w:val="ListBullet"/>
-      </w:pPr>
-      <w:r>
-        <w:t>sinistro</w:t>
-      </w:r>
-    </w:p>
-    <w:p>
-      <w:pPr>
-        <w:pStyle w:val="ListBullet"/>
-      </w:pPr>
-      <w:r>
-        <w:t>atendimento</w:t>
+        <w:t>AUTO-0047 - 損害調査 - Avaliação de danos</w:t>
       </w:r>
     </w:p>
     <w:p>
@@ -2416,7 +2670,7 @@
           <w:color w:val="4F81BD"/>
           <w:sz w:val="28"/>
         </w:rPr>
-        <w:t>Veja também</w:t>
+        <w:t>Referências cruzadas</w:t>
       </w:r>
     </w:p>
     <w:p>
@@ -2424,7 +2678,15 @@
         <w:pStyle w:val="ListBullet"/>
       </w:pPr>
       <w:r>
-        <w:t>02_MasterDictionary/AUTO/AUTO-0047.md</w:t>
+        <w:t>DIALOGUE-AUTO-0016</w:t>
+      </w:r>
+    </w:p>
+    <w:p>
+      <w:pPr>
+        <w:pStyle w:val="ListBullet"/>
+      </w:pPr>
+      <w:r>
+        <w:t>CASE-AUTO-0023</w:t>
       </w:r>
     </w:p>
     <w:p>
@@ -2436,6 +2698,90 @@
           <w:color w:val="4F81BD"/>
           <w:sz w:val="28"/>
         </w:rPr>
+        <w:t>Referências</w:t>
+      </w:r>
+    </w:p>
+    <w:p>
+      <w:pPr>
+        <w:pStyle w:val="ListBullet"/>
+      </w:pPr>
+      <w:r>
+        <w:t>Documento interno: 02_MasterDictionary/AUTO/AUTO-0047.md</w:t>
+      </w:r>
+    </w:p>
+    <w:p>
+      <w:pPr>
+        <w:pStyle w:val="Heading2"/>
+      </w:pPr>
+      <w:r>
+        <w:rPr>
+          <w:color w:val="4F81BD"/>
+          <w:sz w:val="28"/>
+        </w:rPr>
+        <w:t>Tags</w:t>
+      </w:r>
+    </w:p>
+    <w:p>
+      <w:pPr>
+        <w:pStyle w:val="ListBullet"/>
+      </w:pPr>
+      <w:r>
+        <w:t>faq</w:t>
+      </w:r>
+    </w:p>
+    <w:p>
+      <w:pPr>
+        <w:pStyle w:val="ListBullet"/>
+      </w:pPr>
+      <w:r>
+        <w:t>auto</w:t>
+      </w:r>
+    </w:p>
+    <w:p>
+      <w:pPr>
+        <w:pStyle w:val="ListBullet"/>
+      </w:pPr>
+      <w:r>
+        <w:t>sinistro</w:t>
+      </w:r>
+    </w:p>
+    <w:p>
+      <w:pPr>
+        <w:pStyle w:val="ListBullet"/>
+      </w:pPr>
+      <w:r>
+        <w:t>atendimento</w:t>
+      </w:r>
+    </w:p>
+    <w:p>
+      <w:pPr>
+        <w:pStyle w:val="Heading2"/>
+      </w:pPr>
+      <w:r>
+        <w:rPr>
+          <w:color w:val="4F81BD"/>
+          <w:sz w:val="28"/>
+        </w:rPr>
+        <w:t>Veja também</w:t>
+      </w:r>
+    </w:p>
+    <w:p>
+      <w:pPr>
+        <w:pStyle w:val="ListBullet"/>
+      </w:pPr>
+      <w:r>
+        <w:t>02_MasterDictionary/AUTO/AUTO-0047.md</w:t>
+      </w:r>
+    </w:p>
+    <w:p>
+      <w:pPr>
+        <w:pStyle w:val="Heading2"/>
+      </w:pPr>
+      <w:r>
+        <w:rPr>
+          <w:color w:val="4F81BD"/>
+          <w:sz w:val="28"/>
+        </w:rPr>
         <w:t>Histórico de revisão</w:t>
       </w:r>
     </w:p>
@@ -2463,6 +2809,15 @@
           <w:rFonts w:ascii="Courier New" w:hAnsi="Courier New"/>
           <w:sz w:val="16"/>
         </w:rPr>
+        <w:t>| 2026-06-26 | 0.2 | JP-BR Insurance Knowledge Base | Inclusão de consulta japonesa, próximo passo seguro e limite comercial/compliance. |</w:t>
+      </w:r>
+    </w:p>
+    <w:p>
+      <w:r>
+        <w:rPr>
+          <w:rFonts w:ascii="Courier New" w:hAnsi="Courier New"/>
+          <w:sz w:val="16"/>
+        </w:rPr>
         <w:t>| 2026-06-25 | 0.1 | JP-BR Insurance Knowledge Base | Criação inicial. |</w:t>
       </w:r>
     </w:p>
@@ -2496,7 +2851,7 @@
         <w:pStyle w:val="ListBullet"/>
       </w:pPr>
       <w:r>
-        <w:t>Versão: 0.1</w:t>
+        <w:t>Versão: 0.2</w:t>
       </w:r>
     </w:p>
     <w:p>
@@ -2520,7 +2875,7 @@
         <w:pStyle w:val="ListBullet"/>
       </w:pPr>
       <w:r>
-        <w:t>Histórico: Criação inicial.</w:t>
+        <w:t>Histórico: Criação inicial; reforço NotebookLM e compliance.</w:t>
       </w:r>
     </w:p>
     <w:p>
@@ -2583,12 +2938,23 @@
           <w:color w:val="4F81BD"/>
           <w:sz w:val="28"/>
         </w:rPr>
-        <w:t>Situação de atendimento</w:t>
-      </w:r>
-    </w:p>
-    <w:p>
-      <w:r>
-        <w:t>Cliente precisa entender perda total no contexto de atendimento de seguro de automóvel.</w:t>
+        <w:t>Consulta natural em japonês</w:t>
+      </w:r>
+    </w:p>
+    <w:p>
+      <w:pPr>
+        <w:pStyle w:val="ListBullet"/>
+      </w:pPr>
+      <w:r>
+        <w:t>車が全損になるのはどのような場合ですか。</w:t>
+      </w:r>
+    </w:p>
+    <w:p>
+      <w:pPr>
+        <w:pStyle w:val="ListBullet"/>
+      </w:pPr>
+      <w:r>
+        <w:t>全損判断をブラジル人のお客様にどう説明しますか。</w:t>
       </w:r>
     </w:p>
     <w:p>
@@ -2600,12 +2966,12 @@
           <w:color w:val="4F81BD"/>
           <w:sz w:val="28"/>
         </w:rPr>
-        <w:t>Resposta técnica</w:t>
-      </w:r>
-    </w:p>
-    <w:p>
-      <w:r>
-        <w:t>Situação em que o veículo é considerado economicamente ou tecnicamente inviável para reparo conforme critérios da seguradora.</w:t>
+        <w:t>Situação de atendimento</w:t>
+      </w:r>
+    </w:p>
+    <w:p>
+      <w:r>
+        <w:t>Cliente precisa entender perda total no contexto de atendimento de seguro de automóvel.</w:t>
       </w:r>
     </w:p>
     <w:p>
@@ -2617,12 +2983,12 @@
           <w:color w:val="4F81BD"/>
           <w:sz w:val="28"/>
         </w:rPr>
-        <w:t>Como responder ao cliente brasileiro</w:t>
-      </w:r>
-    </w:p>
-    <w:p>
-      <w:r>
-        <w:t>Se o dano for muito grande, a seguradora pode avaliar como perda total e aplicar as regras da apólice.</w:t>
+        <w:t>Resposta técnica</w:t>
+      </w:r>
+    </w:p>
+    <w:p>
+      <w:r>
+        <w:t>Situação em que o veículo é considerado economicamente ou tecnicamente inviável para reparo conforme critérios da seguradora.</w:t>
       </w:r>
     </w:p>
     <w:p>
@@ -2634,15 +3000,12 @@
           <w:color w:val="4F81BD"/>
           <w:sz w:val="28"/>
         </w:rPr>
-        <w:t>Termos relacionados</w:t>
-      </w:r>
-    </w:p>
-    <w:p>
-      <w:pPr>
-        <w:pStyle w:val="ListBullet"/>
-      </w:pPr>
-      <w:r>
-        <w:t>AUTO-0048 - 全損 - Perda total</w:t>
+        <w:t>Como responder ao cliente brasileiro</w:t>
+      </w:r>
+    </w:p>
+    <w:p>
+      <w:r>
+        <w:t>Se o dano for muito grande, a seguradora pode avaliar como perda total e aplicar as regras da apólice.</w:t>
       </w:r>
     </w:p>
     <w:p>
@@ -2654,23 +3017,12 @@
           <w:color w:val="4F81BD"/>
           <w:sz w:val="28"/>
         </w:rPr>
-        <w:t>Referências cruzadas</w:t>
-      </w:r>
-    </w:p>
-    <w:p>
-      <w:pPr>
-        <w:pStyle w:val="ListBullet"/>
-      </w:pPr>
-      <w:r>
-        <w:t>DIALOGUE-AUTO-0016</w:t>
-      </w:r>
-    </w:p>
-    <w:p>
-      <w:pPr>
-        <w:pStyle w:val="ListBullet"/>
-      </w:pPr>
-      <w:r>
-        <w:t>CASE-AUTO-0023</w:t>
+        <w:t>Próximo passo seguro</w:t>
+      </w:r>
+    </w:p>
+    <w:p>
+      <w:r>
+        <w:t>Aguardar avaliação da seguradora sobre valor do veículo, custo de reparo, extensão dos danos e critérios da apólice antes de falar em perda total.</w:t>
       </w:r>
     </w:p>
     <w:p>
@@ -2682,15 +3034,12 @@
           <w:color w:val="4F81BD"/>
           <w:sz w:val="28"/>
         </w:rPr>
-        <w:t>Referências</w:t>
-      </w:r>
-    </w:p>
-    <w:p>
-      <w:pPr>
-        <w:pStyle w:val="ListBullet"/>
-      </w:pPr>
-      <w:r>
-        <w:t>Documento interno: 02_MasterDictionary/AUTO/AUTO-0048.md</w:t>
+        <w:t>Limite comercial/compliance</w:t>
+      </w:r>
+    </w:p>
+    <w:p>
+      <w:r>
+        <w:t>O corretor não deve declarar perda total por conta própria nem prometer valor de indenização. A classificação depende dos critérios da seguradora e do contrato.</w:t>
       </w:r>
     </w:p>
     <w:p>
@@ -2702,7 +3051,7 @@
           <w:color w:val="4F81BD"/>
           <w:sz w:val="28"/>
         </w:rPr>
-        <w:t>Tags</w:t>
+        <w:t>Termos relacionados</w:t>
       </w:r>
     </w:p>
     <w:p>
@@ -2710,31 +3059,7 @@
         <w:pStyle w:val="ListBullet"/>
       </w:pPr>
       <w:r>
-        <w:t>faq</w:t>
-      </w:r>
-    </w:p>
-    <w:p>
-      <w:pPr>
-        <w:pStyle w:val="ListBullet"/>
-      </w:pPr>
-      <w:r>
-        <w:t>auto</w:t>
-      </w:r>
-    </w:p>
-    <w:p>
-      <w:pPr>
-        <w:pStyle w:val="ListBullet"/>
-      </w:pPr>
-      <w:r>
-        <w:t>sinistro</w:t>
-      </w:r>
-    </w:p>
-    <w:p>
-      <w:pPr>
-        <w:pStyle w:val="ListBullet"/>
-      </w:pPr>
-      <w:r>
-        <w:t>atendimento</w:t>
+        <w:t>AUTO-0048 - 全損 - Perda total</w:t>
       </w:r>
     </w:p>
     <w:p>
@@ -2746,7 +3071,7 @@
           <w:color w:val="4F81BD"/>
           <w:sz w:val="28"/>
         </w:rPr>
-        <w:t>Veja também</w:t>
+        <w:t>Referências cruzadas</w:t>
       </w:r>
     </w:p>
     <w:p>
@@ -2754,7 +3079,15 @@
         <w:pStyle w:val="ListBullet"/>
       </w:pPr>
       <w:r>
-        <w:t>02_MasterDictionary/AUTO/AUTO-0048.md</w:t>
+        <w:t>DIALOGUE-AUTO-0016</w:t>
+      </w:r>
+    </w:p>
+    <w:p>
+      <w:pPr>
+        <w:pStyle w:val="ListBullet"/>
+      </w:pPr>
+      <w:r>
+        <w:t>CASE-AUTO-0023</w:t>
       </w:r>
     </w:p>
     <w:p>
@@ -2766,6 +3099,90 @@
           <w:color w:val="4F81BD"/>
           <w:sz w:val="28"/>
         </w:rPr>
+        <w:t>Referências</w:t>
+      </w:r>
+    </w:p>
+    <w:p>
+      <w:pPr>
+        <w:pStyle w:val="ListBullet"/>
+      </w:pPr>
+      <w:r>
+        <w:t>Documento interno: 02_MasterDictionary/AUTO/AUTO-0048.md</w:t>
+      </w:r>
+    </w:p>
+    <w:p>
+      <w:pPr>
+        <w:pStyle w:val="Heading2"/>
+      </w:pPr>
+      <w:r>
+        <w:rPr>
+          <w:color w:val="4F81BD"/>
+          <w:sz w:val="28"/>
+        </w:rPr>
+        <w:t>Tags</w:t>
+      </w:r>
+    </w:p>
+    <w:p>
+      <w:pPr>
+        <w:pStyle w:val="ListBullet"/>
+      </w:pPr>
+      <w:r>
+        <w:t>faq</w:t>
+      </w:r>
+    </w:p>
+    <w:p>
+      <w:pPr>
+        <w:pStyle w:val="ListBullet"/>
+      </w:pPr>
+      <w:r>
+        <w:t>auto</w:t>
+      </w:r>
+    </w:p>
+    <w:p>
+      <w:pPr>
+        <w:pStyle w:val="ListBullet"/>
+      </w:pPr>
+      <w:r>
+        <w:t>sinistro</w:t>
+      </w:r>
+    </w:p>
+    <w:p>
+      <w:pPr>
+        <w:pStyle w:val="ListBullet"/>
+      </w:pPr>
+      <w:r>
+        <w:t>atendimento</w:t>
+      </w:r>
+    </w:p>
+    <w:p>
+      <w:pPr>
+        <w:pStyle w:val="Heading2"/>
+      </w:pPr>
+      <w:r>
+        <w:rPr>
+          <w:color w:val="4F81BD"/>
+          <w:sz w:val="28"/>
+        </w:rPr>
+        <w:t>Veja também</w:t>
+      </w:r>
+    </w:p>
+    <w:p>
+      <w:pPr>
+        <w:pStyle w:val="ListBullet"/>
+      </w:pPr>
+      <w:r>
+        <w:t>02_MasterDictionary/AUTO/AUTO-0048.md</w:t>
+      </w:r>
+    </w:p>
+    <w:p>
+      <w:pPr>
+        <w:pStyle w:val="Heading2"/>
+      </w:pPr>
+      <w:r>
+        <w:rPr>
+          <w:color w:val="4F81BD"/>
+          <w:sz w:val="28"/>
+        </w:rPr>
         <w:t>Histórico de revisão</w:t>
       </w:r>
     </w:p>
@@ -2793,6 +3210,15 @@
           <w:rFonts w:ascii="Courier New" w:hAnsi="Courier New"/>
           <w:sz w:val="16"/>
         </w:rPr>
+        <w:t>| 2026-06-26 | 0.2 | JP-BR Insurance Knowledge Base | Inclusão de consulta japonesa, próximo passo seguro e limite comercial/compliance. |</w:t>
+      </w:r>
+    </w:p>
+    <w:p>
+      <w:r>
+        <w:rPr>
+          <w:rFonts w:ascii="Courier New" w:hAnsi="Courier New"/>
+          <w:sz w:val="16"/>
+        </w:rPr>
         <w:t>| 2026-06-25 | 0.1 | JP-BR Insurance Knowledge Base | Criação inicial. |</w:t>
       </w:r>
     </w:p>
@@ -2826,7 +3252,7 @@
         <w:pStyle w:val="ListBullet"/>
       </w:pPr>
       <w:r>
-        <w:t>Versão: 0.1</w:t>
+        <w:t>Versão: 0.2</w:t>
       </w:r>
     </w:p>
     <w:p>
@@ -2850,7 +3276,7 @@
         <w:pStyle w:val="ListBullet"/>
       </w:pPr>
       <w:r>
-        <w:t>Histórico: Criação inicial.</w:t>
+        <w:t>Histórico: Criação inicial; reforço NotebookLM e compliance.</w:t>
       </w:r>
     </w:p>
     <w:p>
@@ -2913,12 +3339,23 @@
           <w:color w:val="4F81BD"/>
           <w:sz w:val="28"/>
         </w:rPr>
-        <w:t>Situação de atendimento</w:t>
-      </w:r>
-    </w:p>
-    <w:p>
-      <w:r>
-        <w:t>Cliente precisa entender perda parcial no contexto de atendimento de seguro de automóvel.</w:t>
+        <w:t>Consulta natural em japonês</w:t>
+      </w:r>
+    </w:p>
+    <w:p>
+      <w:pPr>
+        <w:pStyle w:val="ListBullet"/>
+      </w:pPr>
+      <w:r>
+        <w:t>分損の場合、修理や支払いはどう進みますか。</w:t>
+      </w:r>
+    </w:p>
+    <w:p>
+      <w:pPr>
+        <w:pStyle w:val="ListBullet"/>
+      </w:pPr>
+      <w:r>
+        <w:t>分損をブラジル人のお客様にどう説明しますか。</w:t>
       </w:r>
     </w:p>
     <w:p>
@@ -2930,12 +3367,12 @@
           <w:color w:val="4F81BD"/>
           <w:sz w:val="28"/>
         </w:rPr>
-        <w:t>Resposta técnica</w:t>
-      </w:r>
-    </w:p>
-    <w:p>
-      <w:r>
-        <w:t>Situação em que o veículo sofre danos reparáveis, sem ser classificado como perda total.</w:t>
+        <w:t>Situação de atendimento</w:t>
+      </w:r>
+    </w:p>
+    <w:p>
+      <w:r>
+        <w:t>Cliente precisa entender perda parcial no contexto de atendimento de seguro de automóvel.</w:t>
       </w:r>
     </w:p>
     <w:p>
@@ -2947,12 +3384,12 @@
           <w:color w:val="4F81BD"/>
           <w:sz w:val="28"/>
         </w:rPr>
-        <w:t>Como responder ao cliente brasileiro</w:t>
-      </w:r>
-    </w:p>
-    <w:p>
-      <w:r>
-        <w:t>Se for perda parcial, o processo normalmente segue para orçamento, avaliação e reparo conforme cobertura.</w:t>
+        <w:t>Resposta técnica</w:t>
+      </w:r>
+    </w:p>
+    <w:p>
+      <w:r>
+        <w:t>Situação em que o veículo sofre danos reparáveis, sem ser classificado como perda total.</w:t>
       </w:r>
     </w:p>
     <w:p>
@@ -2964,15 +3401,12 @@
           <w:color w:val="4F81BD"/>
           <w:sz w:val="28"/>
         </w:rPr>
-        <w:t>Termos relacionados</w:t>
-      </w:r>
-    </w:p>
-    <w:p>
-      <w:pPr>
-        <w:pStyle w:val="ListBullet"/>
-      </w:pPr>
-      <w:r>
-        <w:t>AUTO-0049 - 分損 - Perda parcial</w:t>
+        <w:t>Como responder ao cliente brasileiro</w:t>
+      </w:r>
+    </w:p>
+    <w:p>
+      <w:r>
+        <w:t>Se for perda parcial, o processo normalmente segue para orçamento, avaliação e reparo conforme cobertura.</w:t>
       </w:r>
     </w:p>
     <w:p>
@@ -2984,23 +3418,12 @@
           <w:color w:val="4F81BD"/>
           <w:sz w:val="28"/>
         </w:rPr>
-        <w:t>Referências cruzadas</w:t>
-      </w:r>
-    </w:p>
-    <w:p>
-      <w:pPr>
-        <w:pStyle w:val="ListBullet"/>
-      </w:pPr>
-      <w:r>
-        <w:t>DIALOGUE-AUTO-0017</w:t>
-      </w:r>
-    </w:p>
-    <w:p>
-      <w:pPr>
-        <w:pStyle w:val="ListBullet"/>
-      </w:pPr>
-      <w:r>
-        <w:t>CASE-AUTO-0023</w:t>
+        <w:t>Próximo passo seguro</w:t>
+      </w:r>
+    </w:p>
+    <w:p>
+      <w:r>
+        <w:t>Confirmar orçamento, cobertura, franquia, oficina e autorização da seguradora para orientar o fluxo de reparo.</w:t>
       </w:r>
     </w:p>
     <w:p>
@@ -3012,15 +3435,12 @@
           <w:color w:val="4F81BD"/>
           <w:sz w:val="28"/>
         </w:rPr>
-        <w:t>Referências</w:t>
-      </w:r>
-    </w:p>
-    <w:p>
-      <w:pPr>
-        <w:pStyle w:val="ListBullet"/>
-      </w:pPr>
-      <w:r>
-        <w:t>Documento interno: 02_MasterDictionary/AUTO/AUTO-0049.md</w:t>
+        <w:t>Limite comercial/compliance</w:t>
+      </w:r>
+    </w:p>
+    <w:p>
+      <w:r>
+        <w:t>O corretor não deve prometer conserto, oficina, prazo ou pagamento antes da autorização. Perda parcial também depende de análise e condições da apólice.</w:t>
       </w:r>
     </w:p>
     <w:p>
@@ -3032,7 +3452,7 @@
           <w:color w:val="4F81BD"/>
           <w:sz w:val="28"/>
         </w:rPr>
-        <w:t>Tags</w:t>
+        <w:t>Termos relacionados</w:t>
       </w:r>
     </w:p>
     <w:p>
@@ -3040,31 +3460,7 @@
         <w:pStyle w:val="ListBullet"/>
       </w:pPr>
       <w:r>
-        <w:t>faq</w:t>
-      </w:r>
-    </w:p>
-    <w:p>
-      <w:pPr>
-        <w:pStyle w:val="ListBullet"/>
-      </w:pPr>
-      <w:r>
-        <w:t>auto</w:t>
-      </w:r>
-    </w:p>
-    <w:p>
-      <w:pPr>
-        <w:pStyle w:val="ListBullet"/>
-      </w:pPr>
-      <w:r>
-        <w:t>sinistro</w:t>
-      </w:r>
-    </w:p>
-    <w:p>
-      <w:pPr>
-        <w:pStyle w:val="ListBullet"/>
-      </w:pPr>
-      <w:r>
-        <w:t>atendimento</w:t>
+        <w:t>AUTO-0049 - 分損 - Perda parcial</w:t>
       </w:r>
     </w:p>
     <w:p>
@@ -3076,7 +3472,7 @@
           <w:color w:val="4F81BD"/>
           <w:sz w:val="28"/>
         </w:rPr>
-        <w:t>Veja também</w:t>
+        <w:t>Referências cruzadas</w:t>
       </w:r>
     </w:p>
     <w:p>
@@ -3084,7 +3480,15 @@
         <w:pStyle w:val="ListBullet"/>
       </w:pPr>
       <w:r>
-        <w:t>02_MasterDictionary/AUTO/AUTO-0049.md</w:t>
+        <w:t>DIALOGUE-AUTO-0017</w:t>
+      </w:r>
+    </w:p>
+    <w:p>
+      <w:pPr>
+        <w:pStyle w:val="ListBullet"/>
+      </w:pPr>
+      <w:r>
+        <w:t>CASE-AUTO-0023</w:t>
       </w:r>
     </w:p>
     <w:p>
@@ -3096,6 +3500,90 @@
           <w:color w:val="4F81BD"/>
           <w:sz w:val="28"/>
         </w:rPr>
+        <w:t>Referências</w:t>
+      </w:r>
+    </w:p>
+    <w:p>
+      <w:pPr>
+        <w:pStyle w:val="ListBullet"/>
+      </w:pPr>
+      <w:r>
+        <w:t>Documento interno: 02_MasterDictionary/AUTO/AUTO-0049.md</w:t>
+      </w:r>
+    </w:p>
+    <w:p>
+      <w:pPr>
+        <w:pStyle w:val="Heading2"/>
+      </w:pPr>
+      <w:r>
+        <w:rPr>
+          <w:color w:val="4F81BD"/>
+          <w:sz w:val="28"/>
+        </w:rPr>
+        <w:t>Tags</w:t>
+      </w:r>
+    </w:p>
+    <w:p>
+      <w:pPr>
+        <w:pStyle w:val="ListBullet"/>
+      </w:pPr>
+      <w:r>
+        <w:t>faq</w:t>
+      </w:r>
+    </w:p>
+    <w:p>
+      <w:pPr>
+        <w:pStyle w:val="ListBullet"/>
+      </w:pPr>
+      <w:r>
+        <w:t>auto</w:t>
+      </w:r>
+    </w:p>
+    <w:p>
+      <w:pPr>
+        <w:pStyle w:val="ListBullet"/>
+      </w:pPr>
+      <w:r>
+        <w:t>sinistro</w:t>
+      </w:r>
+    </w:p>
+    <w:p>
+      <w:pPr>
+        <w:pStyle w:val="ListBullet"/>
+      </w:pPr>
+      <w:r>
+        <w:t>atendimento</w:t>
+      </w:r>
+    </w:p>
+    <w:p>
+      <w:pPr>
+        <w:pStyle w:val="Heading2"/>
+      </w:pPr>
+      <w:r>
+        <w:rPr>
+          <w:color w:val="4F81BD"/>
+          <w:sz w:val="28"/>
+        </w:rPr>
+        <w:t>Veja também</w:t>
+      </w:r>
+    </w:p>
+    <w:p>
+      <w:pPr>
+        <w:pStyle w:val="ListBullet"/>
+      </w:pPr>
+      <w:r>
+        <w:t>02_MasterDictionary/AUTO/AUTO-0049.md</w:t>
+      </w:r>
+    </w:p>
+    <w:p>
+      <w:pPr>
+        <w:pStyle w:val="Heading2"/>
+      </w:pPr>
+      <w:r>
+        <w:rPr>
+          <w:color w:val="4F81BD"/>
+          <w:sz w:val="28"/>
+        </w:rPr>
         <w:t>Histórico de revisão</w:t>
       </w:r>
     </w:p>
@@ -3123,6 +3611,15 @@
           <w:rFonts w:ascii="Courier New" w:hAnsi="Courier New"/>
           <w:sz w:val="16"/>
         </w:rPr>
+        <w:t>| 2026-06-26 | 0.2 | JP-BR Insurance Knowledge Base | Inclusão de consulta japonesa, próximo passo seguro e limite comercial/compliance. |</w:t>
+      </w:r>
+    </w:p>
+    <w:p>
+      <w:r>
+        <w:rPr>
+          <w:rFonts w:ascii="Courier New" w:hAnsi="Courier New"/>
+          <w:sz w:val="16"/>
+        </w:rPr>
         <w:t>| 2026-06-25 | 0.1 | JP-BR Insurance Knowledge Base | Criação inicial. |</w:t>
       </w:r>
     </w:p>
@@ -3156,7 +3653,7 @@
         <w:pStyle w:val="ListBullet"/>
       </w:pPr>
       <w:r>
-        <w:t>Versão: 0.1</w:t>
+        <w:t>Versão: 0.2</w:t>
       </w:r>
     </w:p>
     <w:p>
@@ -3180,7 +3677,7 @@
         <w:pStyle w:val="ListBullet"/>
       </w:pPr>
       <w:r>
-        <w:t>Histórico: Criação inicial.</w:t>
+        <w:t>Histórico: Criação inicial; reforço NotebookLM e compliance.</w:t>
       </w:r>
     </w:p>
     <w:p>
@@ -3243,12 +3740,23 @@
           <w:color w:val="4F81BD"/>
           <w:sz w:val="28"/>
         </w:rPr>
-        <w:t>Situação de atendimento</w:t>
-      </w:r>
-    </w:p>
-    <w:p>
-      <w:r>
-        <w:t>Cliente precisa entender remoção por guincho no contexto de atendimento de seguro de automóvel.</w:t>
+        <w:t>Consulta natural em japonês</w:t>
+      </w:r>
+    </w:p>
+    <w:p>
+      <w:pPr>
+        <w:pStyle w:val="ListBullet"/>
+      </w:pPr>
+      <w:r>
+        <w:t>事故や故障でレッカー搬送を使えますか。</w:t>
+      </w:r>
+    </w:p>
+    <w:p>
+      <w:pPr>
+        <w:pStyle w:val="ListBullet"/>
+      </w:pPr>
+      <w:r>
+        <w:t>レッカー搬送をブラジル人のお客様に案内するとき、何を確認しますか。</w:t>
       </w:r>
     </w:p>
     <w:p>
@@ -3260,12 +3768,12 @@
           <w:color w:val="4F81BD"/>
           <w:sz w:val="28"/>
         </w:rPr>
-        <w:t>Resposta técnica</w:t>
-      </w:r>
-    </w:p>
-    <w:p>
-      <w:r>
-        <w:t>Transporte do veículo por guincho após acidente, pane ou impossibilidade de circulação, conforme cobertura ou serviço disponível.</w:t>
+        <w:t>Situação de atendimento</w:t>
+      </w:r>
+    </w:p>
+    <w:p>
+      <w:r>
+        <w:t>Cliente precisa entender remoção por guincho no contexto de atendimento de seguro de automóvel.</w:t>
       </w:r>
     </w:p>
     <w:p>
@@ -3277,12 +3785,12 @@
           <w:color w:val="4F81BD"/>
           <w:sz w:val="28"/>
         </w:rPr>
-        <w:t>Como responder ao cliente brasileiro</w:t>
-      </w:r>
-    </w:p>
-    <w:p>
-      <w:r>
-        <w:t>Se o carro não puder andar, verificamos se há serviço de guincho disponível no contrato.</w:t>
+        <w:t>Resposta técnica</w:t>
+      </w:r>
+    </w:p>
+    <w:p>
+      <w:r>
+        <w:t>Transporte do veículo por guincho após acidente, pane ou impossibilidade de circulação, conforme cobertura ou serviço disponível.</w:t>
       </w:r>
     </w:p>
     <w:p>
@@ -3294,15 +3802,12 @@
           <w:color w:val="4F81BD"/>
           <w:sz w:val="28"/>
         </w:rPr>
-        <w:t>Termos relacionados</w:t>
-      </w:r>
-    </w:p>
-    <w:p>
-      <w:pPr>
-        <w:pStyle w:val="ListBullet"/>
-      </w:pPr>
-      <w:r>
-        <w:t>AUTO-0050 - レッカー搬送 - Remoção por guincho</w:t>
+        <w:t>Como responder ao cliente brasileiro</w:t>
+      </w:r>
+    </w:p>
+    <w:p>
+      <w:r>
+        <w:t>Se o carro não puder andar, verificamos se há serviço de guincho disponível no contrato.</w:t>
       </w:r>
     </w:p>
     <w:p>
@@ -3314,23 +3819,12 @@
           <w:color w:val="4F81BD"/>
           <w:sz w:val="28"/>
         </w:rPr>
-        <w:t>Referências cruzadas</w:t>
-      </w:r>
-    </w:p>
-    <w:p>
-      <w:pPr>
-        <w:pStyle w:val="ListBullet"/>
-      </w:pPr>
-      <w:r>
-        <w:t>DIALOGUE-AUTO-0017</w:t>
-      </w:r>
-    </w:p>
-    <w:p>
-      <w:pPr>
-        <w:pStyle w:val="ListBullet"/>
-      </w:pPr>
-      <w:r>
-        <w:t>CASE-AUTO-0024</w:t>
+        <w:t>Próximo passo seguro</w:t>
+      </w:r>
+    </w:p>
+    <w:p>
+      <w:r>
+        <w:t>Verificar se o contrato possui serviço de guincho, limite de distância, canal de acionamento e se a situação se enquadra nas regras.</w:t>
       </w:r>
     </w:p>
     <w:p>
@@ -3342,15 +3836,12 @@
           <w:color w:val="4F81BD"/>
           <w:sz w:val="28"/>
         </w:rPr>
-        <w:t>Referências</w:t>
-      </w:r>
-    </w:p>
-    <w:p>
-      <w:pPr>
-        <w:pStyle w:val="ListBullet"/>
-      </w:pPr>
-      <w:r>
-        <w:t>Documento interno: 02_MasterDictionary/AUTO/AUTO-0050.md</w:t>
+        <w:t>Limite comercial/compliance</w:t>
+      </w:r>
+    </w:p>
+    <w:p>
+      <w:r>
+        <w:t>O corretor não deve garantir guincho gratuito ou ilimitado. Disponibilidade, distância, custo e condições dependem do contrato e do serviço autorizado.</w:t>
       </w:r>
     </w:p>
     <w:p>
@@ -3362,7 +3853,7 @@
           <w:color w:val="4F81BD"/>
           <w:sz w:val="28"/>
         </w:rPr>
-        <w:t>Tags</w:t>
+        <w:t>Termos relacionados</w:t>
       </w:r>
     </w:p>
     <w:p>
@@ -3370,31 +3861,7 @@
         <w:pStyle w:val="ListBullet"/>
       </w:pPr>
       <w:r>
-        <w:t>faq</w:t>
-      </w:r>
-    </w:p>
-    <w:p>
-      <w:pPr>
-        <w:pStyle w:val="ListBullet"/>
-      </w:pPr>
-      <w:r>
-        <w:t>auto</w:t>
-      </w:r>
-    </w:p>
-    <w:p>
-      <w:pPr>
-        <w:pStyle w:val="ListBullet"/>
-      </w:pPr>
-      <w:r>
-        <w:t>sinistro</w:t>
-      </w:r>
-    </w:p>
-    <w:p>
-      <w:pPr>
-        <w:pStyle w:val="ListBullet"/>
-      </w:pPr>
-      <w:r>
-        <w:t>atendimento</w:t>
+        <w:t>AUTO-0050 - レッカー搬送 - Remoção por guincho</w:t>
       </w:r>
     </w:p>
     <w:p>
@@ -3406,7 +3873,7 @@
           <w:color w:val="4F81BD"/>
           <w:sz w:val="28"/>
         </w:rPr>
-        <w:t>Veja também</w:t>
+        <w:t>Referências cruzadas</w:t>
       </w:r>
     </w:p>
     <w:p>
@@ -3414,7 +3881,15 @@
         <w:pStyle w:val="ListBullet"/>
       </w:pPr>
       <w:r>
-        <w:t>02_MasterDictionary/AUTO/AUTO-0050.md</w:t>
+        <w:t>DIALOGUE-AUTO-0017</w:t>
+      </w:r>
+    </w:p>
+    <w:p>
+      <w:pPr>
+        <w:pStyle w:val="ListBullet"/>
+      </w:pPr>
+      <w:r>
+        <w:t>CASE-AUTO-0024</w:t>
       </w:r>
     </w:p>
     <w:p>
@@ -3426,6 +3901,90 @@
           <w:color w:val="4F81BD"/>
           <w:sz w:val="28"/>
         </w:rPr>
+        <w:t>Referências</w:t>
+      </w:r>
+    </w:p>
+    <w:p>
+      <w:pPr>
+        <w:pStyle w:val="ListBullet"/>
+      </w:pPr>
+      <w:r>
+        <w:t>Documento interno: 02_MasterDictionary/AUTO/AUTO-0050.md</w:t>
+      </w:r>
+    </w:p>
+    <w:p>
+      <w:pPr>
+        <w:pStyle w:val="Heading2"/>
+      </w:pPr>
+      <w:r>
+        <w:rPr>
+          <w:color w:val="4F81BD"/>
+          <w:sz w:val="28"/>
+        </w:rPr>
+        <w:t>Tags</w:t>
+      </w:r>
+    </w:p>
+    <w:p>
+      <w:pPr>
+        <w:pStyle w:val="ListBullet"/>
+      </w:pPr>
+      <w:r>
+        <w:t>faq</w:t>
+      </w:r>
+    </w:p>
+    <w:p>
+      <w:pPr>
+        <w:pStyle w:val="ListBullet"/>
+      </w:pPr>
+      <w:r>
+        <w:t>auto</w:t>
+      </w:r>
+    </w:p>
+    <w:p>
+      <w:pPr>
+        <w:pStyle w:val="ListBullet"/>
+      </w:pPr>
+      <w:r>
+        <w:t>sinistro</w:t>
+      </w:r>
+    </w:p>
+    <w:p>
+      <w:pPr>
+        <w:pStyle w:val="ListBullet"/>
+      </w:pPr>
+      <w:r>
+        <w:t>atendimento</w:t>
+      </w:r>
+    </w:p>
+    <w:p>
+      <w:pPr>
+        <w:pStyle w:val="Heading2"/>
+      </w:pPr>
+      <w:r>
+        <w:rPr>
+          <w:color w:val="4F81BD"/>
+          <w:sz w:val="28"/>
+        </w:rPr>
+        <w:t>Veja também</w:t>
+      </w:r>
+    </w:p>
+    <w:p>
+      <w:pPr>
+        <w:pStyle w:val="ListBullet"/>
+      </w:pPr>
+      <w:r>
+        <w:t>02_MasterDictionary/AUTO/AUTO-0050.md</w:t>
+      </w:r>
+    </w:p>
+    <w:p>
+      <w:pPr>
+        <w:pStyle w:val="Heading2"/>
+      </w:pPr>
+      <w:r>
+        <w:rPr>
+          <w:color w:val="4F81BD"/>
+          <w:sz w:val="28"/>
+        </w:rPr>
         <w:t>Histórico de revisão</w:t>
       </w:r>
     </w:p>
@@ -3453,6 +4012,15 @@
           <w:rFonts w:ascii="Courier New" w:hAnsi="Courier New"/>
           <w:sz w:val="16"/>
         </w:rPr>
+        <w:t>| 2026-06-26 | 0.2 | JP-BR Insurance Knowledge Base | Inclusão de consulta japonesa, próximo passo seguro e limite comercial/compliance. |</w:t>
+      </w:r>
+    </w:p>
+    <w:p>
+      <w:r>
+        <w:rPr>
+          <w:rFonts w:ascii="Courier New" w:hAnsi="Courier New"/>
+          <w:sz w:val="16"/>
+        </w:rPr>
         <w:t>| 2026-06-25 | 0.1 | JP-BR Insurance Knowledge Base | Criação inicial. |</w:t>
       </w:r>
     </w:p>
@@ -3486,7 +4054,7 @@
         <w:pStyle w:val="ListBullet"/>
       </w:pPr>
       <w:r>
-        <w:t>Versão: 0.1</w:t>
+        <w:t>Versão: 0.2</w:t>
       </w:r>
     </w:p>
     <w:p>
@@ -3510,7 +4078,7 @@
         <w:pStyle w:val="ListBullet"/>
       </w:pPr>
       <w:r>
-        <w:t>Histórico: Criação inicial.</w:t>
+        <w:t>Histórico: Criação inicial; reforço NotebookLM e compliance.</w:t>
       </w:r>
     </w:p>
     <w:p>
@@ -3573,12 +4141,23 @@
           <w:color w:val="4F81BD"/>
           <w:sz w:val="28"/>
         </w:rPr>
-        <w:t>Situação de atendimento</w:t>
-      </w:r>
-    </w:p>
-    <w:p>
-      <w:r>
-        <w:t>Cliente precisa entender oficina de reparo no contexto de atendimento de seguro de automóvel.</w:t>
+        <w:t>Consulta natural em japonês</w:t>
+      </w:r>
+    </w:p>
+    <w:p>
+      <w:pPr>
+        <w:pStyle w:val="ListBullet"/>
+      </w:pPr>
+      <w:r>
+        <w:t>修理工場はお客様が自由に選べますか。</w:t>
+      </w:r>
+    </w:p>
+    <w:p>
+      <w:pPr>
+        <w:pStyle w:val="ListBullet"/>
+      </w:pPr>
+      <w:r>
+        <w:t>修理工場の選択をブラジル人のお客様にどう説明しますか。</w:t>
       </w:r>
     </w:p>
     <w:p>
@@ -3590,12 +4169,12 @@
           <w:color w:val="4F81BD"/>
           <w:sz w:val="28"/>
         </w:rPr>
-        <w:t>Resposta técnica</w:t>
-      </w:r>
-    </w:p>
-    <w:p>
-      <w:r>
-        <w:t>Estabelecimento responsável por avaliar, orçar e realizar reparos no veículo danificado.</w:t>
+        <w:t>Situação de atendimento</w:t>
+      </w:r>
+    </w:p>
+    <w:p>
+      <w:r>
+        <w:t>Cliente precisa entender oficina de reparo no contexto de atendimento de seguro de automóvel.</w:t>
       </w:r>
     </w:p>
     <w:p>
@@ -3607,12 +4186,12 @@
           <w:color w:val="4F81BD"/>
           <w:sz w:val="28"/>
         </w:rPr>
-        <w:t>Como responder ao cliente brasileiro</w:t>
-      </w:r>
-    </w:p>
-    <w:p>
-      <w:r>
-        <w:t>Podemos confirmar se a oficina é indicada, aceita pela seguradora ou escolhida pelo cliente conforme as regras do contrato.</w:t>
+        <w:t>Resposta técnica</w:t>
+      </w:r>
+    </w:p>
+    <w:p>
+      <w:r>
+        <w:t>Estabelecimento responsável por avaliar, orçar e realizar reparos no veículo danificado.</w:t>
       </w:r>
     </w:p>
     <w:p>
@@ -3624,15 +4203,12 @@
           <w:color w:val="4F81BD"/>
           <w:sz w:val="28"/>
         </w:rPr>
-        <w:t>Termos relacionados</w:t>
-      </w:r>
-    </w:p>
-    <w:p>
-      <w:pPr>
-        <w:pStyle w:val="ListBullet"/>
-      </w:pPr>
-      <w:r>
-        <w:t>AUTO-0051 - 修理工場 - Oficina de reparo</w:t>
+        <w:t>Como responder ao cliente brasileiro</w:t>
+      </w:r>
+    </w:p>
+    <w:p>
+      <w:r>
+        <w:t>Podemos confirmar se a oficina é indicada, aceita pela seguradora ou escolhida pelo cliente conforme as regras do contrato.</w:t>
       </w:r>
     </w:p>
     <w:p>
@@ -3644,23 +4220,12 @@
           <w:color w:val="4F81BD"/>
           <w:sz w:val="28"/>
         </w:rPr>
-        <w:t>Referências cruzadas</w:t>
-      </w:r>
-    </w:p>
-    <w:p>
-      <w:pPr>
-        <w:pStyle w:val="ListBullet"/>
-      </w:pPr>
-      <w:r>
-        <w:t>DIALOGUE-AUTO-0017</w:t>
-      </w:r>
-    </w:p>
-    <w:p>
-      <w:pPr>
-        <w:pStyle w:val="ListBullet"/>
-      </w:pPr>
-      <w:r>
-        <w:t>CASE-AUTO-0024</w:t>
+        <w:t>Próximo passo seguro</w:t>
+      </w:r>
+    </w:p>
+    <w:p>
+      <w:r>
+        <w:t>Confirmar se a seguradora exige oficina indicada, aceita oficina escolhida pelo cliente ou precisa aprovar orçamento antes do reparo.</w:t>
       </w:r>
     </w:p>
     <w:p>
@@ -3672,15 +4237,12 @@
           <w:color w:val="4F81BD"/>
           <w:sz w:val="28"/>
         </w:rPr>
-        <w:t>Referências</w:t>
-      </w:r>
-    </w:p>
-    <w:p>
-      <w:pPr>
-        <w:pStyle w:val="ListBullet"/>
-      </w:pPr>
-      <w:r>
-        <w:t>Documento interno: 02_MasterDictionary/AUTO/AUTO-0051.md</w:t>
+        <w:t>Limite comercial/compliance</w:t>
+      </w:r>
+    </w:p>
+    <w:p>
+      <w:r>
+        <w:t>O corretor não deve autorizar reparo ou escolha de oficina sem verificar regra da seguradora. Reparo feito sem autorização pode gerar problema no pagamento.</w:t>
       </w:r>
     </w:p>
     <w:p>
@@ -3692,7 +4254,7 @@
           <w:color w:val="4F81BD"/>
           <w:sz w:val="28"/>
         </w:rPr>
-        <w:t>Tags</w:t>
+        <w:t>Termos relacionados</w:t>
       </w:r>
     </w:p>
     <w:p>
@@ -3700,31 +4262,7 @@
         <w:pStyle w:val="ListBullet"/>
       </w:pPr>
       <w:r>
-        <w:t>faq</w:t>
-      </w:r>
-    </w:p>
-    <w:p>
-      <w:pPr>
-        <w:pStyle w:val="ListBullet"/>
-      </w:pPr>
-      <w:r>
-        <w:t>auto</w:t>
-      </w:r>
-    </w:p>
-    <w:p>
-      <w:pPr>
-        <w:pStyle w:val="ListBullet"/>
-      </w:pPr>
-      <w:r>
-        <w:t>sinistro</w:t>
-      </w:r>
-    </w:p>
-    <w:p>
-      <w:pPr>
-        <w:pStyle w:val="ListBullet"/>
-      </w:pPr>
-      <w:r>
-        <w:t>atendimento</w:t>
+        <w:t>AUTO-0051 - 修理工場 - Oficina de reparo</w:t>
       </w:r>
     </w:p>
     <w:p>
@@ -3736,7 +4274,7 @@
           <w:color w:val="4F81BD"/>
           <w:sz w:val="28"/>
         </w:rPr>
-        <w:t>Veja também</w:t>
+        <w:t>Referências cruzadas</w:t>
       </w:r>
     </w:p>
     <w:p>
@@ -3744,7 +4282,15 @@
         <w:pStyle w:val="ListBullet"/>
       </w:pPr>
       <w:r>
-        <w:t>02_MasterDictionary/AUTO/AUTO-0051.md</w:t>
+        <w:t>DIALOGUE-AUTO-0017</w:t>
+      </w:r>
+    </w:p>
+    <w:p>
+      <w:pPr>
+        <w:pStyle w:val="ListBullet"/>
+      </w:pPr>
+      <w:r>
+        <w:t>CASE-AUTO-0024</w:t>
       </w:r>
     </w:p>
     <w:p>
@@ -3756,6 +4302,90 @@
           <w:color w:val="4F81BD"/>
           <w:sz w:val="28"/>
         </w:rPr>
+        <w:t>Referências</w:t>
+      </w:r>
+    </w:p>
+    <w:p>
+      <w:pPr>
+        <w:pStyle w:val="ListBullet"/>
+      </w:pPr>
+      <w:r>
+        <w:t>Documento interno: 02_MasterDictionary/AUTO/AUTO-0051.md</w:t>
+      </w:r>
+    </w:p>
+    <w:p>
+      <w:pPr>
+        <w:pStyle w:val="Heading2"/>
+      </w:pPr>
+      <w:r>
+        <w:rPr>
+          <w:color w:val="4F81BD"/>
+          <w:sz w:val="28"/>
+        </w:rPr>
+        <w:t>Tags</w:t>
+      </w:r>
+    </w:p>
+    <w:p>
+      <w:pPr>
+        <w:pStyle w:val="ListBullet"/>
+      </w:pPr>
+      <w:r>
+        <w:t>faq</w:t>
+      </w:r>
+    </w:p>
+    <w:p>
+      <w:pPr>
+        <w:pStyle w:val="ListBullet"/>
+      </w:pPr>
+      <w:r>
+        <w:t>auto</w:t>
+      </w:r>
+    </w:p>
+    <w:p>
+      <w:pPr>
+        <w:pStyle w:val="ListBullet"/>
+      </w:pPr>
+      <w:r>
+        <w:t>sinistro</w:t>
+      </w:r>
+    </w:p>
+    <w:p>
+      <w:pPr>
+        <w:pStyle w:val="ListBullet"/>
+      </w:pPr>
+      <w:r>
+        <w:t>atendimento</w:t>
+      </w:r>
+    </w:p>
+    <w:p>
+      <w:pPr>
+        <w:pStyle w:val="Heading2"/>
+      </w:pPr>
+      <w:r>
+        <w:rPr>
+          <w:color w:val="4F81BD"/>
+          <w:sz w:val="28"/>
+        </w:rPr>
+        <w:t>Veja também</w:t>
+      </w:r>
+    </w:p>
+    <w:p>
+      <w:pPr>
+        <w:pStyle w:val="ListBullet"/>
+      </w:pPr>
+      <w:r>
+        <w:t>02_MasterDictionary/AUTO/AUTO-0051.md</w:t>
+      </w:r>
+    </w:p>
+    <w:p>
+      <w:pPr>
+        <w:pStyle w:val="Heading2"/>
+      </w:pPr>
+      <w:r>
+        <w:rPr>
+          <w:color w:val="4F81BD"/>
+          <w:sz w:val="28"/>
+        </w:rPr>
         <w:t>Histórico de revisão</w:t>
       </w:r>
     </w:p>
@@ -3783,6 +4413,15 @@
           <w:rFonts w:ascii="Courier New" w:hAnsi="Courier New"/>
           <w:sz w:val="16"/>
         </w:rPr>
+        <w:t>| 2026-06-26 | 0.2 | JP-BR Insurance Knowledge Base | Inclusão de consulta japonesa, próximo passo seguro e limite comercial/compliance. |</w:t>
+      </w:r>
+    </w:p>
+    <w:p>
+      <w:r>
+        <w:rPr>
+          <w:rFonts w:ascii="Courier New" w:hAnsi="Courier New"/>
+          <w:sz w:val="16"/>
+        </w:rPr>
         <w:t>| 2026-06-25 | 0.1 | JP-BR Insurance Knowledge Base | Criação inicial. |</w:t>
       </w:r>
     </w:p>
@@ -3816,7 +4455,7 @@
         <w:pStyle w:val="ListBullet"/>
       </w:pPr>
       <w:r>
-        <w:t>Versão: 0.1</w:t>
+        <w:t>Versão: 0.2</w:t>
       </w:r>
     </w:p>
     <w:p>
@@ -3840,7 +4479,7 @@
         <w:pStyle w:val="ListBullet"/>
       </w:pPr>
       <w:r>
-        <w:t>Histórico: Criação inicial.</w:t>
+        <w:t>Histórico: Criação inicial; reforço NotebookLM e compliance.</w:t>
       </w:r>
     </w:p>
     <w:p>
@@ -3903,12 +4542,23 @@
           <w:color w:val="4F81BD"/>
           <w:sz w:val="28"/>
         </w:rPr>
-        <w:t>Situação de atendimento</w:t>
-      </w:r>
-    </w:p>
-    <w:p>
-      <w:r>
-        <w:t>Cliente precisa entender seguradora no contexto de atendimento de seguro de automóvel.</w:t>
+        <w:t>Consulta natural em japonês</w:t>
+      </w:r>
+    </w:p>
+    <w:p>
+      <w:pPr>
+        <w:pStyle w:val="ListBullet"/>
+      </w:pPr>
+      <w:r>
+        <w:t>保険で補償されるかは誰が決めますか。</w:t>
+      </w:r>
+    </w:p>
+    <w:p>
+      <w:pPr>
+        <w:pStyle w:val="ListBullet"/>
+      </w:pPr>
+      <w:r>
+        <w:t>補償可否をブラジル人のお客様にどう説明しますか。</w:t>
       </w:r>
     </w:p>
     <w:p>
@@ -3920,12 +4570,12 @@
           <w:color w:val="4F81BD"/>
           <w:sz w:val="28"/>
         </w:rPr>
-        <w:t>Resposta técnica</w:t>
-      </w:r>
-    </w:p>
-    <w:p>
-      <w:r>
-        <w:t>Empresa que assume o risco do contrato de seguro e decide sobre aceitação, cobrança, cobertura e pagamento de indenização.</w:t>
+        <w:t>Situação de atendimento</w:t>
+      </w:r>
+    </w:p>
+    <w:p>
+      <w:r>
+        <w:t>Cliente precisa entender seguradora no contexto de atendimento de seguro de automóvel.</w:t>
       </w:r>
     </w:p>
     <w:p>
@@ -3937,12 +4587,12 @@
           <w:color w:val="4F81BD"/>
           <w:sz w:val="28"/>
         </w:rPr>
-        <w:t>Como responder ao cliente brasileiro</w:t>
-      </w:r>
-    </w:p>
-    <w:p>
-      <w:r>
-        <w:t>A seguradora analisa o contrato, o acidente e os documentos para decidir o atendimento.</w:t>
+        <w:t>Resposta técnica</w:t>
+      </w:r>
+    </w:p>
+    <w:p>
+      <w:r>
+        <w:t>Empresa que assume o risco do contrato de seguro e decide sobre aceitação, cobrança, cobertura e pagamento de indenização.</w:t>
       </w:r>
     </w:p>
     <w:p>
@@ -3954,15 +4604,12 @@
           <w:color w:val="4F81BD"/>
           <w:sz w:val="28"/>
         </w:rPr>
-        <w:t>Termos relacionados</w:t>
-      </w:r>
-    </w:p>
-    <w:p>
-      <w:pPr>
-        <w:pStyle w:val="ListBullet"/>
-      </w:pPr>
-      <w:r>
-        <w:t>AUTO-0052 - 保険会社 - Seguradora</w:t>
+        <w:t>Como responder ao cliente brasileiro</w:t>
+      </w:r>
+    </w:p>
+    <w:p>
+      <w:r>
+        <w:t>A seguradora analisa o contrato, o acidente e os documentos para decidir o atendimento.</w:t>
       </w:r>
     </w:p>
     <w:p>
@@ -3974,23 +4621,12 @@
           <w:color w:val="4F81BD"/>
           <w:sz w:val="28"/>
         </w:rPr>
-        <w:t>Referências cruzadas</w:t>
-      </w:r>
-    </w:p>
-    <w:p>
-      <w:pPr>
-        <w:pStyle w:val="ListBullet"/>
-      </w:pPr>
-      <w:r>
-        <w:t>DIALOGUE-AUTO-0017</w:t>
-      </w:r>
-    </w:p>
-    <w:p>
-      <w:pPr>
-        <w:pStyle w:val="ListBullet"/>
-      </w:pPr>
-      <w:r>
-        <w:t>CASE-AUTO-0024</w:t>
+        <w:t>Próximo passo seguro</w:t>
+      </w:r>
+    </w:p>
+    <w:p>
+      <w:r>
+        <w:t>Explicar que o corretor organiza informações e acompanha o processo, mas a seguradora decide após analisar contrato, acidente e documentos.</w:t>
       </w:r>
     </w:p>
     <w:p>
@@ -4002,15 +4638,12 @@
           <w:color w:val="4F81BD"/>
           <w:sz w:val="28"/>
         </w:rPr>
-        <w:t>Referências</w:t>
-      </w:r>
-    </w:p>
-    <w:p>
-      <w:pPr>
-        <w:pStyle w:val="ListBullet"/>
-      </w:pPr>
-      <w:r>
-        <w:t>Documento interno: 02_MasterDictionary/AUTO/AUTO-0052.md</w:t>
+        <w:t>Limite comercial/compliance</w:t>
+      </w:r>
+    </w:p>
+    <w:p>
+      <w:r>
+        <w:t>O corretor não deve decidir cobertura, valor, culpa, prazo ou pagamento. A decisão formal cabe à seguradora com base na apólice e nos documentos.</w:t>
       </w:r>
     </w:p>
     <w:p>
@@ -4022,7 +4655,7 @@
           <w:color w:val="4F81BD"/>
           <w:sz w:val="28"/>
         </w:rPr>
-        <w:t>Tags</w:t>
+        <w:t>Termos relacionados</w:t>
       </w:r>
     </w:p>
     <w:p>
@@ -4030,31 +4663,7 @@
         <w:pStyle w:val="ListBullet"/>
       </w:pPr>
       <w:r>
-        <w:t>faq</w:t>
-      </w:r>
-    </w:p>
-    <w:p>
-      <w:pPr>
-        <w:pStyle w:val="ListBullet"/>
-      </w:pPr>
-      <w:r>
-        <w:t>auto</w:t>
-      </w:r>
-    </w:p>
-    <w:p>
-      <w:pPr>
-        <w:pStyle w:val="ListBullet"/>
-      </w:pPr>
-      <w:r>
-        <w:t>sinistro</w:t>
-      </w:r>
-    </w:p>
-    <w:p>
-      <w:pPr>
-        <w:pStyle w:val="ListBullet"/>
-      </w:pPr>
-      <w:r>
-        <w:t>atendimento</w:t>
+        <w:t>AUTO-0052 - 保険会社 - Seguradora</w:t>
       </w:r>
     </w:p>
     <w:p>
@@ -4066,7 +4675,7 @@
           <w:color w:val="4F81BD"/>
           <w:sz w:val="28"/>
         </w:rPr>
-        <w:t>Veja também</w:t>
+        <w:t>Referências cruzadas</w:t>
       </w:r>
     </w:p>
     <w:p>
@@ -4074,7 +4683,15 @@
         <w:pStyle w:val="ListBullet"/>
       </w:pPr>
       <w:r>
-        <w:t>02_MasterDictionary/AUTO/AUTO-0052.md</w:t>
+        <w:t>DIALOGUE-AUTO-0017</w:t>
+      </w:r>
+    </w:p>
+    <w:p>
+      <w:pPr>
+        <w:pStyle w:val="ListBullet"/>
+      </w:pPr>
+      <w:r>
+        <w:t>CASE-AUTO-0024</w:t>
       </w:r>
     </w:p>
     <w:p>
@@ -4086,6 +4703,90 @@
           <w:color w:val="4F81BD"/>
           <w:sz w:val="28"/>
         </w:rPr>
+        <w:t>Referências</w:t>
+      </w:r>
+    </w:p>
+    <w:p>
+      <w:pPr>
+        <w:pStyle w:val="ListBullet"/>
+      </w:pPr>
+      <w:r>
+        <w:t>Documento interno: 02_MasterDictionary/AUTO/AUTO-0052.md</w:t>
+      </w:r>
+    </w:p>
+    <w:p>
+      <w:pPr>
+        <w:pStyle w:val="Heading2"/>
+      </w:pPr>
+      <w:r>
+        <w:rPr>
+          <w:color w:val="4F81BD"/>
+          <w:sz w:val="28"/>
+        </w:rPr>
+        <w:t>Tags</w:t>
+      </w:r>
+    </w:p>
+    <w:p>
+      <w:pPr>
+        <w:pStyle w:val="ListBullet"/>
+      </w:pPr>
+      <w:r>
+        <w:t>faq</w:t>
+      </w:r>
+    </w:p>
+    <w:p>
+      <w:pPr>
+        <w:pStyle w:val="ListBullet"/>
+      </w:pPr>
+      <w:r>
+        <w:t>auto</w:t>
+      </w:r>
+    </w:p>
+    <w:p>
+      <w:pPr>
+        <w:pStyle w:val="ListBullet"/>
+      </w:pPr>
+      <w:r>
+        <w:t>sinistro</w:t>
+      </w:r>
+    </w:p>
+    <w:p>
+      <w:pPr>
+        <w:pStyle w:val="ListBullet"/>
+      </w:pPr>
+      <w:r>
+        <w:t>atendimento</w:t>
+      </w:r>
+    </w:p>
+    <w:p>
+      <w:pPr>
+        <w:pStyle w:val="Heading2"/>
+      </w:pPr>
+      <w:r>
+        <w:rPr>
+          <w:color w:val="4F81BD"/>
+          <w:sz w:val="28"/>
+        </w:rPr>
+        <w:t>Veja também</w:t>
+      </w:r>
+    </w:p>
+    <w:p>
+      <w:pPr>
+        <w:pStyle w:val="ListBullet"/>
+      </w:pPr>
+      <w:r>
+        <w:t>02_MasterDictionary/AUTO/AUTO-0052.md</w:t>
+      </w:r>
+    </w:p>
+    <w:p>
+      <w:pPr>
+        <w:pStyle w:val="Heading2"/>
+      </w:pPr>
+      <w:r>
+        <w:rPr>
+          <w:color w:val="4F81BD"/>
+          <w:sz w:val="28"/>
+        </w:rPr>
         <w:t>Histórico de revisão</w:t>
       </w:r>
     </w:p>
@@ -4105,6 +4806,15 @@
           <w:sz w:val="16"/>
         </w:rPr>
         <w:t>| --- | --- | --- | --- |</w:t>
+      </w:r>
+    </w:p>
+    <w:p>
+      <w:r>
+        <w:rPr>
+          <w:rFonts w:ascii="Courier New" w:hAnsi="Courier New"/>
+          <w:sz w:val="16"/>
+        </w:rPr>
+        <w:t>| 2026-06-26 | 0.2 | JP-BR Insurance Knowledge Base | Inclusão de consulta japonesa, próximo passo seguro e limite comercial/compliance. |</w:t>
       </w:r>
     </w:p>
     <w:p>

</xml_diff>

<commit_message>
Normalize AUTO contract and exclusion FAQs
</commit_message>
<xml_diff>
--- a/18_DOCX/AUTO_FAQ_0038_0057.docx
+++ b/18_DOCX/AUTO_FAQ_0038_0057.docx
@@ -4856,7 +4856,7 @@
         <w:pStyle w:val="ListBullet"/>
       </w:pPr>
       <w:r>
-        <w:t>Versão: 0.1</w:t>
+        <w:t>Versão: 0.2</w:t>
       </w:r>
     </w:p>
     <w:p>
@@ -4880,7 +4880,7 @@
         <w:pStyle w:val="ListBullet"/>
       </w:pPr>
       <w:r>
-        <w:t>Histórico: Criação inicial.</w:t>
+        <w:t>Histórico: Criação inicial; reforço NotebookLM e compliance.</w:t>
       </w:r>
     </w:p>
     <w:p>
@@ -4943,6 +4943,34 @@
           <w:color w:val="4F81BD"/>
           <w:sz w:val="28"/>
         </w:rPr>
+        <w:t>Consulta natural em japonês</w:t>
+      </w:r>
+    </w:p>
+    <w:p>
+      <w:pPr>
+        <w:pStyle w:val="ListBullet"/>
+      </w:pPr>
+      <w:r>
+        <w:t>保険代理店の役割をブラジル人のお客様にどう説明しますか。</w:t>
+      </w:r>
+    </w:p>
+    <w:p>
+      <w:pPr>
+        <w:pStyle w:val="ListBullet"/>
+      </w:pPr>
+      <w:r>
+        <w:t>代理店が決められることと保険会社が決めることの違いは何ですか。</w:t>
+      </w:r>
+    </w:p>
+    <w:p>
+      <w:pPr>
+        <w:pStyle w:val="Heading2"/>
+      </w:pPr>
+      <w:r>
+        <w:rPr>
+          <w:color w:val="4F81BD"/>
+          <w:sz w:val="28"/>
+        </w:rPr>
         <w:t>Situação de atendimento</w:t>
       </w:r>
     </w:p>
@@ -4983,6 +5011,40 @@
     <w:p>
       <w:r>
         <w:t>A corretora ajuda a explicar, organizar documentos e fazer contato, mas a decisão de cobertura é da seguradora.</w:t>
+      </w:r>
+    </w:p>
+    <w:p>
+      <w:pPr>
+        <w:pStyle w:val="Heading2"/>
+      </w:pPr>
+      <w:r>
+        <w:rPr>
+          <w:color w:val="4F81BD"/>
+          <w:sz w:val="28"/>
+        </w:rPr>
+        <w:t>Próximo passo seguro</w:t>
+      </w:r>
+    </w:p>
+    <w:p>
+      <w:r>
+        <w:t>Explicar que a corretora orienta, organiza documentos, encaminha solicitações e acompanha o processo, separando isso da decisão formal da seguradora.</w:t>
+      </w:r>
+    </w:p>
+    <w:p>
+      <w:pPr>
+        <w:pStyle w:val="Heading2"/>
+      </w:pPr>
+      <w:r>
+        <w:rPr>
+          <w:color w:val="4F81BD"/>
+          <w:sz w:val="28"/>
+        </w:rPr>
+        <w:t>Limite comercial/compliance</w:t>
+      </w:r>
+    </w:p>
+    <w:p>
+      <w:r>
+        <w:t>A corretora não deve decidir cobertura, aceitação, valor, culpa, prazo ou pagamento. Essas decisões pertencem à seguradora conforme contrato e documentos.</w:t>
       </w:r>
     </w:p>
     <w:p>
@@ -5153,310 +5215,7 @@
           <w:rFonts w:ascii="Courier New" w:hAnsi="Courier New"/>
           <w:sz w:val="16"/>
         </w:rPr>
-        <w:t>| 2026-06-25 | 0.1 | JP-BR Insurance Knowledge Base | Criação inicial. |</w:t>
-      </w:r>
-    </w:p>
-    <w:p/>
-    <w:p>
-      <w:pPr>
-        <w:pStyle w:val="Heading1"/>
-      </w:pPr>
-      <w:r>
-        <w:rPr>
-          <w:color w:val="4F81BD"/>
-          <w:sz w:val="32"/>
-        </w:rPr>
-        <w:t>FAQ-AUTO-0051 - A proposta já garante cobertura?</w:t>
-      </w:r>
-    </w:p>
-    <w:p>
-      <w:pPr>
-        <w:pStyle w:val="Heading2"/>
-      </w:pPr>
-      <w:r>
-        <w:rPr>
-          <w:color w:val="4F81BD"/>
-          <w:sz w:val="28"/>
-        </w:rPr>
-        <w:t>Controle</w:t>
-      </w:r>
-    </w:p>
-    <w:p>
-      <w:pPr>
-        <w:pStyle w:val="ListBullet"/>
-      </w:pPr>
-      <w:r>
-        <w:t>Versão: 0.1</w:t>
-      </w:r>
-    </w:p>
-    <w:p>
-      <w:pPr>
-        <w:pStyle w:val="ListBullet"/>
-      </w:pPr>
-      <w:r>
-        <w:t>Data: 2026-06-25</w:t>
-      </w:r>
-    </w:p>
-    <w:p>
-      <w:pPr>
-        <w:pStyle w:val="ListBullet"/>
-      </w:pPr>
-      <w:r>
-        <w:t>Autor: JP-BR Insurance Knowledge Base</w:t>
-      </w:r>
-    </w:p>
-    <w:p>
-      <w:pPr>
-        <w:pStyle w:val="ListBullet"/>
-      </w:pPr>
-      <w:r>
-        <w:t>Histórico: Criação inicial.</w:t>
-      </w:r>
-    </w:p>
-    <w:p>
-      <w:pPr>
-        <w:pStyle w:val="Heading2"/>
-      </w:pPr>
-      <w:r>
-        <w:rPr>
-          <w:color w:val="4F81BD"/>
-          <w:sz w:val="28"/>
-        </w:rPr>
-        <w:t>Código</w:t>
-      </w:r>
-    </w:p>
-    <w:p>
-      <w:r>
-        <w:t>FAQ-AUTO-0051</w:t>
-      </w:r>
-    </w:p>
-    <w:p>
-      <w:pPr>
-        <w:pStyle w:val="Heading2"/>
-      </w:pPr>
-      <w:r>
-        <w:rPr>
-          <w:color w:val="4F81BD"/>
-          <w:sz w:val="28"/>
-        </w:rPr>
-        <w:t>Categoria</w:t>
-      </w:r>
-    </w:p>
-    <w:p>
-      <w:r>
-        <w:t>AUTO</w:t>
-      </w:r>
-    </w:p>
-    <w:p>
-      <w:pPr>
-        <w:pStyle w:val="Heading2"/>
-      </w:pPr>
-      <w:r>
-        <w:rPr>
-          <w:color w:val="4F81BD"/>
-          <w:sz w:val="28"/>
-        </w:rPr>
-        <w:t>Pergunta</w:t>
-      </w:r>
-    </w:p>
-    <w:p>
-      <w:r>
-        <w:t>A proposta já garante cobertura?</w:t>
-      </w:r>
-    </w:p>
-    <w:p>
-      <w:pPr>
-        <w:pStyle w:val="Heading2"/>
-      </w:pPr>
-      <w:r>
-        <w:rPr>
-          <w:color w:val="4F81BD"/>
-          <w:sz w:val="28"/>
-        </w:rPr>
-        <w:t>Situação de atendimento</w:t>
-      </w:r>
-    </w:p>
-    <w:p>
-      <w:r>
-        <w:t>Cliente precisa entender proposta de contratação no contexto de atendimento de seguro de automóvel.</w:t>
-      </w:r>
-    </w:p>
-    <w:p>
-      <w:pPr>
-        <w:pStyle w:val="Heading2"/>
-      </w:pPr>
-      <w:r>
-        <w:rPr>
-          <w:color w:val="4F81BD"/>
-          <w:sz w:val="28"/>
-        </w:rPr>
-        <w:t>Resposta técnica</w:t>
-      </w:r>
-    </w:p>
-    <w:p>
-      <w:r>
-        <w:t>Documento usado para solicitar a contratação do seguro, contendo dados do cliente, veículo, cobertura e condições desejadas.</w:t>
-      </w:r>
-    </w:p>
-    <w:p>
-      <w:pPr>
-        <w:pStyle w:val="Heading2"/>
-      </w:pPr>
-      <w:r>
-        <w:rPr>
-          <w:color w:val="4F81BD"/>
-          <w:sz w:val="28"/>
-        </w:rPr>
-        <w:t>Como responder ao cliente brasileiro</w:t>
-      </w:r>
-    </w:p>
-    <w:p>
-      <w:r>
-        <w:t>A proposta ainda precisa ser aceita pela seguradora. Por isso, proposta não é sempre a mesma coisa que contrato ativo.</w:t>
-      </w:r>
-    </w:p>
-    <w:p>
-      <w:pPr>
-        <w:pStyle w:val="Heading2"/>
-      </w:pPr>
-      <w:r>
-        <w:rPr>
-          <w:color w:val="4F81BD"/>
-          <w:sz w:val="28"/>
-        </w:rPr>
-        <w:t>Termos relacionados</w:t>
-      </w:r>
-    </w:p>
-    <w:p>
-      <w:pPr>
-        <w:pStyle w:val="ListBullet"/>
-      </w:pPr>
-      <w:r>
-        <w:t>AUTO-0054 - 契約申込書 - Proposta de contratação</w:t>
-      </w:r>
-    </w:p>
-    <w:p>
-      <w:pPr>
-        <w:pStyle w:val="Heading2"/>
-      </w:pPr>
-      <w:r>
-        <w:rPr>
-          <w:color w:val="4F81BD"/>
-          <w:sz w:val="28"/>
-        </w:rPr>
-        <w:t>Referências cruzadas</w:t>
-      </w:r>
-    </w:p>
-    <w:p>
-      <w:pPr>
-        <w:pStyle w:val="ListBullet"/>
-      </w:pPr>
-      <w:r>
-        <w:t>DIALOGUE-AUTO-0018</w:t>
-      </w:r>
-    </w:p>
-    <w:p>
-      <w:pPr>
-        <w:pStyle w:val="ListBullet"/>
-      </w:pPr>
-      <w:r>
-        <w:t>CASE-AUTO-0025</w:t>
-      </w:r>
-    </w:p>
-    <w:p>
-      <w:pPr>
-        <w:pStyle w:val="Heading2"/>
-      </w:pPr>
-      <w:r>
-        <w:rPr>
-          <w:color w:val="4F81BD"/>
-          <w:sz w:val="28"/>
-        </w:rPr>
-        <w:t>Referências</w:t>
-      </w:r>
-    </w:p>
-    <w:p>
-      <w:pPr>
-        <w:pStyle w:val="ListBullet"/>
-      </w:pPr>
-      <w:r>
-        <w:t>Documento interno: 02_MasterDictionary/AUTO/AUTO-0054.md</w:t>
-      </w:r>
-    </w:p>
-    <w:p>
-      <w:pPr>
-        <w:pStyle w:val="Heading2"/>
-      </w:pPr>
-      <w:r>
-        <w:rPr>
-          <w:color w:val="4F81BD"/>
-          <w:sz w:val="28"/>
-        </w:rPr>
-        <w:t>Tags</w:t>
-      </w:r>
-    </w:p>
-    <w:p>
-      <w:pPr>
-        <w:pStyle w:val="ListBullet"/>
-      </w:pPr>
-      <w:r>
-        <w:t>faq</w:t>
-      </w:r>
-    </w:p>
-    <w:p>
-      <w:pPr>
-        <w:pStyle w:val="ListBullet"/>
-      </w:pPr>
-      <w:r>
-        <w:t>auto</w:t>
-      </w:r>
-    </w:p>
-    <w:p>
-      <w:pPr>
-        <w:pStyle w:val="ListBullet"/>
-      </w:pPr>
-      <w:r>
-        <w:t>sinistro</w:t>
-      </w:r>
-    </w:p>
-    <w:p>
-      <w:pPr>
-        <w:pStyle w:val="ListBullet"/>
-      </w:pPr>
-      <w:r>
-        <w:t>atendimento</w:t>
-      </w:r>
-    </w:p>
-    <w:p>
-      <w:pPr>
-        <w:pStyle w:val="Heading2"/>
-      </w:pPr>
-      <w:r>
-        <w:rPr>
-          <w:color w:val="4F81BD"/>
-          <w:sz w:val="28"/>
-        </w:rPr>
-        <w:t>Veja também</w:t>
-      </w:r>
-    </w:p>
-    <w:p>
-      <w:pPr>
-        <w:pStyle w:val="ListBullet"/>
-      </w:pPr>
-      <w:r>
-        <w:t>02_MasterDictionary/AUTO/AUTO-0054.md</w:t>
-      </w:r>
-    </w:p>
-    <w:p>
-      <w:pPr>
-        <w:pStyle w:val="Heading2"/>
-      </w:pPr>
-      <w:r>
-        <w:rPr>
-          <w:color w:val="4F81BD"/>
-          <w:sz w:val="28"/>
-        </w:rPr>
-        <w:t>Histórico de revisão</w:t>
+        <w:t>| 2026-06-26 | 0.2 | JP-BR Insurance Knowledge Base | Inclusão de consulta japonesa, próximo passo seguro e limite comercial/compliance. |</w:t>
       </w:r>
     </w:p>
     <w:p>
@@ -5465,7 +5224,372 @@
           <w:rFonts w:ascii="Courier New" w:hAnsi="Courier New"/>
           <w:sz w:val="16"/>
         </w:rPr>
-        <w:t>| Data | Versão | Autor | Alteração |</w:t>
+        <w:t>| 2026-06-25 | 0.1 | JP-BR Insurance Knowledge Base | Criação inicial. |</w:t>
+      </w:r>
+    </w:p>
+    <w:p/>
+    <w:p>
+      <w:pPr>
+        <w:pStyle w:val="Heading1"/>
+      </w:pPr>
+      <w:r>
+        <w:rPr>
+          <w:color w:val="4F81BD"/>
+          <w:sz w:val="32"/>
+        </w:rPr>
+        <w:t>FAQ-AUTO-0051 - A proposta já garante cobertura?</w:t>
+      </w:r>
+    </w:p>
+    <w:p>
+      <w:pPr>
+        <w:pStyle w:val="Heading2"/>
+      </w:pPr>
+      <w:r>
+        <w:rPr>
+          <w:color w:val="4F81BD"/>
+          <w:sz w:val="28"/>
+        </w:rPr>
+        <w:t>Controle</w:t>
+      </w:r>
+    </w:p>
+    <w:p>
+      <w:pPr>
+        <w:pStyle w:val="ListBullet"/>
+      </w:pPr>
+      <w:r>
+        <w:t>Versão: 0.2</w:t>
+      </w:r>
+    </w:p>
+    <w:p>
+      <w:pPr>
+        <w:pStyle w:val="ListBullet"/>
+      </w:pPr>
+      <w:r>
+        <w:t>Data: 2026-06-25</w:t>
+      </w:r>
+    </w:p>
+    <w:p>
+      <w:pPr>
+        <w:pStyle w:val="ListBullet"/>
+      </w:pPr>
+      <w:r>
+        <w:t>Autor: JP-BR Insurance Knowledge Base</w:t>
+      </w:r>
+    </w:p>
+    <w:p>
+      <w:pPr>
+        <w:pStyle w:val="ListBullet"/>
+      </w:pPr>
+      <w:r>
+        <w:t>Histórico: Criação inicial; reforço NotebookLM e compliance.</w:t>
+      </w:r>
+    </w:p>
+    <w:p>
+      <w:pPr>
+        <w:pStyle w:val="Heading2"/>
+      </w:pPr>
+      <w:r>
+        <w:rPr>
+          <w:color w:val="4F81BD"/>
+          <w:sz w:val="28"/>
+        </w:rPr>
+        <w:t>Código</w:t>
+      </w:r>
+    </w:p>
+    <w:p>
+      <w:r>
+        <w:t>FAQ-AUTO-0051</w:t>
+      </w:r>
+    </w:p>
+    <w:p>
+      <w:pPr>
+        <w:pStyle w:val="Heading2"/>
+      </w:pPr>
+      <w:r>
+        <w:rPr>
+          <w:color w:val="4F81BD"/>
+          <w:sz w:val="28"/>
+        </w:rPr>
+        <w:t>Categoria</w:t>
+      </w:r>
+    </w:p>
+    <w:p>
+      <w:r>
+        <w:t>AUTO</w:t>
+      </w:r>
+    </w:p>
+    <w:p>
+      <w:pPr>
+        <w:pStyle w:val="Heading2"/>
+      </w:pPr>
+      <w:r>
+        <w:rPr>
+          <w:color w:val="4F81BD"/>
+          <w:sz w:val="28"/>
+        </w:rPr>
+        <w:t>Pergunta</w:t>
+      </w:r>
+    </w:p>
+    <w:p>
+      <w:r>
+        <w:t>A proposta já garante cobertura?</w:t>
+      </w:r>
+    </w:p>
+    <w:p>
+      <w:pPr>
+        <w:pStyle w:val="Heading2"/>
+      </w:pPr>
+      <w:r>
+        <w:rPr>
+          <w:color w:val="4F81BD"/>
+          <w:sz w:val="28"/>
+        </w:rPr>
+        <w:t>Consulta natural em japonês</w:t>
+      </w:r>
+    </w:p>
+    <w:p>
+      <w:pPr>
+        <w:pStyle w:val="ListBullet"/>
+      </w:pPr>
+      <w:r>
+        <w:t>契約申込書を出したら補償は始まりますか。</w:t>
+      </w:r>
+    </w:p>
+    <w:p>
+      <w:pPr>
+        <w:pStyle w:val="ListBullet"/>
+      </w:pPr>
+      <w:r>
+        <w:t>自動車保険の申込書と契約成立の違いをどう説明しますか。</w:t>
+      </w:r>
+    </w:p>
+    <w:p>
+      <w:pPr>
+        <w:pStyle w:val="Heading2"/>
+      </w:pPr>
+      <w:r>
+        <w:rPr>
+          <w:color w:val="4F81BD"/>
+          <w:sz w:val="28"/>
+        </w:rPr>
+        <w:t>Situação de atendimento</w:t>
+      </w:r>
+    </w:p>
+    <w:p>
+      <w:r>
+        <w:t>Cliente precisa entender proposta de contratação no contexto de atendimento de seguro de automóvel.</w:t>
+      </w:r>
+    </w:p>
+    <w:p>
+      <w:pPr>
+        <w:pStyle w:val="Heading2"/>
+      </w:pPr>
+      <w:r>
+        <w:rPr>
+          <w:color w:val="4F81BD"/>
+          <w:sz w:val="28"/>
+        </w:rPr>
+        <w:t>Resposta técnica</w:t>
+      </w:r>
+    </w:p>
+    <w:p>
+      <w:r>
+        <w:t>Documento usado para solicitar a contratação do seguro, contendo dados do cliente, veículo, cobertura e condições desejadas.</w:t>
+      </w:r>
+    </w:p>
+    <w:p>
+      <w:pPr>
+        <w:pStyle w:val="Heading2"/>
+      </w:pPr>
+      <w:r>
+        <w:rPr>
+          <w:color w:val="4F81BD"/>
+          <w:sz w:val="28"/>
+        </w:rPr>
+        <w:t>Como responder ao cliente brasileiro</w:t>
+      </w:r>
+    </w:p>
+    <w:p>
+      <w:r>
+        <w:t>A proposta ainda precisa ser aceita pela seguradora. Por isso, proposta não é sempre a mesma coisa que contrato ativo.</w:t>
+      </w:r>
+    </w:p>
+    <w:p>
+      <w:pPr>
+        <w:pStyle w:val="Heading2"/>
+      </w:pPr>
+      <w:r>
+        <w:rPr>
+          <w:color w:val="4F81BD"/>
+          <w:sz w:val="28"/>
+        </w:rPr>
+        <w:t>Próximo passo seguro</w:t>
+      </w:r>
+    </w:p>
+    <w:p>
+      <w:r>
+        <w:t>Confirmar se a proposta foi aceita, se há data de início definida, pagamento exigido e documento de confirmação da seguradora antes de informar cobertura.</w:t>
+      </w:r>
+    </w:p>
+    <w:p>
+      <w:pPr>
+        <w:pStyle w:val="Heading2"/>
+      </w:pPr>
+      <w:r>
+        <w:rPr>
+          <w:color w:val="4F81BD"/>
+          <w:sz w:val="28"/>
+        </w:rPr>
+        <w:t>Limite comercial/compliance</w:t>
+      </w:r>
+    </w:p>
+    <w:p>
+      <w:r>
+        <w:t>O corretor não deve dizer que a proposta garante cobertura automática. Aceitação, vigência e cobertura dependem da confirmação formal da seguradora e das condições do contrato.</w:t>
+      </w:r>
+    </w:p>
+    <w:p>
+      <w:pPr>
+        <w:pStyle w:val="Heading2"/>
+      </w:pPr>
+      <w:r>
+        <w:rPr>
+          <w:color w:val="4F81BD"/>
+          <w:sz w:val="28"/>
+        </w:rPr>
+        <w:t>Termos relacionados</w:t>
+      </w:r>
+    </w:p>
+    <w:p>
+      <w:pPr>
+        <w:pStyle w:val="ListBullet"/>
+      </w:pPr>
+      <w:r>
+        <w:t>AUTO-0054 - 契約申込書 - Proposta de contratação</w:t>
+      </w:r>
+    </w:p>
+    <w:p>
+      <w:pPr>
+        <w:pStyle w:val="Heading2"/>
+      </w:pPr>
+      <w:r>
+        <w:rPr>
+          <w:color w:val="4F81BD"/>
+          <w:sz w:val="28"/>
+        </w:rPr>
+        <w:t>Referências cruzadas</w:t>
+      </w:r>
+    </w:p>
+    <w:p>
+      <w:pPr>
+        <w:pStyle w:val="ListBullet"/>
+      </w:pPr>
+      <w:r>
+        <w:t>DIALOGUE-AUTO-0018</w:t>
+      </w:r>
+    </w:p>
+    <w:p>
+      <w:pPr>
+        <w:pStyle w:val="ListBullet"/>
+      </w:pPr>
+      <w:r>
+        <w:t>CASE-AUTO-0025</w:t>
+      </w:r>
+    </w:p>
+    <w:p>
+      <w:pPr>
+        <w:pStyle w:val="Heading2"/>
+      </w:pPr>
+      <w:r>
+        <w:rPr>
+          <w:color w:val="4F81BD"/>
+          <w:sz w:val="28"/>
+        </w:rPr>
+        <w:t>Referências</w:t>
+      </w:r>
+    </w:p>
+    <w:p>
+      <w:pPr>
+        <w:pStyle w:val="ListBullet"/>
+      </w:pPr>
+      <w:r>
+        <w:t>Documento interno: 02_MasterDictionary/AUTO/AUTO-0054.md</w:t>
+      </w:r>
+    </w:p>
+    <w:p>
+      <w:pPr>
+        <w:pStyle w:val="Heading2"/>
+      </w:pPr>
+      <w:r>
+        <w:rPr>
+          <w:color w:val="4F81BD"/>
+          <w:sz w:val="28"/>
+        </w:rPr>
+        <w:t>Tags</w:t>
+      </w:r>
+    </w:p>
+    <w:p>
+      <w:pPr>
+        <w:pStyle w:val="ListBullet"/>
+      </w:pPr>
+      <w:r>
+        <w:t>faq</w:t>
+      </w:r>
+    </w:p>
+    <w:p>
+      <w:pPr>
+        <w:pStyle w:val="ListBullet"/>
+      </w:pPr>
+      <w:r>
+        <w:t>auto</w:t>
+      </w:r>
+    </w:p>
+    <w:p>
+      <w:pPr>
+        <w:pStyle w:val="ListBullet"/>
+      </w:pPr>
+      <w:r>
+        <w:t>sinistro</w:t>
+      </w:r>
+    </w:p>
+    <w:p>
+      <w:pPr>
+        <w:pStyle w:val="ListBullet"/>
+      </w:pPr>
+      <w:r>
+        <w:t>atendimento</w:t>
+      </w:r>
+    </w:p>
+    <w:p>
+      <w:pPr>
+        <w:pStyle w:val="Heading2"/>
+      </w:pPr>
+      <w:r>
+        <w:rPr>
+          <w:color w:val="4F81BD"/>
+          <w:sz w:val="28"/>
+        </w:rPr>
+        <w:t>Veja também</w:t>
+      </w:r>
+    </w:p>
+    <w:p>
+      <w:pPr>
+        <w:pStyle w:val="ListBullet"/>
+      </w:pPr>
+      <w:r>
+        <w:t>02_MasterDictionary/AUTO/AUTO-0054.md</w:t>
+      </w:r>
+    </w:p>
+    <w:p>
+      <w:pPr>
+        <w:pStyle w:val="Heading2"/>
+      </w:pPr>
+      <w:r>
+        <w:rPr>
+          <w:color w:val="4F81BD"/>
+          <w:sz w:val="28"/>
+        </w:rPr>
+        <w:t>Histórico de revisão</w:t>
       </w:r>
     </w:p>
     <w:p>
@@ -5474,7 +5598,7 @@
           <w:rFonts w:ascii="Courier New" w:hAnsi="Courier New"/>
           <w:sz w:val="16"/>
         </w:rPr>
-        <w:t>| --- | --- | --- | --- |</w:t>
+        <w:t>| Data | Versão | Autor | Alteração |</w:t>
       </w:r>
     </w:p>
     <w:p>
@@ -5483,310 +5607,7 @@
           <w:rFonts w:ascii="Courier New" w:hAnsi="Courier New"/>
           <w:sz w:val="16"/>
         </w:rPr>
-        <w:t>| 2026-06-25 | 0.1 | JP-BR Insurance Knowledge Base | Criação inicial. |</w:t>
-      </w:r>
-    </w:p>
-    <w:p/>
-    <w:p>
-      <w:pPr>
-        <w:pStyle w:val="Heading1"/>
-      </w:pPr>
-      <w:r>
-        <w:rPr>
-          <w:color w:val="4F81BD"/>
-          <w:sz w:val="32"/>
-        </w:rPr>
-        <w:t>FAQ-AUTO-0052 - Por que preciso declarar tudo corretamente?</w:t>
-      </w:r>
-    </w:p>
-    <w:p>
-      <w:pPr>
-        <w:pStyle w:val="Heading2"/>
-      </w:pPr>
-      <w:r>
-        <w:rPr>
-          <w:color w:val="4F81BD"/>
-          <w:sz w:val="28"/>
-        </w:rPr>
-        <w:t>Controle</w:t>
-      </w:r>
-    </w:p>
-    <w:p>
-      <w:pPr>
-        <w:pStyle w:val="ListBullet"/>
-      </w:pPr>
-      <w:r>
-        <w:t>Versão: 0.1</w:t>
-      </w:r>
-    </w:p>
-    <w:p>
-      <w:pPr>
-        <w:pStyle w:val="ListBullet"/>
-      </w:pPr>
-      <w:r>
-        <w:t>Data: 2026-06-25</w:t>
-      </w:r>
-    </w:p>
-    <w:p>
-      <w:pPr>
-        <w:pStyle w:val="ListBullet"/>
-      </w:pPr>
-      <w:r>
-        <w:t>Autor: JP-BR Insurance Knowledge Base</w:t>
-      </w:r>
-    </w:p>
-    <w:p>
-      <w:pPr>
-        <w:pStyle w:val="ListBullet"/>
-      </w:pPr>
-      <w:r>
-        <w:t>Histórico: Criação inicial.</w:t>
-      </w:r>
-    </w:p>
-    <w:p>
-      <w:pPr>
-        <w:pStyle w:val="Heading2"/>
-      </w:pPr>
-      <w:r>
-        <w:rPr>
-          <w:color w:val="4F81BD"/>
-          <w:sz w:val="28"/>
-        </w:rPr>
-        <w:t>Código</w:t>
-      </w:r>
-    </w:p>
-    <w:p>
-      <w:r>
-        <w:t>FAQ-AUTO-0052</w:t>
-      </w:r>
-    </w:p>
-    <w:p>
-      <w:pPr>
-        <w:pStyle w:val="Heading2"/>
-      </w:pPr>
-      <w:r>
-        <w:rPr>
-          <w:color w:val="4F81BD"/>
-          <w:sz w:val="28"/>
-        </w:rPr>
-        <w:t>Categoria</w:t>
-      </w:r>
-    </w:p>
-    <w:p>
-      <w:r>
-        <w:t>AUTO</w:t>
-      </w:r>
-    </w:p>
-    <w:p>
-      <w:pPr>
-        <w:pStyle w:val="Heading2"/>
-      </w:pPr>
-      <w:r>
-        <w:rPr>
-          <w:color w:val="4F81BD"/>
-          <w:sz w:val="28"/>
-        </w:rPr>
-        <w:t>Pergunta</w:t>
-      </w:r>
-    </w:p>
-    <w:p>
-      <w:r>
-        <w:t>Por que preciso declarar tudo corretamente?</w:t>
-      </w:r>
-    </w:p>
-    <w:p>
-      <w:pPr>
-        <w:pStyle w:val="Heading2"/>
-      </w:pPr>
-      <w:r>
-        <w:rPr>
-          <w:color w:val="4F81BD"/>
-          <w:sz w:val="28"/>
-        </w:rPr>
-        <w:t>Situação de atendimento</w:t>
-      </w:r>
-    </w:p>
-    <w:p>
-      <w:r>
-        <w:t>Cliente precisa entender informações declaradas na contratação no contexto de atendimento de seguro de automóvel.</w:t>
-      </w:r>
-    </w:p>
-    <w:p>
-      <w:pPr>
-        <w:pStyle w:val="Heading2"/>
-      </w:pPr>
-      <w:r>
-        <w:rPr>
-          <w:color w:val="4F81BD"/>
-          <w:sz w:val="28"/>
-        </w:rPr>
-        <w:t>Resposta técnica</w:t>
-      </w:r>
-    </w:p>
-    <w:p>
-      <w:r>
-        <w:t>Informações que o cliente deve declarar corretamente ao contratar o seguro, conforme perguntas e exigências da seguradora.</w:t>
-      </w:r>
-    </w:p>
-    <w:p>
-      <w:pPr>
-        <w:pStyle w:val="Heading2"/>
-      </w:pPr>
-      <w:r>
-        <w:rPr>
-          <w:color w:val="4F81BD"/>
-          <w:sz w:val="28"/>
-        </w:rPr>
-        <w:t>Como responder ao cliente brasileiro</w:t>
-      </w:r>
-    </w:p>
-    <w:p>
-      <w:r>
-        <w:t>Se uma informação importante for omitida ou estiver errada, isso pode causar problema no contrato ou em um sinistro.</w:t>
-      </w:r>
-    </w:p>
-    <w:p>
-      <w:pPr>
-        <w:pStyle w:val="Heading2"/>
-      </w:pPr>
-      <w:r>
-        <w:rPr>
-          <w:color w:val="4F81BD"/>
-          <w:sz w:val="28"/>
-        </w:rPr>
-        <w:t>Termos relacionados</w:t>
-      </w:r>
-    </w:p>
-    <w:p>
-      <w:pPr>
-        <w:pStyle w:val="ListBullet"/>
-      </w:pPr>
-      <w:r>
-        <w:t>AUTO-0055 - 告知事項 - Informações declaradas na contratação</w:t>
-      </w:r>
-    </w:p>
-    <w:p>
-      <w:pPr>
-        <w:pStyle w:val="Heading2"/>
-      </w:pPr>
-      <w:r>
-        <w:rPr>
-          <w:color w:val="4F81BD"/>
-          <w:sz w:val="28"/>
-        </w:rPr>
-        <w:t>Referências cruzadas</w:t>
-      </w:r>
-    </w:p>
-    <w:p>
-      <w:pPr>
-        <w:pStyle w:val="ListBullet"/>
-      </w:pPr>
-      <w:r>
-        <w:t>DIALOGUE-AUTO-0018</w:t>
-      </w:r>
-    </w:p>
-    <w:p>
-      <w:pPr>
-        <w:pStyle w:val="ListBullet"/>
-      </w:pPr>
-      <w:r>
-        <w:t>CASE-AUTO-0025</w:t>
-      </w:r>
-    </w:p>
-    <w:p>
-      <w:pPr>
-        <w:pStyle w:val="Heading2"/>
-      </w:pPr>
-      <w:r>
-        <w:rPr>
-          <w:color w:val="4F81BD"/>
-          <w:sz w:val="28"/>
-        </w:rPr>
-        <w:t>Referências</w:t>
-      </w:r>
-    </w:p>
-    <w:p>
-      <w:pPr>
-        <w:pStyle w:val="ListBullet"/>
-      </w:pPr>
-      <w:r>
-        <w:t>Documento interno: 02_MasterDictionary/AUTO/AUTO-0055.md</w:t>
-      </w:r>
-    </w:p>
-    <w:p>
-      <w:pPr>
-        <w:pStyle w:val="Heading2"/>
-      </w:pPr>
-      <w:r>
-        <w:rPr>
-          <w:color w:val="4F81BD"/>
-          <w:sz w:val="28"/>
-        </w:rPr>
-        <w:t>Tags</w:t>
-      </w:r>
-    </w:p>
-    <w:p>
-      <w:pPr>
-        <w:pStyle w:val="ListBullet"/>
-      </w:pPr>
-      <w:r>
-        <w:t>faq</w:t>
-      </w:r>
-    </w:p>
-    <w:p>
-      <w:pPr>
-        <w:pStyle w:val="ListBullet"/>
-      </w:pPr>
-      <w:r>
-        <w:t>auto</w:t>
-      </w:r>
-    </w:p>
-    <w:p>
-      <w:pPr>
-        <w:pStyle w:val="ListBullet"/>
-      </w:pPr>
-      <w:r>
-        <w:t>sinistro</w:t>
-      </w:r>
-    </w:p>
-    <w:p>
-      <w:pPr>
-        <w:pStyle w:val="ListBullet"/>
-      </w:pPr>
-      <w:r>
-        <w:t>atendimento</w:t>
-      </w:r>
-    </w:p>
-    <w:p>
-      <w:pPr>
-        <w:pStyle w:val="Heading2"/>
-      </w:pPr>
-      <w:r>
-        <w:rPr>
-          <w:color w:val="4F81BD"/>
-          <w:sz w:val="28"/>
-        </w:rPr>
-        <w:t>Veja também</w:t>
-      </w:r>
-    </w:p>
-    <w:p>
-      <w:pPr>
-        <w:pStyle w:val="ListBullet"/>
-      </w:pPr>
-      <w:r>
-        <w:t>02_MasterDictionary/AUTO/AUTO-0055.md</w:t>
-      </w:r>
-    </w:p>
-    <w:p>
-      <w:pPr>
-        <w:pStyle w:val="Heading2"/>
-      </w:pPr>
-      <w:r>
-        <w:rPr>
-          <w:color w:val="4F81BD"/>
-          <w:sz w:val="28"/>
-        </w:rPr>
-        <w:t>Histórico de revisão</w:t>
+        <w:t>| --- | --- | --- | --- |</w:t>
       </w:r>
     </w:p>
     <w:p>
@@ -5795,7 +5616,7 @@
           <w:rFonts w:ascii="Courier New" w:hAnsi="Courier New"/>
           <w:sz w:val="16"/>
         </w:rPr>
-        <w:t>| Data | Versão | Autor | Alteração |</w:t>
+        <w:t>| 2026-06-26 | 0.2 | JP-BR Insurance Knowledge Base | Inclusão de consulta japonesa, próximo passo seguro e limite comercial/compliance. |</w:t>
       </w:r>
     </w:p>
     <w:p>
@@ -5804,7 +5625,372 @@
           <w:rFonts w:ascii="Courier New" w:hAnsi="Courier New"/>
           <w:sz w:val="16"/>
         </w:rPr>
-        <w:t>| --- | --- | --- | --- |</w:t>
+        <w:t>| 2026-06-25 | 0.1 | JP-BR Insurance Knowledge Base | Criação inicial. |</w:t>
+      </w:r>
+    </w:p>
+    <w:p/>
+    <w:p>
+      <w:pPr>
+        <w:pStyle w:val="Heading1"/>
+      </w:pPr>
+      <w:r>
+        <w:rPr>
+          <w:color w:val="4F81BD"/>
+          <w:sz w:val="32"/>
+        </w:rPr>
+        <w:t>FAQ-AUTO-0052 - Por que preciso declarar tudo corretamente?</w:t>
+      </w:r>
+    </w:p>
+    <w:p>
+      <w:pPr>
+        <w:pStyle w:val="Heading2"/>
+      </w:pPr>
+      <w:r>
+        <w:rPr>
+          <w:color w:val="4F81BD"/>
+          <w:sz w:val="28"/>
+        </w:rPr>
+        <w:t>Controle</w:t>
+      </w:r>
+    </w:p>
+    <w:p>
+      <w:pPr>
+        <w:pStyle w:val="ListBullet"/>
+      </w:pPr>
+      <w:r>
+        <w:t>Versão: 0.2</w:t>
+      </w:r>
+    </w:p>
+    <w:p>
+      <w:pPr>
+        <w:pStyle w:val="ListBullet"/>
+      </w:pPr>
+      <w:r>
+        <w:t>Data: 2026-06-25</w:t>
+      </w:r>
+    </w:p>
+    <w:p>
+      <w:pPr>
+        <w:pStyle w:val="ListBullet"/>
+      </w:pPr>
+      <w:r>
+        <w:t>Autor: JP-BR Insurance Knowledge Base</w:t>
+      </w:r>
+    </w:p>
+    <w:p>
+      <w:pPr>
+        <w:pStyle w:val="ListBullet"/>
+      </w:pPr>
+      <w:r>
+        <w:t>Histórico: Criação inicial; reforço NotebookLM e compliance.</w:t>
+      </w:r>
+    </w:p>
+    <w:p>
+      <w:pPr>
+        <w:pStyle w:val="Heading2"/>
+      </w:pPr>
+      <w:r>
+        <w:rPr>
+          <w:color w:val="4F81BD"/>
+          <w:sz w:val="28"/>
+        </w:rPr>
+        <w:t>Código</w:t>
+      </w:r>
+    </w:p>
+    <w:p>
+      <w:r>
+        <w:t>FAQ-AUTO-0052</w:t>
+      </w:r>
+    </w:p>
+    <w:p>
+      <w:pPr>
+        <w:pStyle w:val="Heading2"/>
+      </w:pPr>
+      <w:r>
+        <w:rPr>
+          <w:color w:val="4F81BD"/>
+          <w:sz w:val="28"/>
+        </w:rPr>
+        <w:t>Categoria</w:t>
+      </w:r>
+    </w:p>
+    <w:p>
+      <w:r>
+        <w:t>AUTO</w:t>
+      </w:r>
+    </w:p>
+    <w:p>
+      <w:pPr>
+        <w:pStyle w:val="Heading2"/>
+      </w:pPr>
+      <w:r>
+        <w:rPr>
+          <w:color w:val="4F81BD"/>
+          <w:sz w:val="28"/>
+        </w:rPr>
+        <w:t>Pergunta</w:t>
+      </w:r>
+    </w:p>
+    <w:p>
+      <w:r>
+        <w:t>Por que preciso declarar tudo corretamente?</w:t>
+      </w:r>
+    </w:p>
+    <w:p>
+      <w:pPr>
+        <w:pStyle w:val="Heading2"/>
+      </w:pPr>
+      <w:r>
+        <w:rPr>
+          <w:color w:val="4F81BD"/>
+          <w:sz w:val="28"/>
+        </w:rPr>
+        <w:t>Consulta natural em japonês</w:t>
+      </w:r>
+    </w:p>
+    <w:p>
+      <w:pPr>
+        <w:pStyle w:val="ListBullet"/>
+      </w:pPr>
+      <w:r>
+        <w:t>告知事項を正しく申告しないとどうなりますか。</w:t>
+      </w:r>
+    </w:p>
+    <w:p>
+      <w:pPr>
+        <w:pStyle w:val="ListBullet"/>
+      </w:pPr>
+      <w:r>
+        <w:t>自動車保険の申告事項をブラジル人のお客様にどう説明しますか。</w:t>
+      </w:r>
+    </w:p>
+    <w:p>
+      <w:pPr>
+        <w:pStyle w:val="Heading2"/>
+      </w:pPr>
+      <w:r>
+        <w:rPr>
+          <w:color w:val="4F81BD"/>
+          <w:sz w:val="28"/>
+        </w:rPr>
+        <w:t>Situação de atendimento</w:t>
+      </w:r>
+    </w:p>
+    <w:p>
+      <w:r>
+        <w:t>Cliente precisa entender informações declaradas na contratação no contexto de atendimento de seguro de automóvel.</w:t>
+      </w:r>
+    </w:p>
+    <w:p>
+      <w:pPr>
+        <w:pStyle w:val="Heading2"/>
+      </w:pPr>
+      <w:r>
+        <w:rPr>
+          <w:color w:val="4F81BD"/>
+          <w:sz w:val="28"/>
+        </w:rPr>
+        <w:t>Resposta técnica</w:t>
+      </w:r>
+    </w:p>
+    <w:p>
+      <w:r>
+        <w:t>Informações que o cliente deve declarar corretamente ao contratar o seguro, conforme perguntas e exigências da seguradora.</w:t>
+      </w:r>
+    </w:p>
+    <w:p>
+      <w:pPr>
+        <w:pStyle w:val="Heading2"/>
+      </w:pPr>
+      <w:r>
+        <w:rPr>
+          <w:color w:val="4F81BD"/>
+          <w:sz w:val="28"/>
+        </w:rPr>
+        <w:t>Como responder ao cliente brasileiro</w:t>
+      </w:r>
+    </w:p>
+    <w:p>
+      <w:r>
+        <w:t>Se uma informação importante for omitida ou estiver errada, isso pode causar problema no contrato ou em um sinistro.</w:t>
+      </w:r>
+    </w:p>
+    <w:p>
+      <w:pPr>
+        <w:pStyle w:val="Heading2"/>
+      </w:pPr>
+      <w:r>
+        <w:rPr>
+          <w:color w:val="4F81BD"/>
+          <w:sz w:val="28"/>
+        </w:rPr>
+        <w:t>Próximo passo seguro</w:t>
+      </w:r>
+    </w:p>
+    <w:p>
+      <w:r>
+        <w:t>Orientar o cliente a responder corretamente sobre veículo, condutores, uso, endereço e demais informações pedidas, corrigindo dúvidas antes da contratação.</w:t>
+      </w:r>
+    </w:p>
+    <w:p>
+      <w:pPr>
+        <w:pStyle w:val="Heading2"/>
+      </w:pPr>
+      <w:r>
+        <w:rPr>
+          <w:color w:val="4F81BD"/>
+          <w:sz w:val="28"/>
+        </w:rPr>
+        <w:t>Limite comercial/compliance</w:t>
+      </w:r>
+    </w:p>
+    <w:p>
+      <w:r>
+        <w:t>O corretor não deve sugerir omissão nem minimizar informação relevante. Informação incorreta pode afetar aceitação, prêmio, continuidade ou pagamento de sinistro.</w:t>
+      </w:r>
+    </w:p>
+    <w:p>
+      <w:pPr>
+        <w:pStyle w:val="Heading2"/>
+      </w:pPr>
+      <w:r>
+        <w:rPr>
+          <w:color w:val="4F81BD"/>
+          <w:sz w:val="28"/>
+        </w:rPr>
+        <w:t>Termos relacionados</w:t>
+      </w:r>
+    </w:p>
+    <w:p>
+      <w:pPr>
+        <w:pStyle w:val="ListBullet"/>
+      </w:pPr>
+      <w:r>
+        <w:t>AUTO-0055 - 告知事項 - Informações declaradas na contratação</w:t>
+      </w:r>
+    </w:p>
+    <w:p>
+      <w:pPr>
+        <w:pStyle w:val="Heading2"/>
+      </w:pPr>
+      <w:r>
+        <w:rPr>
+          <w:color w:val="4F81BD"/>
+          <w:sz w:val="28"/>
+        </w:rPr>
+        <w:t>Referências cruzadas</w:t>
+      </w:r>
+    </w:p>
+    <w:p>
+      <w:pPr>
+        <w:pStyle w:val="ListBullet"/>
+      </w:pPr>
+      <w:r>
+        <w:t>DIALOGUE-AUTO-0018</w:t>
+      </w:r>
+    </w:p>
+    <w:p>
+      <w:pPr>
+        <w:pStyle w:val="ListBullet"/>
+      </w:pPr>
+      <w:r>
+        <w:t>CASE-AUTO-0025</w:t>
+      </w:r>
+    </w:p>
+    <w:p>
+      <w:pPr>
+        <w:pStyle w:val="Heading2"/>
+      </w:pPr>
+      <w:r>
+        <w:rPr>
+          <w:color w:val="4F81BD"/>
+          <w:sz w:val="28"/>
+        </w:rPr>
+        <w:t>Referências</w:t>
+      </w:r>
+    </w:p>
+    <w:p>
+      <w:pPr>
+        <w:pStyle w:val="ListBullet"/>
+      </w:pPr>
+      <w:r>
+        <w:t>Documento interno: 02_MasterDictionary/AUTO/AUTO-0055.md</w:t>
+      </w:r>
+    </w:p>
+    <w:p>
+      <w:pPr>
+        <w:pStyle w:val="Heading2"/>
+      </w:pPr>
+      <w:r>
+        <w:rPr>
+          <w:color w:val="4F81BD"/>
+          <w:sz w:val="28"/>
+        </w:rPr>
+        <w:t>Tags</w:t>
+      </w:r>
+    </w:p>
+    <w:p>
+      <w:pPr>
+        <w:pStyle w:val="ListBullet"/>
+      </w:pPr>
+      <w:r>
+        <w:t>faq</w:t>
+      </w:r>
+    </w:p>
+    <w:p>
+      <w:pPr>
+        <w:pStyle w:val="ListBullet"/>
+      </w:pPr>
+      <w:r>
+        <w:t>auto</w:t>
+      </w:r>
+    </w:p>
+    <w:p>
+      <w:pPr>
+        <w:pStyle w:val="ListBullet"/>
+      </w:pPr>
+      <w:r>
+        <w:t>sinistro</w:t>
+      </w:r>
+    </w:p>
+    <w:p>
+      <w:pPr>
+        <w:pStyle w:val="ListBullet"/>
+      </w:pPr>
+      <w:r>
+        <w:t>atendimento</w:t>
+      </w:r>
+    </w:p>
+    <w:p>
+      <w:pPr>
+        <w:pStyle w:val="Heading2"/>
+      </w:pPr>
+      <w:r>
+        <w:rPr>
+          <w:color w:val="4F81BD"/>
+          <w:sz w:val="28"/>
+        </w:rPr>
+        <w:t>Veja também</w:t>
+      </w:r>
+    </w:p>
+    <w:p>
+      <w:pPr>
+        <w:pStyle w:val="ListBullet"/>
+      </w:pPr>
+      <w:r>
+        <w:t>02_MasterDictionary/AUTO/AUTO-0055.md</w:t>
+      </w:r>
+    </w:p>
+    <w:p>
+      <w:pPr>
+        <w:pStyle w:val="Heading2"/>
+      </w:pPr>
+      <w:r>
+        <w:rPr>
+          <w:color w:val="4F81BD"/>
+          <w:sz w:val="28"/>
+        </w:rPr>
+        <w:t>Histórico de revisão</w:t>
       </w:r>
     </w:p>
     <w:p>
@@ -5813,310 +5999,7 @@
           <w:rFonts w:ascii="Courier New" w:hAnsi="Courier New"/>
           <w:sz w:val="16"/>
         </w:rPr>
-        <w:t>| 2026-06-25 | 0.1 | JP-BR Insurance Knowledge Base | Criação inicial. |</w:t>
-      </w:r>
-    </w:p>
-    <w:p/>
-    <w:p>
-      <w:pPr>
-        <w:pStyle w:val="Heading1"/>
-      </w:pPr>
-      <w:r>
-        <w:rPr>
-          <w:color w:val="4F81BD"/>
-          <w:sz w:val="32"/>
-        </w:rPr>
-        <w:t>FAQ-AUTO-0053 - Quais mudanças preciso avisar à seguradora?</w:t>
-      </w:r>
-    </w:p>
-    <w:p>
-      <w:pPr>
-        <w:pStyle w:val="Heading2"/>
-      </w:pPr>
-      <w:r>
-        <w:rPr>
-          <w:color w:val="4F81BD"/>
-          <w:sz w:val="28"/>
-        </w:rPr>
-        <w:t>Controle</w:t>
-      </w:r>
-    </w:p>
-    <w:p>
-      <w:pPr>
-        <w:pStyle w:val="ListBullet"/>
-      </w:pPr>
-      <w:r>
-        <w:t>Versão: 0.1</w:t>
-      </w:r>
-    </w:p>
-    <w:p>
-      <w:pPr>
-        <w:pStyle w:val="ListBullet"/>
-      </w:pPr>
-      <w:r>
-        <w:t>Data: 2026-06-25</w:t>
-      </w:r>
-    </w:p>
-    <w:p>
-      <w:pPr>
-        <w:pStyle w:val="ListBullet"/>
-      </w:pPr>
-      <w:r>
-        <w:t>Autor: JP-BR Insurance Knowledge Base</w:t>
-      </w:r>
-    </w:p>
-    <w:p>
-      <w:pPr>
-        <w:pStyle w:val="ListBullet"/>
-      </w:pPr>
-      <w:r>
-        <w:t>Histórico: Criação inicial.</w:t>
-      </w:r>
-    </w:p>
-    <w:p>
-      <w:pPr>
-        <w:pStyle w:val="Heading2"/>
-      </w:pPr>
-      <w:r>
-        <w:rPr>
-          <w:color w:val="4F81BD"/>
-          <w:sz w:val="28"/>
-        </w:rPr>
-        <w:t>Código</w:t>
-      </w:r>
-    </w:p>
-    <w:p>
-      <w:r>
-        <w:t>FAQ-AUTO-0053</w:t>
-      </w:r>
-    </w:p>
-    <w:p>
-      <w:pPr>
-        <w:pStyle w:val="Heading2"/>
-      </w:pPr>
-      <w:r>
-        <w:rPr>
-          <w:color w:val="4F81BD"/>
-          <w:sz w:val="28"/>
-        </w:rPr>
-        <w:t>Categoria</w:t>
-      </w:r>
-    </w:p>
-    <w:p>
-      <w:r>
-        <w:t>AUTO</w:t>
-      </w:r>
-    </w:p>
-    <w:p>
-      <w:pPr>
-        <w:pStyle w:val="Heading2"/>
-      </w:pPr>
-      <w:r>
-        <w:rPr>
-          <w:color w:val="4F81BD"/>
-          <w:sz w:val="28"/>
-        </w:rPr>
-        <w:t>Pergunta</w:t>
-      </w:r>
-    </w:p>
-    <w:p>
-      <w:r>
-        <w:t>Quais mudanças preciso avisar à seguradora?</w:t>
-      </w:r>
-    </w:p>
-    <w:p>
-      <w:pPr>
-        <w:pStyle w:val="Heading2"/>
-      </w:pPr>
-      <w:r>
-        <w:rPr>
-          <w:color w:val="4F81BD"/>
-          <w:sz w:val="28"/>
-        </w:rPr>
-        <w:t>Situação de atendimento</w:t>
-      </w:r>
-    </w:p>
-    <w:p>
-      <w:r>
-        <w:t>Cliente precisa entender obrigação de comunicar alterações no contexto de atendimento de seguro de automóvel.</w:t>
-      </w:r>
-    </w:p>
-    <w:p>
-      <w:pPr>
-        <w:pStyle w:val="Heading2"/>
-      </w:pPr>
-      <w:r>
-        <w:rPr>
-          <w:color w:val="4F81BD"/>
-          <w:sz w:val="28"/>
-        </w:rPr>
-        <w:t>Resposta técnica</w:t>
-      </w:r>
-    </w:p>
-    <w:p>
-      <w:r>
-        <w:t>Obrigação contratual de informar à seguradora alterações relevantes durante a vigência do seguro.</w:t>
-      </w:r>
-    </w:p>
-    <w:p>
-      <w:pPr>
-        <w:pStyle w:val="Heading2"/>
-      </w:pPr>
-      <w:r>
-        <w:rPr>
-          <w:color w:val="4F81BD"/>
-          <w:sz w:val="28"/>
-        </w:rPr>
-        <w:t>Como responder ao cliente brasileiro</w:t>
-      </w:r>
-    </w:p>
-    <w:p>
-      <w:r>
-        <w:t>Se mudar algo importante, como uso do carro, endereço ou condutor, avise para manter o seguro correto.</w:t>
-      </w:r>
-    </w:p>
-    <w:p>
-      <w:pPr>
-        <w:pStyle w:val="Heading2"/>
-      </w:pPr>
-      <w:r>
-        <w:rPr>
-          <w:color w:val="4F81BD"/>
-          <w:sz w:val="28"/>
-        </w:rPr>
-        <w:t>Termos relacionados</w:t>
-      </w:r>
-    </w:p>
-    <w:p>
-      <w:pPr>
-        <w:pStyle w:val="ListBullet"/>
-      </w:pPr>
-      <w:r>
-        <w:t>AUTO-0056 - 通知義務 - Obrigação de comunicar alterações</w:t>
-      </w:r>
-    </w:p>
-    <w:p>
-      <w:pPr>
-        <w:pStyle w:val="Heading2"/>
-      </w:pPr>
-      <w:r>
-        <w:rPr>
-          <w:color w:val="4F81BD"/>
-          <w:sz w:val="28"/>
-        </w:rPr>
-        <w:t>Referências cruzadas</w:t>
-      </w:r>
-    </w:p>
-    <w:p>
-      <w:pPr>
-        <w:pStyle w:val="ListBullet"/>
-      </w:pPr>
-      <w:r>
-        <w:t>DIALOGUE-AUTO-0018</w:t>
-      </w:r>
-    </w:p>
-    <w:p>
-      <w:pPr>
-        <w:pStyle w:val="ListBullet"/>
-      </w:pPr>
-      <w:r>
-        <w:t>CASE-AUTO-0026</w:t>
-      </w:r>
-    </w:p>
-    <w:p>
-      <w:pPr>
-        <w:pStyle w:val="Heading2"/>
-      </w:pPr>
-      <w:r>
-        <w:rPr>
-          <w:color w:val="4F81BD"/>
-          <w:sz w:val="28"/>
-        </w:rPr>
-        <w:t>Referências</w:t>
-      </w:r>
-    </w:p>
-    <w:p>
-      <w:pPr>
-        <w:pStyle w:val="ListBullet"/>
-      </w:pPr>
-      <w:r>
-        <w:t>Documento interno: 02_MasterDictionary/AUTO/AUTO-0056.md</w:t>
-      </w:r>
-    </w:p>
-    <w:p>
-      <w:pPr>
-        <w:pStyle w:val="Heading2"/>
-      </w:pPr>
-      <w:r>
-        <w:rPr>
-          <w:color w:val="4F81BD"/>
-          <w:sz w:val="28"/>
-        </w:rPr>
-        <w:t>Tags</w:t>
-      </w:r>
-    </w:p>
-    <w:p>
-      <w:pPr>
-        <w:pStyle w:val="ListBullet"/>
-      </w:pPr>
-      <w:r>
-        <w:t>faq</w:t>
-      </w:r>
-    </w:p>
-    <w:p>
-      <w:pPr>
-        <w:pStyle w:val="ListBullet"/>
-      </w:pPr>
-      <w:r>
-        <w:t>auto</w:t>
-      </w:r>
-    </w:p>
-    <w:p>
-      <w:pPr>
-        <w:pStyle w:val="ListBullet"/>
-      </w:pPr>
-      <w:r>
-        <w:t>sinistro</w:t>
-      </w:r>
-    </w:p>
-    <w:p>
-      <w:pPr>
-        <w:pStyle w:val="ListBullet"/>
-      </w:pPr>
-      <w:r>
-        <w:t>atendimento</w:t>
-      </w:r>
-    </w:p>
-    <w:p>
-      <w:pPr>
-        <w:pStyle w:val="Heading2"/>
-      </w:pPr>
-      <w:r>
-        <w:rPr>
-          <w:color w:val="4F81BD"/>
-          <w:sz w:val="28"/>
-        </w:rPr>
-        <w:t>Veja também</w:t>
-      </w:r>
-    </w:p>
-    <w:p>
-      <w:pPr>
-        <w:pStyle w:val="ListBullet"/>
-      </w:pPr>
-      <w:r>
-        <w:t>02_MasterDictionary/AUTO/AUTO-0056.md</w:t>
-      </w:r>
-    </w:p>
-    <w:p>
-      <w:pPr>
-        <w:pStyle w:val="Heading2"/>
-      </w:pPr>
-      <w:r>
-        <w:rPr>
-          <w:color w:val="4F81BD"/>
-          <w:sz w:val="28"/>
-        </w:rPr>
-        <w:t>Histórico de revisão</w:t>
+        <w:t>| Data | Versão | Autor | Alteração |</w:t>
       </w:r>
     </w:p>
     <w:p>
@@ -6125,7 +6008,7 @@
           <w:rFonts w:ascii="Courier New" w:hAnsi="Courier New"/>
           <w:sz w:val="16"/>
         </w:rPr>
-        <w:t>| Data | Versão | Autor | Alteração |</w:t>
+        <w:t>| --- | --- | --- | --- |</w:t>
       </w:r>
     </w:p>
     <w:p>
@@ -6134,7 +6017,7 @@
           <w:rFonts w:ascii="Courier New" w:hAnsi="Courier New"/>
           <w:sz w:val="16"/>
         </w:rPr>
-        <w:t>| --- | --- | --- | --- |</w:t>
+        <w:t>| 2026-06-26 | 0.2 | JP-BR Insurance Knowledge Base | Inclusão de consulta japonesa, próximo passo seguro e limite comercial/compliance. |</w:t>
       </w:r>
     </w:p>
     <w:p>
@@ -6156,7 +6039,7 @@
           <w:color w:val="4F81BD"/>
           <w:sz w:val="32"/>
         </w:rPr>
-        <w:t>FAQ-AUTO-0054 - Como faço uma alteração no contrato?</w:t>
+        <w:t>FAQ-AUTO-0053 - Quais mudanças preciso avisar à seguradora?</w:t>
       </w:r>
     </w:p>
     <w:p>
@@ -6176,7 +6059,7 @@
         <w:pStyle w:val="ListBullet"/>
       </w:pPr>
       <w:r>
-        <w:t>Versão: 0.1</w:t>
+        <w:t>Versão: 0.2</w:t>
       </w:r>
     </w:p>
     <w:p>
@@ -6200,7 +6083,7 @@
         <w:pStyle w:val="ListBullet"/>
       </w:pPr>
       <w:r>
-        <w:t>Histórico: Criação inicial.</w:t>
+        <w:t>Histórico: Criação inicial; reforço NotebookLM e compliance.</w:t>
       </w:r>
     </w:p>
     <w:p>
@@ -6217,7 +6100,7 @@
     </w:p>
     <w:p>
       <w:r>
-        <w:t>FAQ-AUTO-0054</w:t>
+        <w:t>FAQ-AUTO-0053</w:t>
       </w:r>
     </w:p>
     <w:p>
@@ -6251,7 +6134,7 @@
     </w:p>
     <w:p>
       <w:r>
-        <w:t>Como faço uma alteração no contrato?</w:t>
+        <w:t>Quais mudanças preciso avisar à seguradora?</w:t>
       </w:r>
     </w:p>
     <w:p>
@@ -6263,12 +6146,40 @@
           <w:color w:val="4F81BD"/>
           <w:sz w:val="28"/>
         </w:rPr>
+        <w:t>Consulta natural em japonês</w:t>
+      </w:r>
+    </w:p>
+    <w:p>
+      <w:pPr>
+        <w:pStyle w:val="ListBullet"/>
+      </w:pPr>
+      <w:r>
+        <w:t>通知義務が必要な変更には何がありますか。</w:t>
+      </w:r>
+    </w:p>
+    <w:p>
+      <w:pPr>
+        <w:pStyle w:val="ListBullet"/>
+      </w:pPr>
+      <w:r>
+        <w:t>契約中の変更をブラジル人のお客様にどう案内しますか。</w:t>
+      </w:r>
+    </w:p>
+    <w:p>
+      <w:pPr>
+        <w:pStyle w:val="Heading2"/>
+      </w:pPr>
+      <w:r>
+        <w:rPr>
+          <w:color w:val="4F81BD"/>
+          <w:sz w:val="28"/>
+        </w:rPr>
         <w:t>Situação de atendimento</w:t>
       </w:r>
     </w:p>
     <w:p>
       <w:r>
-        <w:t>Cliente precisa entender procedimento de alteração no contexto de atendimento de seguro de automóvel.</w:t>
+        <w:t>Cliente precisa entender obrigação de comunicar alterações no contexto de atendimento de seguro de automóvel.</w:t>
       </w:r>
     </w:p>
     <w:p>
@@ -6285,7 +6196,7 @@
     </w:p>
     <w:p>
       <w:r>
-        <w:t>Procedimento operacional para registrar mudanças no contrato de seguro, conforme regras da seguradora.</w:t>
+        <w:t>Obrigação contratual de informar à seguradora alterações relevantes durante a vigência do seguro.</w:t>
       </w:r>
     </w:p>
     <w:p>
@@ -6302,7 +6213,7 @@
     </w:p>
     <w:p>
       <w:r>
-        <w:t>Quando houver mudança, fazemos o procedimento correto para a seguradora atualizar os dados.</w:t>
+        <w:t>Se mudar algo importante, como uso do carro, endereço ou condutor, avise para manter o seguro correto.</w:t>
       </w:r>
     </w:p>
     <w:p>
@@ -6314,6 +6225,40 @@
           <w:color w:val="4F81BD"/>
           <w:sz w:val="28"/>
         </w:rPr>
+        <w:t>Próximo passo seguro</w:t>
+      </w:r>
+    </w:p>
+    <w:p>
+      <w:r>
+        <w:t>Confirmar a mudança ocorrida, data da mudança, documento necessário e se isso altera prêmio, cobertura, condutores ou validade do contrato.</w:t>
+      </w:r>
+    </w:p>
+    <w:p>
+      <w:pPr>
+        <w:pStyle w:val="Heading2"/>
+      </w:pPr>
+      <w:r>
+        <w:rPr>
+          <w:color w:val="4F81BD"/>
+          <w:sz w:val="28"/>
+        </w:rPr>
+        <w:t>Limite comercial/compliance</w:t>
+      </w:r>
+    </w:p>
+    <w:p>
+      <w:r>
+        <w:t>O corretor não deve afirmar que uma mudança é irrelevante sem verificar a regra da seguradora. Falta de comunicação pode prejudicar cobertura ou sinistro.</w:t>
+      </w:r>
+    </w:p>
+    <w:p>
+      <w:pPr>
+        <w:pStyle w:val="Heading2"/>
+      </w:pPr>
+      <w:r>
+        <w:rPr>
+          <w:color w:val="4F81BD"/>
+          <w:sz w:val="28"/>
+        </w:rPr>
         <w:t>Termos relacionados</w:t>
       </w:r>
     </w:p>
@@ -6322,7 +6267,7 @@
         <w:pStyle w:val="ListBullet"/>
       </w:pPr>
       <w:r>
-        <w:t>AUTO-0057 - 変更手続き - Procedimento de alteração</w:t>
+        <w:t>AUTO-0056 - 通知義務 - Obrigação de comunicar alterações</w:t>
       </w:r>
     </w:p>
     <w:p>
@@ -6342,7 +6287,7 @@
         <w:pStyle w:val="ListBullet"/>
       </w:pPr>
       <w:r>
-        <w:t>DIALOGUE-AUTO-0019</w:t>
+        <w:t>DIALOGUE-AUTO-0018</w:t>
       </w:r>
     </w:p>
     <w:p>
@@ -6370,7 +6315,7 @@
         <w:pStyle w:val="ListBullet"/>
       </w:pPr>
       <w:r>
-        <w:t>Documento interno: 02_MasterDictionary/AUTO/AUTO-0057.md</w:t>
+        <w:t>Documento interno: 02_MasterDictionary/AUTO/AUTO-0056.md</w:t>
       </w:r>
     </w:p>
     <w:p>
@@ -6434,7 +6379,7 @@
         <w:pStyle w:val="ListBullet"/>
       </w:pPr>
       <w:r>
-        <w:t>02_MasterDictionary/AUTO/AUTO-0057.md</w:t>
+        <w:t>02_MasterDictionary/AUTO/AUTO-0056.md</w:t>
       </w:r>
     </w:p>
     <w:p>
@@ -6473,310 +6418,7 @@
           <w:rFonts w:ascii="Courier New" w:hAnsi="Courier New"/>
           <w:sz w:val="16"/>
         </w:rPr>
-        <w:t>| 2026-06-25 | 0.1 | JP-BR Insurance Knowledge Base | Criação inicial. |</w:t>
-      </w:r>
-    </w:p>
-    <w:p/>
-    <w:p>
-      <w:pPr>
-        <w:pStyle w:val="Heading1"/>
-      </w:pPr>
-      <w:r>
-        <w:rPr>
-          <w:color w:val="4F81BD"/>
-          <w:sz w:val="32"/>
-        </w:rPr>
-        <w:t>FAQ-AUTO-0055 - Para que serve a apólice?</w:t>
-      </w:r>
-    </w:p>
-    <w:p>
-      <w:pPr>
-        <w:pStyle w:val="Heading2"/>
-      </w:pPr>
-      <w:r>
-        <w:rPr>
-          <w:color w:val="4F81BD"/>
-          <w:sz w:val="28"/>
-        </w:rPr>
-        <w:t>Controle</w:t>
-      </w:r>
-    </w:p>
-    <w:p>
-      <w:pPr>
-        <w:pStyle w:val="ListBullet"/>
-      </w:pPr>
-      <w:r>
-        <w:t>Versão: 0.1</w:t>
-      </w:r>
-    </w:p>
-    <w:p>
-      <w:pPr>
-        <w:pStyle w:val="ListBullet"/>
-      </w:pPr>
-      <w:r>
-        <w:t>Data: 2026-06-25</w:t>
-      </w:r>
-    </w:p>
-    <w:p>
-      <w:pPr>
-        <w:pStyle w:val="ListBullet"/>
-      </w:pPr>
-      <w:r>
-        <w:t>Autor: JP-BR Insurance Knowledge Base</w:t>
-      </w:r>
-    </w:p>
-    <w:p>
-      <w:pPr>
-        <w:pStyle w:val="ListBullet"/>
-      </w:pPr>
-      <w:r>
-        <w:t>Histórico: Criação inicial.</w:t>
-      </w:r>
-    </w:p>
-    <w:p>
-      <w:pPr>
-        <w:pStyle w:val="Heading2"/>
-      </w:pPr>
-      <w:r>
-        <w:rPr>
-          <w:color w:val="4F81BD"/>
-          <w:sz w:val="28"/>
-        </w:rPr>
-        <w:t>Código</w:t>
-      </w:r>
-    </w:p>
-    <w:p>
-      <w:r>
-        <w:t>FAQ-AUTO-0055</w:t>
-      </w:r>
-    </w:p>
-    <w:p>
-      <w:pPr>
-        <w:pStyle w:val="Heading2"/>
-      </w:pPr>
-      <w:r>
-        <w:rPr>
-          <w:color w:val="4F81BD"/>
-          <w:sz w:val="28"/>
-        </w:rPr>
-        <w:t>Categoria</w:t>
-      </w:r>
-    </w:p>
-    <w:p>
-      <w:r>
-        <w:t>AUTO</w:t>
-      </w:r>
-    </w:p>
-    <w:p>
-      <w:pPr>
-        <w:pStyle w:val="Heading2"/>
-      </w:pPr>
-      <w:r>
-        <w:rPr>
-          <w:color w:val="4F81BD"/>
-          <w:sz w:val="28"/>
-        </w:rPr>
-        <w:t>Pergunta</w:t>
-      </w:r>
-    </w:p>
-    <w:p>
-      <w:r>
-        <w:t>Para que serve a apólice?</w:t>
-      </w:r>
-    </w:p>
-    <w:p>
-      <w:pPr>
-        <w:pStyle w:val="Heading2"/>
-      </w:pPr>
-      <w:r>
-        <w:rPr>
-          <w:color w:val="4F81BD"/>
-          <w:sz w:val="28"/>
-        </w:rPr>
-        <w:t>Situação de atendimento</w:t>
-      </w:r>
-    </w:p>
-    <w:p>
-      <w:r>
-        <w:t>Cliente precisa entender apólice de seguro no contexto de atendimento de seguro de automóvel.</w:t>
-      </w:r>
-    </w:p>
-    <w:p>
-      <w:pPr>
-        <w:pStyle w:val="Heading2"/>
-      </w:pPr>
-      <w:r>
-        <w:rPr>
-          <w:color w:val="4F81BD"/>
-          <w:sz w:val="28"/>
-        </w:rPr>
-        <w:t>Resposta técnica</w:t>
-      </w:r>
-    </w:p>
-    <w:p>
-      <w:r>
-        <w:t>Documento que comprova o contrato de seguro e registra dados principais, coberturas, período, prêmio e condições.</w:t>
-      </w:r>
-    </w:p>
-    <w:p>
-      <w:pPr>
-        <w:pStyle w:val="Heading2"/>
-      </w:pPr>
-      <w:r>
-        <w:rPr>
-          <w:color w:val="4F81BD"/>
-          <w:sz w:val="28"/>
-        </w:rPr>
-        <w:t>Como responder ao cliente brasileiro</w:t>
-      </w:r>
-    </w:p>
-    <w:p>
-      <w:r>
-        <w:t>A apólice mostra as informações do contrato. É importante conferir se os dados estão corretos.</w:t>
-      </w:r>
-    </w:p>
-    <w:p>
-      <w:pPr>
-        <w:pStyle w:val="Heading2"/>
-      </w:pPr>
-      <w:r>
-        <w:rPr>
-          <w:color w:val="4F81BD"/>
-          <w:sz w:val="28"/>
-        </w:rPr>
-        <w:t>Termos relacionados</w:t>
-      </w:r>
-    </w:p>
-    <w:p>
-      <w:pPr>
-        <w:pStyle w:val="ListBullet"/>
-      </w:pPr>
-      <w:r>
-        <w:t>AUTO-0058 - 保険証券 - Apólice de seguro</w:t>
-      </w:r>
-    </w:p>
-    <w:p>
-      <w:pPr>
-        <w:pStyle w:val="Heading2"/>
-      </w:pPr>
-      <w:r>
-        <w:rPr>
-          <w:color w:val="4F81BD"/>
-          <w:sz w:val="28"/>
-        </w:rPr>
-        <w:t>Referências cruzadas</w:t>
-      </w:r>
-    </w:p>
-    <w:p>
-      <w:pPr>
-        <w:pStyle w:val="ListBullet"/>
-      </w:pPr>
-      <w:r>
-        <w:t>DIALOGUE-AUTO-0019</w:t>
-      </w:r>
-    </w:p>
-    <w:p>
-      <w:pPr>
-        <w:pStyle w:val="ListBullet"/>
-      </w:pPr>
-      <w:r>
-        <w:t>CASE-AUTO-0026</w:t>
-      </w:r>
-    </w:p>
-    <w:p>
-      <w:pPr>
-        <w:pStyle w:val="Heading2"/>
-      </w:pPr>
-      <w:r>
-        <w:rPr>
-          <w:color w:val="4F81BD"/>
-          <w:sz w:val="28"/>
-        </w:rPr>
-        <w:t>Referências</w:t>
-      </w:r>
-    </w:p>
-    <w:p>
-      <w:pPr>
-        <w:pStyle w:val="ListBullet"/>
-      </w:pPr>
-      <w:r>
-        <w:t>Documento interno: 02_MasterDictionary/AUTO/AUTO-0058.md</w:t>
-      </w:r>
-    </w:p>
-    <w:p>
-      <w:pPr>
-        <w:pStyle w:val="Heading2"/>
-      </w:pPr>
-      <w:r>
-        <w:rPr>
-          <w:color w:val="4F81BD"/>
-          <w:sz w:val="28"/>
-        </w:rPr>
-        <w:t>Tags</w:t>
-      </w:r>
-    </w:p>
-    <w:p>
-      <w:pPr>
-        <w:pStyle w:val="ListBullet"/>
-      </w:pPr>
-      <w:r>
-        <w:t>faq</w:t>
-      </w:r>
-    </w:p>
-    <w:p>
-      <w:pPr>
-        <w:pStyle w:val="ListBullet"/>
-      </w:pPr>
-      <w:r>
-        <w:t>auto</w:t>
-      </w:r>
-    </w:p>
-    <w:p>
-      <w:pPr>
-        <w:pStyle w:val="ListBullet"/>
-      </w:pPr>
-      <w:r>
-        <w:t>sinistro</w:t>
-      </w:r>
-    </w:p>
-    <w:p>
-      <w:pPr>
-        <w:pStyle w:val="ListBullet"/>
-      </w:pPr>
-      <w:r>
-        <w:t>atendimento</w:t>
-      </w:r>
-    </w:p>
-    <w:p>
-      <w:pPr>
-        <w:pStyle w:val="Heading2"/>
-      </w:pPr>
-      <w:r>
-        <w:rPr>
-          <w:color w:val="4F81BD"/>
-          <w:sz w:val="28"/>
-        </w:rPr>
-        <w:t>Veja também</w:t>
-      </w:r>
-    </w:p>
-    <w:p>
-      <w:pPr>
-        <w:pStyle w:val="ListBullet"/>
-      </w:pPr>
-      <w:r>
-        <w:t>02_MasterDictionary/AUTO/AUTO-0058.md</w:t>
-      </w:r>
-    </w:p>
-    <w:p>
-      <w:pPr>
-        <w:pStyle w:val="Heading2"/>
-      </w:pPr>
-      <w:r>
-        <w:rPr>
-          <w:color w:val="4F81BD"/>
-          <w:sz w:val="28"/>
-        </w:rPr>
-        <w:t>Histórico de revisão</w:t>
+        <w:t>| 2026-06-26 | 0.2 | JP-BR Insurance Knowledge Base | Inclusão de consulta japonesa, próximo passo seguro e limite comercial/compliance. |</w:t>
       </w:r>
     </w:p>
     <w:p>
@@ -6785,7 +6427,372 @@
           <w:rFonts w:ascii="Courier New" w:hAnsi="Courier New"/>
           <w:sz w:val="16"/>
         </w:rPr>
-        <w:t>| Data | Versão | Autor | Alteração |</w:t>
+        <w:t>| 2026-06-25 | 0.1 | JP-BR Insurance Knowledge Base | Criação inicial. |</w:t>
+      </w:r>
+    </w:p>
+    <w:p/>
+    <w:p>
+      <w:pPr>
+        <w:pStyle w:val="Heading1"/>
+      </w:pPr>
+      <w:r>
+        <w:rPr>
+          <w:color w:val="4F81BD"/>
+          <w:sz w:val="32"/>
+        </w:rPr>
+        <w:t>FAQ-AUTO-0054 - Como faço uma alteração no contrato?</w:t>
+      </w:r>
+    </w:p>
+    <w:p>
+      <w:pPr>
+        <w:pStyle w:val="Heading2"/>
+      </w:pPr>
+      <w:r>
+        <w:rPr>
+          <w:color w:val="4F81BD"/>
+          <w:sz w:val="28"/>
+        </w:rPr>
+        <w:t>Controle</w:t>
+      </w:r>
+    </w:p>
+    <w:p>
+      <w:pPr>
+        <w:pStyle w:val="ListBullet"/>
+      </w:pPr>
+      <w:r>
+        <w:t>Versão: 0.2</w:t>
+      </w:r>
+    </w:p>
+    <w:p>
+      <w:pPr>
+        <w:pStyle w:val="ListBullet"/>
+      </w:pPr>
+      <w:r>
+        <w:t>Data: 2026-06-25</w:t>
+      </w:r>
+    </w:p>
+    <w:p>
+      <w:pPr>
+        <w:pStyle w:val="ListBullet"/>
+      </w:pPr>
+      <w:r>
+        <w:t>Autor: JP-BR Insurance Knowledge Base</w:t>
+      </w:r>
+    </w:p>
+    <w:p>
+      <w:pPr>
+        <w:pStyle w:val="ListBullet"/>
+      </w:pPr>
+      <w:r>
+        <w:t>Histórico: Criação inicial; reforço NotebookLM e compliance.</w:t>
+      </w:r>
+    </w:p>
+    <w:p>
+      <w:pPr>
+        <w:pStyle w:val="Heading2"/>
+      </w:pPr>
+      <w:r>
+        <w:rPr>
+          <w:color w:val="4F81BD"/>
+          <w:sz w:val="28"/>
+        </w:rPr>
+        <w:t>Código</w:t>
+      </w:r>
+    </w:p>
+    <w:p>
+      <w:r>
+        <w:t>FAQ-AUTO-0054</w:t>
+      </w:r>
+    </w:p>
+    <w:p>
+      <w:pPr>
+        <w:pStyle w:val="Heading2"/>
+      </w:pPr>
+      <w:r>
+        <w:rPr>
+          <w:color w:val="4F81BD"/>
+          <w:sz w:val="28"/>
+        </w:rPr>
+        <w:t>Categoria</w:t>
+      </w:r>
+    </w:p>
+    <w:p>
+      <w:r>
+        <w:t>AUTO</w:t>
+      </w:r>
+    </w:p>
+    <w:p>
+      <w:pPr>
+        <w:pStyle w:val="Heading2"/>
+      </w:pPr>
+      <w:r>
+        <w:rPr>
+          <w:color w:val="4F81BD"/>
+          <w:sz w:val="28"/>
+        </w:rPr>
+        <w:t>Pergunta</w:t>
+      </w:r>
+    </w:p>
+    <w:p>
+      <w:r>
+        <w:t>Como faço uma alteração no contrato?</w:t>
+      </w:r>
+    </w:p>
+    <w:p>
+      <w:pPr>
+        <w:pStyle w:val="Heading2"/>
+      </w:pPr>
+      <w:r>
+        <w:rPr>
+          <w:color w:val="4F81BD"/>
+          <w:sz w:val="28"/>
+        </w:rPr>
+        <w:t>Consulta natural em japonês</w:t>
+      </w:r>
+    </w:p>
+    <w:p>
+      <w:pPr>
+        <w:pStyle w:val="ListBullet"/>
+      </w:pPr>
+      <w:r>
+        <w:t>契約内容を変更する手続きはどのように進めますか。</w:t>
+      </w:r>
+    </w:p>
+    <w:p>
+      <w:pPr>
+        <w:pStyle w:val="ListBullet"/>
+      </w:pPr>
+      <w:r>
+        <w:t>変更手続きをブラジル人のお客様に説明するときの注意点は何ですか。</w:t>
+      </w:r>
+    </w:p>
+    <w:p>
+      <w:pPr>
+        <w:pStyle w:val="Heading2"/>
+      </w:pPr>
+      <w:r>
+        <w:rPr>
+          <w:color w:val="4F81BD"/>
+          <w:sz w:val="28"/>
+        </w:rPr>
+        <w:t>Situação de atendimento</w:t>
+      </w:r>
+    </w:p>
+    <w:p>
+      <w:r>
+        <w:t>Cliente precisa entender procedimento de alteração no contexto de atendimento de seguro de automóvel.</w:t>
+      </w:r>
+    </w:p>
+    <w:p>
+      <w:pPr>
+        <w:pStyle w:val="Heading2"/>
+      </w:pPr>
+      <w:r>
+        <w:rPr>
+          <w:color w:val="4F81BD"/>
+          <w:sz w:val="28"/>
+        </w:rPr>
+        <w:t>Resposta técnica</w:t>
+      </w:r>
+    </w:p>
+    <w:p>
+      <w:r>
+        <w:t>Procedimento operacional para registrar mudanças no contrato de seguro, conforme regras da seguradora.</w:t>
+      </w:r>
+    </w:p>
+    <w:p>
+      <w:pPr>
+        <w:pStyle w:val="Heading2"/>
+      </w:pPr>
+      <w:r>
+        <w:rPr>
+          <w:color w:val="4F81BD"/>
+          <w:sz w:val="28"/>
+        </w:rPr>
+        <w:t>Como responder ao cliente brasileiro</w:t>
+      </w:r>
+    </w:p>
+    <w:p>
+      <w:r>
+        <w:t>Quando houver mudança, fazemos o procedimento correto para a seguradora atualizar os dados.</w:t>
+      </w:r>
+    </w:p>
+    <w:p>
+      <w:pPr>
+        <w:pStyle w:val="Heading2"/>
+      </w:pPr>
+      <w:r>
+        <w:rPr>
+          <w:color w:val="4F81BD"/>
+          <w:sz w:val="28"/>
+        </w:rPr>
+        <w:t>Próximo passo seguro</w:t>
+      </w:r>
+    </w:p>
+    <w:p>
+      <w:r>
+        <w:t>Coletar dados atualizados, enviar pelo procedimento correto e aguardar confirmação da seguradora antes de considerar a alteração válida.</w:t>
+      </w:r>
+    </w:p>
+    <w:p>
+      <w:pPr>
+        <w:pStyle w:val="Heading2"/>
+      </w:pPr>
+      <w:r>
+        <w:rPr>
+          <w:color w:val="4F81BD"/>
+          <w:sz w:val="28"/>
+        </w:rPr>
+        <w:t>Limite comercial/compliance</w:t>
+      </w:r>
+    </w:p>
+    <w:p>
+      <w:r>
+        <w:t>O corretor não deve tratar pedido informal como alteração concluída. A alteração só produz efeito conforme procedimento e confirmação da seguradora.</w:t>
+      </w:r>
+    </w:p>
+    <w:p>
+      <w:pPr>
+        <w:pStyle w:val="Heading2"/>
+      </w:pPr>
+      <w:r>
+        <w:rPr>
+          <w:color w:val="4F81BD"/>
+          <w:sz w:val="28"/>
+        </w:rPr>
+        <w:t>Termos relacionados</w:t>
+      </w:r>
+    </w:p>
+    <w:p>
+      <w:pPr>
+        <w:pStyle w:val="ListBullet"/>
+      </w:pPr>
+      <w:r>
+        <w:t>AUTO-0057 - 変更手続き - Procedimento de alteração</w:t>
+      </w:r>
+    </w:p>
+    <w:p>
+      <w:pPr>
+        <w:pStyle w:val="Heading2"/>
+      </w:pPr>
+      <w:r>
+        <w:rPr>
+          <w:color w:val="4F81BD"/>
+          <w:sz w:val="28"/>
+        </w:rPr>
+        <w:t>Referências cruzadas</w:t>
+      </w:r>
+    </w:p>
+    <w:p>
+      <w:pPr>
+        <w:pStyle w:val="ListBullet"/>
+      </w:pPr>
+      <w:r>
+        <w:t>DIALOGUE-AUTO-0019</w:t>
+      </w:r>
+    </w:p>
+    <w:p>
+      <w:pPr>
+        <w:pStyle w:val="ListBullet"/>
+      </w:pPr>
+      <w:r>
+        <w:t>CASE-AUTO-0026</w:t>
+      </w:r>
+    </w:p>
+    <w:p>
+      <w:pPr>
+        <w:pStyle w:val="Heading2"/>
+      </w:pPr>
+      <w:r>
+        <w:rPr>
+          <w:color w:val="4F81BD"/>
+          <w:sz w:val="28"/>
+        </w:rPr>
+        <w:t>Referências</w:t>
+      </w:r>
+    </w:p>
+    <w:p>
+      <w:pPr>
+        <w:pStyle w:val="ListBullet"/>
+      </w:pPr>
+      <w:r>
+        <w:t>Documento interno: 02_MasterDictionary/AUTO/AUTO-0057.md</w:t>
+      </w:r>
+    </w:p>
+    <w:p>
+      <w:pPr>
+        <w:pStyle w:val="Heading2"/>
+      </w:pPr>
+      <w:r>
+        <w:rPr>
+          <w:color w:val="4F81BD"/>
+          <w:sz w:val="28"/>
+        </w:rPr>
+        <w:t>Tags</w:t>
+      </w:r>
+    </w:p>
+    <w:p>
+      <w:pPr>
+        <w:pStyle w:val="ListBullet"/>
+      </w:pPr>
+      <w:r>
+        <w:t>faq</w:t>
+      </w:r>
+    </w:p>
+    <w:p>
+      <w:pPr>
+        <w:pStyle w:val="ListBullet"/>
+      </w:pPr>
+      <w:r>
+        <w:t>auto</w:t>
+      </w:r>
+    </w:p>
+    <w:p>
+      <w:pPr>
+        <w:pStyle w:val="ListBullet"/>
+      </w:pPr>
+      <w:r>
+        <w:t>sinistro</w:t>
+      </w:r>
+    </w:p>
+    <w:p>
+      <w:pPr>
+        <w:pStyle w:val="ListBullet"/>
+      </w:pPr>
+      <w:r>
+        <w:t>atendimento</w:t>
+      </w:r>
+    </w:p>
+    <w:p>
+      <w:pPr>
+        <w:pStyle w:val="Heading2"/>
+      </w:pPr>
+      <w:r>
+        <w:rPr>
+          <w:color w:val="4F81BD"/>
+          <w:sz w:val="28"/>
+        </w:rPr>
+        <w:t>Veja também</w:t>
+      </w:r>
+    </w:p>
+    <w:p>
+      <w:pPr>
+        <w:pStyle w:val="ListBullet"/>
+      </w:pPr>
+      <w:r>
+        <w:t>02_MasterDictionary/AUTO/AUTO-0057.md</w:t>
+      </w:r>
+    </w:p>
+    <w:p>
+      <w:pPr>
+        <w:pStyle w:val="Heading2"/>
+      </w:pPr>
+      <w:r>
+        <w:rPr>
+          <w:color w:val="4F81BD"/>
+          <w:sz w:val="28"/>
+        </w:rPr>
+        <w:t>Histórico de revisão</w:t>
       </w:r>
     </w:p>
     <w:p>
@@ -6794,7 +6801,7 @@
           <w:rFonts w:ascii="Courier New" w:hAnsi="Courier New"/>
           <w:sz w:val="16"/>
         </w:rPr>
-        <w:t>| --- | --- | --- | --- |</w:t>
+        <w:t>| Data | Versão | Autor | Alteração |</w:t>
       </w:r>
     </w:p>
     <w:p>
@@ -6803,310 +6810,7 @@
           <w:rFonts w:ascii="Courier New" w:hAnsi="Courier New"/>
           <w:sz w:val="16"/>
         </w:rPr>
-        <w:t>| 2026-06-25 | 0.1 | JP-BR Insurance Knowledge Base | Criação inicial. |</w:t>
-      </w:r>
-    </w:p>
-    <w:p/>
-    <w:p>
-      <w:pPr>
-        <w:pStyle w:val="Heading1"/>
-      </w:pPr>
-      <w:r>
-        <w:rPr>
-          <w:color w:val="4F81BD"/>
-          <w:sz w:val="32"/>
-        </w:rPr>
-        <w:t>FAQ-AUTO-0056 - Como confirmo que a renovação foi feita?</w:t>
-      </w:r>
-    </w:p>
-    <w:p>
-      <w:pPr>
-        <w:pStyle w:val="Heading2"/>
-      </w:pPr>
-      <w:r>
-        <w:rPr>
-          <w:color w:val="4F81BD"/>
-          <w:sz w:val="28"/>
-        </w:rPr>
-        <w:t>Controle</w:t>
-      </w:r>
-    </w:p>
-    <w:p>
-      <w:pPr>
-        <w:pStyle w:val="ListBullet"/>
-      </w:pPr>
-      <w:r>
-        <w:t>Versão: 0.1</w:t>
-      </w:r>
-    </w:p>
-    <w:p>
-      <w:pPr>
-        <w:pStyle w:val="ListBullet"/>
-      </w:pPr>
-      <w:r>
-        <w:t>Data: 2026-06-25</w:t>
-      </w:r>
-    </w:p>
-    <w:p>
-      <w:pPr>
-        <w:pStyle w:val="ListBullet"/>
-      </w:pPr>
-      <w:r>
-        <w:t>Autor: JP-BR Insurance Knowledge Base</w:t>
-      </w:r>
-    </w:p>
-    <w:p>
-      <w:pPr>
-        <w:pStyle w:val="ListBullet"/>
-      </w:pPr>
-      <w:r>
-        <w:t>Histórico: Criação inicial.</w:t>
-      </w:r>
-    </w:p>
-    <w:p>
-      <w:pPr>
-        <w:pStyle w:val="Heading2"/>
-      </w:pPr>
-      <w:r>
-        <w:rPr>
-          <w:color w:val="4F81BD"/>
-          <w:sz w:val="28"/>
-        </w:rPr>
-        <w:t>Código</w:t>
-      </w:r>
-    </w:p>
-    <w:p>
-      <w:r>
-        <w:t>FAQ-AUTO-0056</w:t>
-      </w:r>
-    </w:p>
-    <w:p>
-      <w:pPr>
-        <w:pStyle w:val="Heading2"/>
-      </w:pPr>
-      <w:r>
-        <w:rPr>
-          <w:color w:val="4F81BD"/>
-          <w:sz w:val="28"/>
-        </w:rPr>
-        <w:t>Categoria</w:t>
-      </w:r>
-    </w:p>
-    <w:p>
-      <w:r>
-        <w:t>AUTO</w:t>
-      </w:r>
-    </w:p>
-    <w:p>
-      <w:pPr>
-        <w:pStyle w:val="Heading2"/>
-      </w:pPr>
-      <w:r>
-        <w:rPr>
-          <w:color w:val="4F81BD"/>
-          <w:sz w:val="28"/>
-        </w:rPr>
-        <w:t>Pergunta</w:t>
-      </w:r>
-    </w:p>
-    <w:p>
-      <w:r>
-        <w:t>Como confirmo que a renovação foi feita?</w:t>
-      </w:r>
-    </w:p>
-    <w:p>
-      <w:pPr>
-        <w:pStyle w:val="Heading2"/>
-      </w:pPr>
-      <w:r>
-        <w:rPr>
-          <w:color w:val="4F81BD"/>
-          <w:sz w:val="28"/>
-        </w:rPr>
-        <w:t>Situação de atendimento</w:t>
-      </w:r>
-    </w:p>
-    <w:p>
-      <w:r>
-        <w:t>Cliente precisa entender comprovante de renovação no contexto de atendimento de seguro de automóvel.</w:t>
-      </w:r>
-    </w:p>
-    <w:p>
-      <w:pPr>
-        <w:pStyle w:val="Heading2"/>
-      </w:pPr>
-      <w:r>
-        <w:rPr>
-          <w:color w:val="4F81BD"/>
-          <w:sz w:val="28"/>
-        </w:rPr>
-        <w:t>Resposta técnica</w:t>
-      </w:r>
-    </w:p>
-    <w:p>
-      <w:r>
-        <w:t>Documento ou confirmação que indica a continuidade ou renovação do contrato conforme condições aceitas.</w:t>
-      </w:r>
-    </w:p>
-    <w:p>
-      <w:pPr>
-        <w:pStyle w:val="Heading2"/>
-      </w:pPr>
-      <w:r>
-        <w:rPr>
-          <w:color w:val="4F81BD"/>
-          <w:sz w:val="28"/>
-        </w:rPr>
-        <w:t>Como responder ao cliente brasileiro</w:t>
-      </w:r>
-    </w:p>
-    <w:p>
-      <w:r>
-        <w:t>Após renovar, confirme o documento ou registro que mostra que o seguro continua válido.</w:t>
-      </w:r>
-    </w:p>
-    <w:p>
-      <w:pPr>
-        <w:pStyle w:val="Heading2"/>
-      </w:pPr>
-      <w:r>
-        <w:rPr>
-          <w:color w:val="4F81BD"/>
-          <w:sz w:val="28"/>
-        </w:rPr>
-        <w:t>Termos relacionados</w:t>
-      </w:r>
-    </w:p>
-    <w:p>
-      <w:pPr>
-        <w:pStyle w:val="ListBullet"/>
-      </w:pPr>
-      <w:r>
-        <w:t>AUTO-0059 - 継続証 - Comprovante de renovação</w:t>
-      </w:r>
-    </w:p>
-    <w:p>
-      <w:pPr>
-        <w:pStyle w:val="Heading2"/>
-      </w:pPr>
-      <w:r>
-        <w:rPr>
-          <w:color w:val="4F81BD"/>
-          <w:sz w:val="28"/>
-        </w:rPr>
-        <w:t>Referências cruzadas</w:t>
-      </w:r>
-    </w:p>
-    <w:p>
-      <w:pPr>
-        <w:pStyle w:val="ListBullet"/>
-      </w:pPr>
-      <w:r>
-        <w:t>DIALOGUE-AUTO-0019</w:t>
-      </w:r>
-    </w:p>
-    <w:p>
-      <w:pPr>
-        <w:pStyle w:val="ListBullet"/>
-      </w:pPr>
-      <w:r>
-        <w:t>CASE-AUTO-0027</w:t>
-      </w:r>
-    </w:p>
-    <w:p>
-      <w:pPr>
-        <w:pStyle w:val="Heading2"/>
-      </w:pPr>
-      <w:r>
-        <w:rPr>
-          <w:color w:val="4F81BD"/>
-          <w:sz w:val="28"/>
-        </w:rPr>
-        <w:t>Referências</w:t>
-      </w:r>
-    </w:p>
-    <w:p>
-      <w:pPr>
-        <w:pStyle w:val="ListBullet"/>
-      </w:pPr>
-      <w:r>
-        <w:t>Documento interno: 02_MasterDictionary/AUTO/AUTO-0059.md</w:t>
-      </w:r>
-    </w:p>
-    <w:p>
-      <w:pPr>
-        <w:pStyle w:val="Heading2"/>
-      </w:pPr>
-      <w:r>
-        <w:rPr>
-          <w:color w:val="4F81BD"/>
-          <w:sz w:val="28"/>
-        </w:rPr>
-        <w:t>Tags</w:t>
-      </w:r>
-    </w:p>
-    <w:p>
-      <w:pPr>
-        <w:pStyle w:val="ListBullet"/>
-      </w:pPr>
-      <w:r>
-        <w:t>faq</w:t>
-      </w:r>
-    </w:p>
-    <w:p>
-      <w:pPr>
-        <w:pStyle w:val="ListBullet"/>
-      </w:pPr>
-      <w:r>
-        <w:t>auto</w:t>
-      </w:r>
-    </w:p>
-    <w:p>
-      <w:pPr>
-        <w:pStyle w:val="ListBullet"/>
-      </w:pPr>
-      <w:r>
-        <w:t>sinistro</w:t>
-      </w:r>
-    </w:p>
-    <w:p>
-      <w:pPr>
-        <w:pStyle w:val="ListBullet"/>
-      </w:pPr>
-      <w:r>
-        <w:t>atendimento</w:t>
-      </w:r>
-    </w:p>
-    <w:p>
-      <w:pPr>
-        <w:pStyle w:val="Heading2"/>
-      </w:pPr>
-      <w:r>
-        <w:rPr>
-          <w:color w:val="4F81BD"/>
-          <w:sz w:val="28"/>
-        </w:rPr>
-        <w:t>Veja também</w:t>
-      </w:r>
-    </w:p>
-    <w:p>
-      <w:pPr>
-        <w:pStyle w:val="ListBullet"/>
-      </w:pPr>
-      <w:r>
-        <w:t>02_MasterDictionary/AUTO/AUTO-0059.md</w:t>
-      </w:r>
-    </w:p>
-    <w:p>
-      <w:pPr>
-        <w:pStyle w:val="Heading2"/>
-      </w:pPr>
-      <w:r>
-        <w:rPr>
-          <w:color w:val="4F81BD"/>
-          <w:sz w:val="28"/>
-        </w:rPr>
-        <w:t>Histórico de revisão</w:t>
+        <w:t>| --- | --- | --- | --- |</w:t>
       </w:r>
     </w:p>
     <w:p>
@@ -7115,7 +6819,7 @@
           <w:rFonts w:ascii="Courier New" w:hAnsi="Courier New"/>
           <w:sz w:val="16"/>
         </w:rPr>
-        <w:t>| Data | Versão | Autor | Alteração |</w:t>
+        <w:t>| 2026-06-26 | 0.2 | JP-BR Insurance Knowledge Base | Inclusão de consulta japonesa, próximo passo seguro e limite comercial/compliance. |</w:t>
       </w:r>
     </w:p>
     <w:p>
@@ -7124,7 +6828,372 @@
           <w:rFonts w:ascii="Courier New" w:hAnsi="Courier New"/>
           <w:sz w:val="16"/>
         </w:rPr>
-        <w:t>| --- | --- | --- | --- |</w:t>
+        <w:t>| 2026-06-25 | 0.1 | JP-BR Insurance Knowledge Base | Criação inicial. |</w:t>
+      </w:r>
+    </w:p>
+    <w:p/>
+    <w:p>
+      <w:pPr>
+        <w:pStyle w:val="Heading1"/>
+      </w:pPr>
+      <w:r>
+        <w:rPr>
+          <w:color w:val="4F81BD"/>
+          <w:sz w:val="32"/>
+        </w:rPr>
+        <w:t>FAQ-AUTO-0055 - Para que serve a apólice?</w:t>
+      </w:r>
+    </w:p>
+    <w:p>
+      <w:pPr>
+        <w:pStyle w:val="Heading2"/>
+      </w:pPr>
+      <w:r>
+        <w:rPr>
+          <w:color w:val="4F81BD"/>
+          <w:sz w:val="28"/>
+        </w:rPr>
+        <w:t>Controle</w:t>
+      </w:r>
+    </w:p>
+    <w:p>
+      <w:pPr>
+        <w:pStyle w:val="ListBullet"/>
+      </w:pPr>
+      <w:r>
+        <w:t>Versão: 0.2</w:t>
+      </w:r>
+    </w:p>
+    <w:p>
+      <w:pPr>
+        <w:pStyle w:val="ListBullet"/>
+      </w:pPr>
+      <w:r>
+        <w:t>Data: 2026-06-25</w:t>
+      </w:r>
+    </w:p>
+    <w:p>
+      <w:pPr>
+        <w:pStyle w:val="ListBullet"/>
+      </w:pPr>
+      <w:r>
+        <w:t>Autor: JP-BR Insurance Knowledge Base</w:t>
+      </w:r>
+    </w:p>
+    <w:p>
+      <w:pPr>
+        <w:pStyle w:val="ListBullet"/>
+      </w:pPr>
+      <w:r>
+        <w:t>Histórico: Criação inicial; reforço NotebookLM e compliance.</w:t>
+      </w:r>
+    </w:p>
+    <w:p>
+      <w:pPr>
+        <w:pStyle w:val="Heading2"/>
+      </w:pPr>
+      <w:r>
+        <w:rPr>
+          <w:color w:val="4F81BD"/>
+          <w:sz w:val="28"/>
+        </w:rPr>
+        <w:t>Código</w:t>
+      </w:r>
+    </w:p>
+    <w:p>
+      <w:r>
+        <w:t>FAQ-AUTO-0055</w:t>
+      </w:r>
+    </w:p>
+    <w:p>
+      <w:pPr>
+        <w:pStyle w:val="Heading2"/>
+      </w:pPr>
+      <w:r>
+        <w:rPr>
+          <w:color w:val="4F81BD"/>
+          <w:sz w:val="28"/>
+        </w:rPr>
+        <w:t>Categoria</w:t>
+      </w:r>
+    </w:p>
+    <w:p>
+      <w:r>
+        <w:t>AUTO</w:t>
+      </w:r>
+    </w:p>
+    <w:p>
+      <w:pPr>
+        <w:pStyle w:val="Heading2"/>
+      </w:pPr>
+      <w:r>
+        <w:rPr>
+          <w:color w:val="4F81BD"/>
+          <w:sz w:val="28"/>
+        </w:rPr>
+        <w:t>Pergunta</w:t>
+      </w:r>
+    </w:p>
+    <w:p>
+      <w:r>
+        <w:t>Para que serve a apólice?</w:t>
+      </w:r>
+    </w:p>
+    <w:p>
+      <w:pPr>
+        <w:pStyle w:val="Heading2"/>
+      </w:pPr>
+      <w:r>
+        <w:rPr>
+          <w:color w:val="4F81BD"/>
+          <w:sz w:val="28"/>
+        </w:rPr>
+        <w:t>Consulta natural em japonês</w:t>
+      </w:r>
+    </w:p>
+    <w:p>
+      <w:pPr>
+        <w:pStyle w:val="ListBullet"/>
+      </w:pPr>
+      <w:r>
+        <w:t>保険証券では何を確認すべきですか。</w:t>
+      </w:r>
+    </w:p>
+    <w:p>
+      <w:pPr>
+        <w:pStyle w:val="ListBullet"/>
+      </w:pPr>
+      <w:r>
+        <w:t>自動車保険の証券をブラジル人のお客様にどう説明しますか。</w:t>
+      </w:r>
+    </w:p>
+    <w:p>
+      <w:pPr>
+        <w:pStyle w:val="Heading2"/>
+      </w:pPr>
+      <w:r>
+        <w:rPr>
+          <w:color w:val="4F81BD"/>
+          <w:sz w:val="28"/>
+        </w:rPr>
+        <w:t>Situação de atendimento</w:t>
+      </w:r>
+    </w:p>
+    <w:p>
+      <w:r>
+        <w:t>Cliente precisa entender apólice de seguro no contexto de atendimento de seguro de automóvel.</w:t>
+      </w:r>
+    </w:p>
+    <w:p>
+      <w:pPr>
+        <w:pStyle w:val="Heading2"/>
+      </w:pPr>
+      <w:r>
+        <w:rPr>
+          <w:color w:val="4F81BD"/>
+          <w:sz w:val="28"/>
+        </w:rPr>
+        <w:t>Resposta técnica</w:t>
+      </w:r>
+    </w:p>
+    <w:p>
+      <w:r>
+        <w:t>Documento que comprova o contrato de seguro e registra dados principais, coberturas, período, prêmio e condições.</w:t>
+      </w:r>
+    </w:p>
+    <w:p>
+      <w:pPr>
+        <w:pStyle w:val="Heading2"/>
+      </w:pPr>
+      <w:r>
+        <w:rPr>
+          <w:color w:val="4F81BD"/>
+          <w:sz w:val="28"/>
+        </w:rPr>
+        <w:t>Como responder ao cliente brasileiro</w:t>
+      </w:r>
+    </w:p>
+    <w:p>
+      <w:r>
+        <w:t>A apólice mostra as informações do contrato. É importante conferir se os dados estão corretos.</w:t>
+      </w:r>
+    </w:p>
+    <w:p>
+      <w:pPr>
+        <w:pStyle w:val="Heading2"/>
+      </w:pPr>
+      <w:r>
+        <w:rPr>
+          <w:color w:val="4F81BD"/>
+          <w:sz w:val="28"/>
+        </w:rPr>
+        <w:t>Próximo passo seguro</w:t>
+      </w:r>
+    </w:p>
+    <w:p>
+      <w:r>
+        <w:t>Orientar o cliente a conferir nome, veículo, período, coberturas, condutores, prêmio e forma de pagamento assim que receber a apólice.</w:t>
+      </w:r>
+    </w:p>
+    <w:p>
+      <w:pPr>
+        <w:pStyle w:val="Heading2"/>
+      </w:pPr>
+      <w:r>
+        <w:rPr>
+          <w:color w:val="4F81BD"/>
+          <w:sz w:val="28"/>
+        </w:rPr>
+        <w:t>Limite comercial/compliance</w:t>
+      </w:r>
+    </w:p>
+    <w:p>
+      <w:r>
+        <w:t>A apólice registra as condições do contrato; o corretor não deve prometer cobertura fora do que consta nos documentos oficiais.</w:t>
+      </w:r>
+    </w:p>
+    <w:p>
+      <w:pPr>
+        <w:pStyle w:val="Heading2"/>
+      </w:pPr>
+      <w:r>
+        <w:rPr>
+          <w:color w:val="4F81BD"/>
+          <w:sz w:val="28"/>
+        </w:rPr>
+        <w:t>Termos relacionados</w:t>
+      </w:r>
+    </w:p>
+    <w:p>
+      <w:pPr>
+        <w:pStyle w:val="ListBullet"/>
+      </w:pPr>
+      <w:r>
+        <w:t>AUTO-0058 - 保険証券 - Apólice de seguro</w:t>
+      </w:r>
+    </w:p>
+    <w:p>
+      <w:pPr>
+        <w:pStyle w:val="Heading2"/>
+      </w:pPr>
+      <w:r>
+        <w:rPr>
+          <w:color w:val="4F81BD"/>
+          <w:sz w:val="28"/>
+        </w:rPr>
+        <w:t>Referências cruzadas</w:t>
+      </w:r>
+    </w:p>
+    <w:p>
+      <w:pPr>
+        <w:pStyle w:val="ListBullet"/>
+      </w:pPr>
+      <w:r>
+        <w:t>DIALOGUE-AUTO-0019</w:t>
+      </w:r>
+    </w:p>
+    <w:p>
+      <w:pPr>
+        <w:pStyle w:val="ListBullet"/>
+      </w:pPr>
+      <w:r>
+        <w:t>CASE-AUTO-0026</w:t>
+      </w:r>
+    </w:p>
+    <w:p>
+      <w:pPr>
+        <w:pStyle w:val="Heading2"/>
+      </w:pPr>
+      <w:r>
+        <w:rPr>
+          <w:color w:val="4F81BD"/>
+          <w:sz w:val="28"/>
+        </w:rPr>
+        <w:t>Referências</w:t>
+      </w:r>
+    </w:p>
+    <w:p>
+      <w:pPr>
+        <w:pStyle w:val="ListBullet"/>
+      </w:pPr>
+      <w:r>
+        <w:t>Documento interno: 02_MasterDictionary/AUTO/AUTO-0058.md</w:t>
+      </w:r>
+    </w:p>
+    <w:p>
+      <w:pPr>
+        <w:pStyle w:val="Heading2"/>
+      </w:pPr>
+      <w:r>
+        <w:rPr>
+          <w:color w:val="4F81BD"/>
+          <w:sz w:val="28"/>
+        </w:rPr>
+        <w:t>Tags</w:t>
+      </w:r>
+    </w:p>
+    <w:p>
+      <w:pPr>
+        <w:pStyle w:val="ListBullet"/>
+      </w:pPr>
+      <w:r>
+        <w:t>faq</w:t>
+      </w:r>
+    </w:p>
+    <w:p>
+      <w:pPr>
+        <w:pStyle w:val="ListBullet"/>
+      </w:pPr>
+      <w:r>
+        <w:t>auto</w:t>
+      </w:r>
+    </w:p>
+    <w:p>
+      <w:pPr>
+        <w:pStyle w:val="ListBullet"/>
+      </w:pPr>
+      <w:r>
+        <w:t>sinistro</w:t>
+      </w:r>
+    </w:p>
+    <w:p>
+      <w:pPr>
+        <w:pStyle w:val="ListBullet"/>
+      </w:pPr>
+      <w:r>
+        <w:t>atendimento</w:t>
+      </w:r>
+    </w:p>
+    <w:p>
+      <w:pPr>
+        <w:pStyle w:val="Heading2"/>
+      </w:pPr>
+      <w:r>
+        <w:rPr>
+          <w:color w:val="4F81BD"/>
+          <w:sz w:val="28"/>
+        </w:rPr>
+        <w:t>Veja também</w:t>
+      </w:r>
+    </w:p>
+    <w:p>
+      <w:pPr>
+        <w:pStyle w:val="ListBullet"/>
+      </w:pPr>
+      <w:r>
+        <w:t>02_MasterDictionary/AUTO/AUTO-0058.md</w:t>
+      </w:r>
+    </w:p>
+    <w:p>
+      <w:pPr>
+        <w:pStyle w:val="Heading2"/>
+      </w:pPr>
+      <w:r>
+        <w:rPr>
+          <w:color w:val="4F81BD"/>
+          <w:sz w:val="28"/>
+        </w:rPr>
+        <w:t>Histórico de revisão</w:t>
       </w:r>
     </w:p>
     <w:p>
@@ -7133,310 +7202,7 @@
           <w:rFonts w:ascii="Courier New" w:hAnsi="Courier New"/>
           <w:sz w:val="16"/>
         </w:rPr>
-        <w:t>| 2026-06-25 | 0.1 | JP-BR Insurance Knowledge Base | Criação inicial. |</w:t>
-      </w:r>
-    </w:p>
-    <w:p/>
-    <w:p>
-      <w:pPr>
-        <w:pStyle w:val="Heading1"/>
-      </w:pPr>
-      <w:r>
-        <w:rPr>
-          <w:color w:val="4F81BD"/>
-          <w:sz w:val="32"/>
-        </w:rPr>
-        <w:t>FAQ-AUTO-0057 - Para que serve o certificado de interrupção?</w:t>
-      </w:r>
-    </w:p>
-    <w:p>
-      <w:pPr>
-        <w:pStyle w:val="Heading2"/>
-      </w:pPr>
-      <w:r>
-        <w:rPr>
-          <w:color w:val="4F81BD"/>
-          <w:sz w:val="28"/>
-        </w:rPr>
-        <w:t>Controle</w:t>
-      </w:r>
-    </w:p>
-    <w:p>
-      <w:pPr>
-        <w:pStyle w:val="ListBullet"/>
-      </w:pPr>
-      <w:r>
-        <w:t>Versão: 0.1</w:t>
-      </w:r>
-    </w:p>
-    <w:p>
-      <w:pPr>
-        <w:pStyle w:val="ListBullet"/>
-      </w:pPr>
-      <w:r>
-        <w:t>Data: 2026-06-25</w:t>
-      </w:r>
-    </w:p>
-    <w:p>
-      <w:pPr>
-        <w:pStyle w:val="ListBullet"/>
-      </w:pPr>
-      <w:r>
-        <w:t>Autor: JP-BR Insurance Knowledge Base</w:t>
-      </w:r>
-    </w:p>
-    <w:p>
-      <w:pPr>
-        <w:pStyle w:val="ListBullet"/>
-      </w:pPr>
-      <w:r>
-        <w:t>Histórico: Criação inicial.</w:t>
-      </w:r>
-    </w:p>
-    <w:p>
-      <w:pPr>
-        <w:pStyle w:val="Heading2"/>
-      </w:pPr>
-      <w:r>
-        <w:rPr>
-          <w:color w:val="4F81BD"/>
-          <w:sz w:val="28"/>
-        </w:rPr>
-        <w:t>Código</w:t>
-      </w:r>
-    </w:p>
-    <w:p>
-      <w:r>
-        <w:t>FAQ-AUTO-0057</w:t>
-      </w:r>
-    </w:p>
-    <w:p>
-      <w:pPr>
-        <w:pStyle w:val="Heading2"/>
-      </w:pPr>
-      <w:r>
-        <w:rPr>
-          <w:color w:val="4F81BD"/>
-          <w:sz w:val="28"/>
-        </w:rPr>
-        <w:t>Categoria</w:t>
-      </w:r>
-    </w:p>
-    <w:p>
-      <w:r>
-        <w:t>AUTO</w:t>
-      </w:r>
-    </w:p>
-    <w:p>
-      <w:pPr>
-        <w:pStyle w:val="Heading2"/>
-      </w:pPr>
-      <w:r>
-        <w:rPr>
-          <w:color w:val="4F81BD"/>
-          <w:sz w:val="28"/>
-        </w:rPr>
-        <w:t>Pergunta</w:t>
-      </w:r>
-    </w:p>
-    <w:p>
-      <w:r>
-        <w:t>Para que serve o certificado de interrupção?</w:t>
-      </w:r>
-    </w:p>
-    <w:p>
-      <w:pPr>
-        <w:pStyle w:val="Heading2"/>
-      </w:pPr>
-      <w:r>
-        <w:rPr>
-          <w:color w:val="4F81BD"/>
-          <w:sz w:val="28"/>
-        </w:rPr>
-        <w:t>Situação de atendimento</w:t>
-      </w:r>
-    </w:p>
-    <w:p>
-      <w:r>
-        <w:t>Cliente precisa entender certificado de interrupção no contexto de atendimento de seguro de automóvel.</w:t>
-      </w:r>
-    </w:p>
-    <w:p>
-      <w:pPr>
-        <w:pStyle w:val="Heading2"/>
-      </w:pPr>
-      <w:r>
-        <w:rPr>
-          <w:color w:val="4F81BD"/>
-          <w:sz w:val="28"/>
-        </w:rPr>
-        <w:t>Resposta técnica</w:t>
-      </w:r>
-    </w:p>
-    <w:p>
-      <w:r>
-        <w:t>Documento que pode preservar determinada condição ou histórico do seguro quando o cliente interrompe o contrato, conforme regras da seguradora.</w:t>
-      </w:r>
-    </w:p>
-    <w:p>
-      <w:pPr>
-        <w:pStyle w:val="Heading2"/>
-      </w:pPr>
-      <w:r>
-        <w:rPr>
-          <w:color w:val="4F81BD"/>
-          <w:sz w:val="28"/>
-        </w:rPr>
-        <w:t>Como responder ao cliente brasileiro</w:t>
-      </w:r>
-    </w:p>
-    <w:p>
-      <w:r>
-        <w:t>Se você vai parar de usar o seguro por um tempo, precisamos verificar se é possível emitir esse certificado para não perder condições importantes.</w:t>
-      </w:r>
-    </w:p>
-    <w:p>
-      <w:pPr>
-        <w:pStyle w:val="Heading2"/>
-      </w:pPr>
-      <w:r>
-        <w:rPr>
-          <w:color w:val="4F81BD"/>
-          <w:sz w:val="28"/>
-        </w:rPr>
-        <w:t>Termos relacionados</w:t>
-      </w:r>
-    </w:p>
-    <w:p>
-      <w:pPr>
-        <w:pStyle w:val="ListBullet"/>
-      </w:pPr>
-      <w:r>
-        <w:t>AUTO-0060 - 中断証明書 - Certificado de interrupção</w:t>
-      </w:r>
-    </w:p>
-    <w:p>
-      <w:pPr>
-        <w:pStyle w:val="Heading2"/>
-      </w:pPr>
-      <w:r>
-        <w:rPr>
-          <w:color w:val="4F81BD"/>
-          <w:sz w:val="28"/>
-        </w:rPr>
-        <w:t>Referências cruzadas</w:t>
-      </w:r>
-    </w:p>
-    <w:p>
-      <w:pPr>
-        <w:pStyle w:val="ListBullet"/>
-      </w:pPr>
-      <w:r>
-        <w:t>DIALOGUE-AUTO-0019</w:t>
-      </w:r>
-    </w:p>
-    <w:p>
-      <w:pPr>
-        <w:pStyle w:val="ListBullet"/>
-      </w:pPr>
-      <w:r>
-        <w:t>CASE-AUTO-0027</w:t>
-      </w:r>
-    </w:p>
-    <w:p>
-      <w:pPr>
-        <w:pStyle w:val="Heading2"/>
-      </w:pPr>
-      <w:r>
-        <w:rPr>
-          <w:color w:val="4F81BD"/>
-          <w:sz w:val="28"/>
-        </w:rPr>
-        <w:t>Referências</w:t>
-      </w:r>
-    </w:p>
-    <w:p>
-      <w:pPr>
-        <w:pStyle w:val="ListBullet"/>
-      </w:pPr>
-      <w:r>
-        <w:t>Documento interno: 02_MasterDictionary/AUTO/AUTO-0060.md</w:t>
-      </w:r>
-    </w:p>
-    <w:p>
-      <w:pPr>
-        <w:pStyle w:val="Heading2"/>
-      </w:pPr>
-      <w:r>
-        <w:rPr>
-          <w:color w:val="4F81BD"/>
-          <w:sz w:val="28"/>
-        </w:rPr>
-        <w:t>Tags</w:t>
-      </w:r>
-    </w:p>
-    <w:p>
-      <w:pPr>
-        <w:pStyle w:val="ListBullet"/>
-      </w:pPr>
-      <w:r>
-        <w:t>faq</w:t>
-      </w:r>
-    </w:p>
-    <w:p>
-      <w:pPr>
-        <w:pStyle w:val="ListBullet"/>
-      </w:pPr>
-      <w:r>
-        <w:t>auto</w:t>
-      </w:r>
-    </w:p>
-    <w:p>
-      <w:pPr>
-        <w:pStyle w:val="ListBullet"/>
-      </w:pPr>
-      <w:r>
-        <w:t>sinistro</w:t>
-      </w:r>
-    </w:p>
-    <w:p>
-      <w:pPr>
-        <w:pStyle w:val="ListBullet"/>
-      </w:pPr>
-      <w:r>
-        <w:t>atendimento</w:t>
-      </w:r>
-    </w:p>
-    <w:p>
-      <w:pPr>
-        <w:pStyle w:val="Heading2"/>
-      </w:pPr>
-      <w:r>
-        <w:rPr>
-          <w:color w:val="4F81BD"/>
-          <w:sz w:val="28"/>
-        </w:rPr>
-        <w:t>Veja também</w:t>
-      </w:r>
-    </w:p>
-    <w:p>
-      <w:pPr>
-        <w:pStyle w:val="ListBullet"/>
-      </w:pPr>
-      <w:r>
-        <w:t>02_MasterDictionary/AUTO/AUTO-0060.md</w:t>
-      </w:r>
-    </w:p>
-    <w:p>
-      <w:pPr>
-        <w:pStyle w:val="Heading2"/>
-      </w:pPr>
-      <w:r>
-        <w:rPr>
-          <w:color w:val="4F81BD"/>
-          <w:sz w:val="28"/>
-        </w:rPr>
-        <w:t>Histórico de revisão</w:t>
+        <w:t>| Data | Versão | Autor | Alteração |</w:t>
       </w:r>
     </w:p>
     <w:p>
@@ -7445,7 +7211,7 @@
           <w:rFonts w:ascii="Courier New" w:hAnsi="Courier New"/>
           <w:sz w:val="16"/>
         </w:rPr>
-        <w:t>| Data | Versão | Autor | Alteração |</w:t>
+        <w:t>| --- | --- | --- | --- |</w:t>
       </w:r>
     </w:p>
     <w:p>
@@ -7454,7 +7220,809 @@
           <w:rFonts w:ascii="Courier New" w:hAnsi="Courier New"/>
           <w:sz w:val="16"/>
         </w:rPr>
+        <w:t>| 2026-06-26 | 0.2 | JP-BR Insurance Knowledge Base | Inclusão de consulta japonesa, próximo passo seguro e limite comercial/compliance. |</w:t>
+      </w:r>
+    </w:p>
+    <w:p>
+      <w:r>
+        <w:rPr>
+          <w:rFonts w:ascii="Courier New" w:hAnsi="Courier New"/>
+          <w:sz w:val="16"/>
+        </w:rPr>
+        <w:t>| 2026-06-25 | 0.1 | JP-BR Insurance Knowledge Base | Criação inicial. |</w:t>
+      </w:r>
+    </w:p>
+    <w:p/>
+    <w:p>
+      <w:pPr>
+        <w:pStyle w:val="Heading1"/>
+      </w:pPr>
+      <w:r>
+        <w:rPr>
+          <w:color w:val="4F81BD"/>
+          <w:sz w:val="32"/>
+        </w:rPr>
+        <w:t>FAQ-AUTO-0056 - Como confirmo que a renovação foi feita?</w:t>
+      </w:r>
+    </w:p>
+    <w:p>
+      <w:pPr>
+        <w:pStyle w:val="Heading2"/>
+      </w:pPr>
+      <w:r>
+        <w:rPr>
+          <w:color w:val="4F81BD"/>
+          <w:sz w:val="28"/>
+        </w:rPr>
+        <w:t>Controle</w:t>
+      </w:r>
+    </w:p>
+    <w:p>
+      <w:pPr>
+        <w:pStyle w:val="ListBullet"/>
+      </w:pPr>
+      <w:r>
+        <w:t>Versão: 0.2</w:t>
+      </w:r>
+    </w:p>
+    <w:p>
+      <w:pPr>
+        <w:pStyle w:val="ListBullet"/>
+      </w:pPr>
+      <w:r>
+        <w:t>Data: 2026-06-25</w:t>
+      </w:r>
+    </w:p>
+    <w:p>
+      <w:pPr>
+        <w:pStyle w:val="ListBullet"/>
+      </w:pPr>
+      <w:r>
+        <w:t>Autor: JP-BR Insurance Knowledge Base</w:t>
+      </w:r>
+    </w:p>
+    <w:p>
+      <w:pPr>
+        <w:pStyle w:val="ListBullet"/>
+      </w:pPr>
+      <w:r>
+        <w:t>Histórico: Criação inicial; reforço NotebookLM e compliance.</w:t>
+      </w:r>
+    </w:p>
+    <w:p>
+      <w:pPr>
+        <w:pStyle w:val="Heading2"/>
+      </w:pPr>
+      <w:r>
+        <w:rPr>
+          <w:color w:val="4F81BD"/>
+          <w:sz w:val="28"/>
+        </w:rPr>
+        <w:t>Código</w:t>
+      </w:r>
+    </w:p>
+    <w:p>
+      <w:r>
+        <w:t>FAQ-AUTO-0056</w:t>
+      </w:r>
+    </w:p>
+    <w:p>
+      <w:pPr>
+        <w:pStyle w:val="Heading2"/>
+      </w:pPr>
+      <w:r>
+        <w:rPr>
+          <w:color w:val="4F81BD"/>
+          <w:sz w:val="28"/>
+        </w:rPr>
+        <w:t>Categoria</w:t>
+      </w:r>
+    </w:p>
+    <w:p>
+      <w:r>
+        <w:t>AUTO</w:t>
+      </w:r>
+    </w:p>
+    <w:p>
+      <w:pPr>
+        <w:pStyle w:val="Heading2"/>
+      </w:pPr>
+      <w:r>
+        <w:rPr>
+          <w:color w:val="4F81BD"/>
+          <w:sz w:val="28"/>
+        </w:rPr>
+        <w:t>Pergunta</w:t>
+      </w:r>
+    </w:p>
+    <w:p>
+      <w:r>
+        <w:t>Como confirmo que a renovação foi feita?</w:t>
+      </w:r>
+    </w:p>
+    <w:p>
+      <w:pPr>
+        <w:pStyle w:val="Heading2"/>
+      </w:pPr>
+      <w:r>
+        <w:rPr>
+          <w:color w:val="4F81BD"/>
+          <w:sz w:val="28"/>
+        </w:rPr>
+        <w:t>Consulta natural em japonês</w:t>
+      </w:r>
+    </w:p>
+    <w:p>
+      <w:pPr>
+        <w:pStyle w:val="ListBullet"/>
+      </w:pPr>
+      <w:r>
+        <w:t>継続証で自動車保険の更新をどう確認しますか。</w:t>
+      </w:r>
+    </w:p>
+    <w:p>
+      <w:pPr>
+        <w:pStyle w:val="ListBullet"/>
+      </w:pPr>
+      <w:r>
+        <w:t>更新が完了したかブラジル人のお客様にどう案内しますか。</w:t>
+      </w:r>
+    </w:p>
+    <w:p>
+      <w:pPr>
+        <w:pStyle w:val="Heading2"/>
+      </w:pPr>
+      <w:r>
+        <w:rPr>
+          <w:color w:val="4F81BD"/>
+          <w:sz w:val="28"/>
+        </w:rPr>
+        <w:t>Situação de atendimento</w:t>
+      </w:r>
+    </w:p>
+    <w:p>
+      <w:r>
+        <w:t>Cliente precisa entender comprovante de renovação no contexto de atendimento de seguro de automóvel.</w:t>
+      </w:r>
+    </w:p>
+    <w:p>
+      <w:pPr>
+        <w:pStyle w:val="Heading2"/>
+      </w:pPr>
+      <w:r>
+        <w:rPr>
+          <w:color w:val="4F81BD"/>
+          <w:sz w:val="28"/>
+        </w:rPr>
+        <w:t>Resposta técnica</w:t>
+      </w:r>
+    </w:p>
+    <w:p>
+      <w:r>
+        <w:t>Documento ou confirmação que indica a continuidade ou renovação do contrato conforme condições aceitas.</w:t>
+      </w:r>
+    </w:p>
+    <w:p>
+      <w:pPr>
+        <w:pStyle w:val="Heading2"/>
+      </w:pPr>
+      <w:r>
+        <w:rPr>
+          <w:color w:val="4F81BD"/>
+          <w:sz w:val="28"/>
+        </w:rPr>
+        <w:t>Como responder ao cliente brasileiro</w:t>
+      </w:r>
+    </w:p>
+    <w:p>
+      <w:r>
+        <w:t>Após renovar, confirme o documento ou registro que mostra que o seguro continua válido.</w:t>
+      </w:r>
+    </w:p>
+    <w:p>
+      <w:pPr>
+        <w:pStyle w:val="Heading2"/>
+      </w:pPr>
+      <w:r>
+        <w:rPr>
+          <w:color w:val="4F81BD"/>
+          <w:sz w:val="28"/>
+        </w:rPr>
+        <w:t>Próximo passo seguro</w:t>
+      </w:r>
+    </w:p>
+    <w:p>
+      <w:r>
+        <w:t>Confirmar documento ou registro de renovação, período de vigência, prêmio, forma de pagamento e eventuais alterações antes de afirmar continuidade do seguro.</w:t>
+      </w:r>
+    </w:p>
+    <w:p>
+      <w:pPr>
+        <w:pStyle w:val="Heading2"/>
+      </w:pPr>
+      <w:r>
+        <w:rPr>
+          <w:color w:val="4F81BD"/>
+          <w:sz w:val="28"/>
+        </w:rPr>
+        <w:t>Limite comercial/compliance</w:t>
+      </w:r>
+    </w:p>
+    <w:p>
+      <w:r>
+        <w:t>O corretor não deve afirmar que a renovação está válida sem confirmação documental ou registro da seguradora. Falha de pagamento ou pendência pode afetar a continuidade.</w:t>
+      </w:r>
+    </w:p>
+    <w:p>
+      <w:pPr>
+        <w:pStyle w:val="Heading2"/>
+      </w:pPr>
+      <w:r>
+        <w:rPr>
+          <w:color w:val="4F81BD"/>
+          <w:sz w:val="28"/>
+        </w:rPr>
+        <w:t>Termos relacionados</w:t>
+      </w:r>
+    </w:p>
+    <w:p>
+      <w:pPr>
+        <w:pStyle w:val="ListBullet"/>
+      </w:pPr>
+      <w:r>
+        <w:t>AUTO-0059 - 継続証 - Comprovante de renovação</w:t>
+      </w:r>
+    </w:p>
+    <w:p>
+      <w:pPr>
+        <w:pStyle w:val="Heading2"/>
+      </w:pPr>
+      <w:r>
+        <w:rPr>
+          <w:color w:val="4F81BD"/>
+          <w:sz w:val="28"/>
+        </w:rPr>
+        <w:t>Referências cruzadas</w:t>
+      </w:r>
+    </w:p>
+    <w:p>
+      <w:pPr>
+        <w:pStyle w:val="ListBullet"/>
+      </w:pPr>
+      <w:r>
+        <w:t>DIALOGUE-AUTO-0019</w:t>
+      </w:r>
+    </w:p>
+    <w:p>
+      <w:pPr>
+        <w:pStyle w:val="ListBullet"/>
+      </w:pPr>
+      <w:r>
+        <w:t>CASE-AUTO-0027</w:t>
+      </w:r>
+    </w:p>
+    <w:p>
+      <w:pPr>
+        <w:pStyle w:val="Heading2"/>
+      </w:pPr>
+      <w:r>
+        <w:rPr>
+          <w:color w:val="4F81BD"/>
+          <w:sz w:val="28"/>
+        </w:rPr>
+        <w:t>Referências</w:t>
+      </w:r>
+    </w:p>
+    <w:p>
+      <w:pPr>
+        <w:pStyle w:val="ListBullet"/>
+      </w:pPr>
+      <w:r>
+        <w:t>Documento interno: 02_MasterDictionary/AUTO/AUTO-0059.md</w:t>
+      </w:r>
+    </w:p>
+    <w:p>
+      <w:pPr>
+        <w:pStyle w:val="Heading2"/>
+      </w:pPr>
+      <w:r>
+        <w:rPr>
+          <w:color w:val="4F81BD"/>
+          <w:sz w:val="28"/>
+        </w:rPr>
+        <w:t>Tags</w:t>
+      </w:r>
+    </w:p>
+    <w:p>
+      <w:pPr>
+        <w:pStyle w:val="ListBullet"/>
+      </w:pPr>
+      <w:r>
+        <w:t>faq</w:t>
+      </w:r>
+    </w:p>
+    <w:p>
+      <w:pPr>
+        <w:pStyle w:val="ListBullet"/>
+      </w:pPr>
+      <w:r>
+        <w:t>auto</w:t>
+      </w:r>
+    </w:p>
+    <w:p>
+      <w:pPr>
+        <w:pStyle w:val="ListBullet"/>
+      </w:pPr>
+      <w:r>
+        <w:t>sinistro</w:t>
+      </w:r>
+    </w:p>
+    <w:p>
+      <w:pPr>
+        <w:pStyle w:val="ListBullet"/>
+      </w:pPr>
+      <w:r>
+        <w:t>atendimento</w:t>
+      </w:r>
+    </w:p>
+    <w:p>
+      <w:pPr>
+        <w:pStyle w:val="Heading2"/>
+      </w:pPr>
+      <w:r>
+        <w:rPr>
+          <w:color w:val="4F81BD"/>
+          <w:sz w:val="28"/>
+        </w:rPr>
+        <w:t>Veja também</w:t>
+      </w:r>
+    </w:p>
+    <w:p>
+      <w:pPr>
+        <w:pStyle w:val="ListBullet"/>
+      </w:pPr>
+      <w:r>
+        <w:t>02_MasterDictionary/AUTO/AUTO-0059.md</w:t>
+      </w:r>
+    </w:p>
+    <w:p>
+      <w:pPr>
+        <w:pStyle w:val="Heading2"/>
+      </w:pPr>
+      <w:r>
+        <w:rPr>
+          <w:color w:val="4F81BD"/>
+          <w:sz w:val="28"/>
+        </w:rPr>
+        <w:t>Histórico de revisão</w:t>
+      </w:r>
+    </w:p>
+    <w:p>
+      <w:r>
+        <w:rPr>
+          <w:rFonts w:ascii="Courier New" w:hAnsi="Courier New"/>
+          <w:sz w:val="16"/>
+        </w:rPr>
+        <w:t>| Data | Versão | Autor | Alteração |</w:t>
+      </w:r>
+    </w:p>
+    <w:p>
+      <w:r>
+        <w:rPr>
+          <w:rFonts w:ascii="Courier New" w:hAnsi="Courier New"/>
+          <w:sz w:val="16"/>
+        </w:rPr>
         <w:t>| --- | --- | --- | --- |</w:t>
+      </w:r>
+    </w:p>
+    <w:p>
+      <w:r>
+        <w:rPr>
+          <w:rFonts w:ascii="Courier New" w:hAnsi="Courier New"/>
+          <w:sz w:val="16"/>
+        </w:rPr>
+        <w:t>| 2026-06-26 | 0.2 | JP-BR Insurance Knowledge Base | Inclusão de consulta japonesa, próximo passo seguro e limite comercial/compliance. |</w:t>
+      </w:r>
+    </w:p>
+    <w:p>
+      <w:r>
+        <w:rPr>
+          <w:rFonts w:ascii="Courier New" w:hAnsi="Courier New"/>
+          <w:sz w:val="16"/>
+        </w:rPr>
+        <w:t>| 2026-06-25 | 0.1 | JP-BR Insurance Knowledge Base | Criação inicial. |</w:t>
+      </w:r>
+    </w:p>
+    <w:p/>
+    <w:p>
+      <w:pPr>
+        <w:pStyle w:val="Heading1"/>
+      </w:pPr>
+      <w:r>
+        <w:rPr>
+          <w:color w:val="4F81BD"/>
+          <w:sz w:val="32"/>
+        </w:rPr>
+        <w:t>FAQ-AUTO-0057 - Para que serve o certificado de interrupção?</w:t>
+      </w:r>
+    </w:p>
+    <w:p>
+      <w:pPr>
+        <w:pStyle w:val="Heading2"/>
+      </w:pPr>
+      <w:r>
+        <w:rPr>
+          <w:color w:val="4F81BD"/>
+          <w:sz w:val="28"/>
+        </w:rPr>
+        <w:t>Controle</w:t>
+      </w:r>
+    </w:p>
+    <w:p>
+      <w:pPr>
+        <w:pStyle w:val="ListBullet"/>
+      </w:pPr>
+      <w:r>
+        <w:t>Versão: 0.2</w:t>
+      </w:r>
+    </w:p>
+    <w:p>
+      <w:pPr>
+        <w:pStyle w:val="ListBullet"/>
+      </w:pPr>
+      <w:r>
+        <w:t>Data: 2026-06-25</w:t>
+      </w:r>
+    </w:p>
+    <w:p>
+      <w:pPr>
+        <w:pStyle w:val="ListBullet"/>
+      </w:pPr>
+      <w:r>
+        <w:t>Autor: JP-BR Insurance Knowledge Base</w:t>
+      </w:r>
+    </w:p>
+    <w:p>
+      <w:pPr>
+        <w:pStyle w:val="ListBullet"/>
+      </w:pPr>
+      <w:r>
+        <w:t>Histórico: Criação inicial; reforço NotebookLM e compliance.</w:t>
+      </w:r>
+    </w:p>
+    <w:p>
+      <w:pPr>
+        <w:pStyle w:val="Heading2"/>
+      </w:pPr>
+      <w:r>
+        <w:rPr>
+          <w:color w:val="4F81BD"/>
+          <w:sz w:val="28"/>
+        </w:rPr>
+        <w:t>Código</w:t>
+      </w:r>
+    </w:p>
+    <w:p>
+      <w:r>
+        <w:t>FAQ-AUTO-0057</w:t>
+      </w:r>
+    </w:p>
+    <w:p>
+      <w:pPr>
+        <w:pStyle w:val="Heading2"/>
+      </w:pPr>
+      <w:r>
+        <w:rPr>
+          <w:color w:val="4F81BD"/>
+          <w:sz w:val="28"/>
+        </w:rPr>
+        <w:t>Categoria</w:t>
+      </w:r>
+    </w:p>
+    <w:p>
+      <w:r>
+        <w:t>AUTO</w:t>
+      </w:r>
+    </w:p>
+    <w:p>
+      <w:pPr>
+        <w:pStyle w:val="Heading2"/>
+      </w:pPr>
+      <w:r>
+        <w:rPr>
+          <w:color w:val="4F81BD"/>
+          <w:sz w:val="28"/>
+        </w:rPr>
+        <w:t>Pergunta</w:t>
+      </w:r>
+    </w:p>
+    <w:p>
+      <w:r>
+        <w:t>Para que serve o certificado de interrupção?</w:t>
+      </w:r>
+    </w:p>
+    <w:p>
+      <w:pPr>
+        <w:pStyle w:val="Heading2"/>
+      </w:pPr>
+      <w:r>
+        <w:rPr>
+          <w:color w:val="4F81BD"/>
+          <w:sz w:val="28"/>
+        </w:rPr>
+        <w:t>Consulta natural em japonês</w:t>
+      </w:r>
+    </w:p>
+    <w:p>
+      <w:pPr>
+        <w:pStyle w:val="ListBullet"/>
+      </w:pPr>
+      <w:r>
+        <w:t>中断証明書は何のために必要ですか。</w:t>
+      </w:r>
+    </w:p>
+    <w:p>
+      <w:pPr>
+        <w:pStyle w:val="ListBullet"/>
+      </w:pPr>
+      <w:r>
+        <w:t>自動車保険を一時中断するお客様にどう説明しますか。</w:t>
+      </w:r>
+    </w:p>
+    <w:p>
+      <w:pPr>
+        <w:pStyle w:val="Heading2"/>
+      </w:pPr>
+      <w:r>
+        <w:rPr>
+          <w:color w:val="4F81BD"/>
+          <w:sz w:val="28"/>
+        </w:rPr>
+        <w:t>Situação de atendimento</w:t>
+      </w:r>
+    </w:p>
+    <w:p>
+      <w:r>
+        <w:t>Cliente precisa entender certificado de interrupção no contexto de atendimento de seguro de automóvel.</w:t>
+      </w:r>
+    </w:p>
+    <w:p>
+      <w:pPr>
+        <w:pStyle w:val="Heading2"/>
+      </w:pPr>
+      <w:r>
+        <w:rPr>
+          <w:color w:val="4F81BD"/>
+          <w:sz w:val="28"/>
+        </w:rPr>
+        <w:t>Resposta técnica</w:t>
+      </w:r>
+    </w:p>
+    <w:p>
+      <w:r>
+        <w:t>Documento que pode preservar determinada condição ou histórico do seguro quando o cliente interrompe o contrato, conforme regras da seguradora.</w:t>
+      </w:r>
+    </w:p>
+    <w:p>
+      <w:pPr>
+        <w:pStyle w:val="Heading2"/>
+      </w:pPr>
+      <w:r>
+        <w:rPr>
+          <w:color w:val="4F81BD"/>
+          <w:sz w:val="28"/>
+        </w:rPr>
+        <w:t>Como responder ao cliente brasileiro</w:t>
+      </w:r>
+    </w:p>
+    <w:p>
+      <w:r>
+        <w:t>Se você vai parar de usar o seguro por um tempo, precisamos verificar se é possível emitir esse certificado para não perder condições importantes.</w:t>
+      </w:r>
+    </w:p>
+    <w:p>
+      <w:pPr>
+        <w:pStyle w:val="Heading2"/>
+      </w:pPr>
+      <w:r>
+        <w:rPr>
+          <w:color w:val="4F81BD"/>
+          <w:sz w:val="28"/>
+        </w:rPr>
+        <w:t>Próximo passo seguro</w:t>
+      </w:r>
+    </w:p>
+    <w:p>
+      <w:r>
+        <w:t>Verificar se o cliente atende aos requisitos, prazo de solicitação, documentos exigidos e condições preservadas antes de orientar a interrupção.</w:t>
+      </w:r>
+    </w:p>
+    <w:p>
+      <w:pPr>
+        <w:pStyle w:val="Heading2"/>
+      </w:pPr>
+      <w:r>
+        <w:rPr>
+          <w:color w:val="4F81BD"/>
+          <w:sz w:val="28"/>
+        </w:rPr>
+        <w:t>Limite comercial/compliance</w:t>
+      </w:r>
+    </w:p>
+    <w:p>
+      <w:r>
+        <w:t>O corretor não deve prometer emissão ou preservação de classe sem confirmação. O certificado depende das regras da seguradora e da situação do contrato.</w:t>
+      </w:r>
+    </w:p>
+    <w:p>
+      <w:pPr>
+        <w:pStyle w:val="Heading2"/>
+      </w:pPr>
+      <w:r>
+        <w:rPr>
+          <w:color w:val="4F81BD"/>
+          <w:sz w:val="28"/>
+        </w:rPr>
+        <w:t>Termos relacionados</w:t>
+      </w:r>
+    </w:p>
+    <w:p>
+      <w:pPr>
+        <w:pStyle w:val="ListBullet"/>
+      </w:pPr>
+      <w:r>
+        <w:t>AUTO-0060 - 中断証明書 - Certificado de interrupção</w:t>
+      </w:r>
+    </w:p>
+    <w:p>
+      <w:pPr>
+        <w:pStyle w:val="Heading2"/>
+      </w:pPr>
+      <w:r>
+        <w:rPr>
+          <w:color w:val="4F81BD"/>
+          <w:sz w:val="28"/>
+        </w:rPr>
+        <w:t>Referências cruzadas</w:t>
+      </w:r>
+    </w:p>
+    <w:p>
+      <w:pPr>
+        <w:pStyle w:val="ListBullet"/>
+      </w:pPr>
+      <w:r>
+        <w:t>DIALOGUE-AUTO-0019</w:t>
+      </w:r>
+    </w:p>
+    <w:p>
+      <w:pPr>
+        <w:pStyle w:val="ListBullet"/>
+      </w:pPr>
+      <w:r>
+        <w:t>CASE-AUTO-0027</w:t>
+      </w:r>
+    </w:p>
+    <w:p>
+      <w:pPr>
+        <w:pStyle w:val="Heading2"/>
+      </w:pPr>
+      <w:r>
+        <w:rPr>
+          <w:color w:val="4F81BD"/>
+          <w:sz w:val="28"/>
+        </w:rPr>
+        <w:t>Referências</w:t>
+      </w:r>
+    </w:p>
+    <w:p>
+      <w:pPr>
+        <w:pStyle w:val="ListBullet"/>
+      </w:pPr>
+      <w:r>
+        <w:t>Documento interno: 02_MasterDictionary/AUTO/AUTO-0060.md</w:t>
+      </w:r>
+    </w:p>
+    <w:p>
+      <w:pPr>
+        <w:pStyle w:val="Heading2"/>
+      </w:pPr>
+      <w:r>
+        <w:rPr>
+          <w:color w:val="4F81BD"/>
+          <w:sz w:val="28"/>
+        </w:rPr>
+        <w:t>Tags</w:t>
+      </w:r>
+    </w:p>
+    <w:p>
+      <w:pPr>
+        <w:pStyle w:val="ListBullet"/>
+      </w:pPr>
+      <w:r>
+        <w:t>faq</w:t>
+      </w:r>
+    </w:p>
+    <w:p>
+      <w:pPr>
+        <w:pStyle w:val="ListBullet"/>
+      </w:pPr>
+      <w:r>
+        <w:t>auto</w:t>
+      </w:r>
+    </w:p>
+    <w:p>
+      <w:pPr>
+        <w:pStyle w:val="ListBullet"/>
+      </w:pPr>
+      <w:r>
+        <w:t>sinistro</w:t>
+      </w:r>
+    </w:p>
+    <w:p>
+      <w:pPr>
+        <w:pStyle w:val="ListBullet"/>
+      </w:pPr>
+      <w:r>
+        <w:t>atendimento</w:t>
+      </w:r>
+    </w:p>
+    <w:p>
+      <w:pPr>
+        <w:pStyle w:val="Heading2"/>
+      </w:pPr>
+      <w:r>
+        <w:rPr>
+          <w:color w:val="4F81BD"/>
+          <w:sz w:val="28"/>
+        </w:rPr>
+        <w:t>Veja também</w:t>
+      </w:r>
+    </w:p>
+    <w:p>
+      <w:pPr>
+        <w:pStyle w:val="ListBullet"/>
+      </w:pPr>
+      <w:r>
+        <w:t>02_MasterDictionary/AUTO/AUTO-0060.md</w:t>
+      </w:r>
+    </w:p>
+    <w:p>
+      <w:pPr>
+        <w:pStyle w:val="Heading2"/>
+      </w:pPr>
+      <w:r>
+        <w:rPr>
+          <w:color w:val="4F81BD"/>
+          <w:sz w:val="28"/>
+        </w:rPr>
+        <w:t>Histórico de revisão</w:t>
+      </w:r>
+    </w:p>
+    <w:p>
+      <w:r>
+        <w:rPr>
+          <w:rFonts w:ascii="Courier New" w:hAnsi="Courier New"/>
+          <w:sz w:val="16"/>
+        </w:rPr>
+        <w:t>| Data | Versão | Autor | Alteração |</w:t>
+      </w:r>
+    </w:p>
+    <w:p>
+      <w:r>
+        <w:rPr>
+          <w:rFonts w:ascii="Courier New" w:hAnsi="Courier New"/>
+          <w:sz w:val="16"/>
+        </w:rPr>
+        <w:t>| --- | --- | --- | --- |</w:t>
+      </w:r>
+    </w:p>
+    <w:p>
+      <w:r>
+        <w:rPr>
+          <w:rFonts w:ascii="Courier New" w:hAnsi="Courier New"/>
+          <w:sz w:val="16"/>
+        </w:rPr>
+        <w:t>| 2026-06-26 | 0.2 | JP-BR Insurance Knowledge Base | Inclusão de consulta japonesa, próximo passo seguro e limite comercial/compliance. |</w:t>
       </w:r>
     </w:p>
     <w:p>

</xml_diff>